<commit_message>
Exponential of Delta Exponent Equation || (17:37 (W.I.B [Waktu Indonesia bagian Barat]), 29/03/2026), Batam, Kepulauan Riau Indonesia || Exponential of Delta Exponent Equation #LORDBLESSUS #LORDWITHUS #LORDGUARDUS #EXODUS14VERSES14 #JOHN24VERSES7 #LUCAS8VERSES21
Exponential of Delta Exponent Equation || (17:37 (W.I.B [Waktu Indonesia bagian Barat]), 29/03/2026), Batam, Kepulauan Riau Indonesia || Exponential of Delta Exponent Equation #LORDBLESSUS #LORDWITHUS #LORDGUARDUS #EXODUS14VERSES14 #JOHN24VERSES7 #LUCAS8VERSES21
</commit_message>
<xml_diff>
--- a/Exponential of Delta Exponent Equation.docx
+++ b/Exponential of Delta Exponent Equation.docx
@@ -637,73 +637,305 @@
             </w:rPr>
             <m:t xml:space="preserve"> = </m:t>
           </m:r>
-          <m:d>
-            <m:dPr>
+          <m:nary>
+            <m:naryPr>
+              <m:chr m:val="∑"/>
+              <m:limLoc m:val="undOvr"/>
+              <m:supHide m:val="1"/>
               <m:ctrlPr>
                 <w:rPr>
                   <w:rFonts w:ascii="Cambria Math" w:hAnsi="Cambria Math"/>
                   <w:i/>
                 </w:rPr>
               </m:ctrlPr>
-            </m:dPr>
-            <m:e>
-              <m:nary>
-                <m:naryPr>
-                  <m:chr m:val="∑"/>
-                  <m:limLoc m:val="undOvr"/>
-                  <m:supHide m:val="1"/>
+            </m:naryPr>
+            <m:sub>
+              <m:d>
+                <m:dPr>
                   <m:ctrlPr>
                     <w:rPr>
                       <w:rFonts w:ascii="Cambria Math" w:hAnsi="Cambria Math"/>
                       <w:i/>
                     </w:rPr>
                   </m:ctrlPr>
-                </m:naryPr>
-                <m:sub>
-                  <m:d>
-                    <m:dPr>
+                </m:dPr>
+                <m:e>
+                  <m:r>
+                    <w:rPr>
+                      <w:rFonts w:ascii="Cambria Math" w:hAnsi="Cambria Math"/>
+                    </w:rPr>
+                    <m:t>x + 1</m:t>
+                  </m:r>
+                </m:e>
+              </m:d>
+            </m:sub>
+            <m:sup/>
+            <m:e>
+              <m:d>
+                <m:dPr>
+                  <m:ctrlPr>
+                    <w:rPr>
+                      <w:rFonts w:ascii="Cambria Math" w:hAnsi="Cambria Math"/>
+                      <w:i/>
+                    </w:rPr>
+                  </m:ctrlPr>
+                </m:dPr>
+                <m:e>
+                  <m:r>
+                    <w:rPr>
+                      <w:rFonts w:ascii="Cambria Math" w:hAnsi="Cambria Math"/>
+                    </w:rPr>
+                    <m:t>2 × x</m:t>
+                  </m:r>
+                </m:e>
+              </m:d>
+            </m:e>
+          </m:nary>
+        </m:oMath>
+      </m:oMathPara>
+    </w:p>
+    <w:p>
+      <w:pPr>
+        <w:spacing w:line="360" w:lineRule="auto"/>
+        <w:jc w:val="center"/>
+        <w:rPr>
+          <w:rFonts w:ascii="Times New Roman" w:eastAsiaTheme="minorEastAsia" w:hAnsi="Times New Roman" w:cs="Times New Roman"/>
+          <w:sz w:val="24"/>
+          <w:szCs w:val="24"/>
+          <w:lang w:val="id-ID"/>
+        </w:rPr>
+      </w:pPr>
+    </w:p>
+    <w:p>
+      <w:pPr>
+        <w:spacing w:line="360" w:lineRule="auto"/>
+        <w:jc w:val="center"/>
+        <w:rPr>
+          <w:rFonts w:eastAsiaTheme="minorEastAsia"/>
+        </w:rPr>
+      </w:pPr>
+      <m:oMathPara>
+        <m:oMathParaPr>
+          <m:jc m:val="center"/>
+        </m:oMathParaPr>
+        <m:oMath>
+          <m:nary>
+            <m:naryPr>
+              <m:chr m:val="∑"/>
+              <m:limLoc m:val="undOvr"/>
+              <m:ctrlPr>
+                <w:rPr>
+                  <w:rFonts w:ascii="Cambria Math" w:eastAsiaTheme="minorEastAsia" w:hAnsi="Cambria Math" w:cs="Times New Roman"/>
+                  <w:i/>
+                </w:rPr>
+              </m:ctrlPr>
+            </m:naryPr>
+            <m:sub>
+              <m:d>
+                <m:dPr>
+                  <m:ctrlPr>
+                    <w:rPr>
+                      <w:rFonts w:ascii="Cambria Math" w:eastAsiaTheme="minorEastAsia" w:hAnsi="Cambria Math" w:cs="Times New Roman"/>
+                      <w:i/>
+                    </w:rPr>
+                  </m:ctrlPr>
+                </m:dPr>
+                <m:e>
+                  <m:r>
+                    <w:rPr>
+                      <w:rFonts w:ascii="Cambria Math" w:eastAsiaTheme="minorEastAsia" w:hAnsi="Cambria Math" w:cs="Times New Roman"/>
+                    </w:rPr>
+                    <m:t xml:space="preserve">x + </m:t>
+                  </m:r>
+                  <m:r>
+                    <w:rPr>
+                      <w:rFonts w:ascii="Cambria Math" w:eastAsiaTheme="minorEastAsia" w:hAnsi="Cambria Math" w:cs="Times New Roman"/>
+                    </w:rPr>
+                    <m:t>a</m:t>
+                  </m:r>
+                </m:e>
+              </m:d>
+            </m:sub>
+            <m:sup>
+              <m:d>
+                <m:dPr>
+                  <m:ctrlPr>
+                    <w:rPr>
+                      <w:rFonts w:ascii="Cambria Math" w:eastAsiaTheme="minorEastAsia" w:hAnsi="Cambria Math" w:cs="Times New Roman"/>
+                      <w:i/>
+                    </w:rPr>
+                  </m:ctrlPr>
+                </m:dPr>
+                <m:e>
+                  <m:r>
+                    <w:rPr>
+                      <w:rFonts w:ascii="Cambria Math" w:eastAsiaTheme="minorEastAsia" w:hAnsi="Cambria Math" w:cs="Times New Roman"/>
+                    </w:rPr>
+                    <m:t>n → ∞</m:t>
+                  </m:r>
+                </m:e>
+              </m:d>
+            </m:sup>
+            <m:e>
+              <m:d>
+                <m:dPr>
+                  <m:ctrlPr>
+                    <w:rPr>
+                      <w:rFonts w:ascii="Cambria Math" w:eastAsiaTheme="minorEastAsia" w:hAnsi="Cambria Math" w:cs="Times New Roman"/>
+                      <w:i/>
+                    </w:rPr>
+                  </m:ctrlPr>
+                </m:dPr>
+                <m:e>
+                  <m:sSup>
+                    <m:sSupPr>
                       <m:ctrlPr>
                         <w:rPr>
-                          <w:rFonts w:ascii="Cambria Math" w:hAnsi="Cambria Math"/>
+                          <w:rFonts w:ascii="Cambria Math" w:eastAsiaTheme="minorEastAsia" w:hAnsi="Cambria Math" w:cs="Times New Roman"/>
                           <w:i/>
                         </w:rPr>
                       </m:ctrlPr>
-                    </m:dPr>
+                    </m:sSupPr>
                     <m:e>
                       <m:r>
                         <w:rPr>
-                          <w:rFonts w:ascii="Cambria Math" w:hAnsi="Cambria Math"/>
+                          <w:rFonts w:ascii="Cambria Math" w:eastAsiaTheme="minorEastAsia" w:hAnsi="Cambria Math" w:cs="Times New Roman"/>
                         </w:rPr>
                         <m:t>x</m:t>
                       </m:r>
+                    </m:e>
+                    <m:sup>
                       <m:r>
                         <w:rPr>
-                          <w:rFonts w:ascii="Cambria Math" w:hAnsi="Cambria Math"/>
+                          <w:rFonts w:ascii="Cambria Math" w:eastAsiaTheme="minorEastAsia" w:hAnsi="Cambria Math" w:cs="Times New Roman"/>
                         </w:rPr>
-                        <m:t xml:space="preserve"> </m:t>
+                        <m:t>n</m:t>
                       </m:r>
+                    </m:sup>
+                  </m:sSup>
+                  <m:r>
+                    <w:rPr>
+                      <w:rFonts w:ascii="Cambria Math" w:eastAsiaTheme="minorEastAsia" w:hAnsi="Cambria Math" w:cs="Times New Roman"/>
+                    </w:rPr>
+                    <m:t xml:space="preserve">- </m:t>
+                  </m:r>
+                  <m:sSup>
+                    <m:sSupPr>
+                      <m:ctrlPr>
+                        <w:rPr>
+                          <w:rFonts w:ascii="Cambria Math" w:eastAsiaTheme="minorEastAsia" w:hAnsi="Cambria Math" w:cs="Times New Roman"/>
+                          <w:i/>
+                        </w:rPr>
+                      </m:ctrlPr>
+                    </m:sSupPr>
+                    <m:e>
+                      <m:d>
+                        <m:dPr>
+                          <m:ctrlPr>
+                            <w:rPr>
+                              <w:rFonts w:ascii="Cambria Math" w:eastAsiaTheme="minorEastAsia" w:hAnsi="Cambria Math" w:cs="Times New Roman"/>
+                              <w:i/>
+                            </w:rPr>
+                          </m:ctrlPr>
+                        </m:dPr>
+                        <m:e>
+                          <m:r>
+                            <w:rPr>
+                              <w:rFonts w:ascii="Cambria Math" w:eastAsiaTheme="minorEastAsia" w:hAnsi="Cambria Math" w:cs="Times New Roman"/>
+                            </w:rPr>
+                            <m:t>x</m:t>
+                          </m:r>
+                          <m:r>
+                            <w:rPr>
+                              <w:rFonts w:ascii="Cambria Math" w:eastAsiaTheme="minorEastAsia" w:hAnsi="Cambria Math" w:cs="Times New Roman"/>
+                            </w:rPr>
+                            <m:t xml:space="preserve"> </m:t>
+                          </m:r>
+                          <m:r>
+                            <w:rPr>
+                              <w:rFonts w:ascii="Cambria Math" w:eastAsiaTheme="minorEastAsia" w:hAnsi="Cambria Math" w:cs="Times New Roman"/>
+                            </w:rPr>
+                            <m:t>-</m:t>
+                          </m:r>
+                          <m:r>
+                            <w:rPr>
+                              <w:rFonts w:ascii="Cambria Math" w:eastAsiaTheme="minorEastAsia" w:hAnsi="Cambria Math" w:cs="Times New Roman"/>
+                            </w:rPr>
+                            <m:t xml:space="preserve"> a</m:t>
+                          </m:r>
+                        </m:e>
+                      </m:d>
+                    </m:e>
+                    <m:sup>
                       <m:r>
                         <w:rPr>
-                          <w:rFonts w:ascii="Cambria Math" w:hAnsi="Cambria Math"/>
+                          <w:rFonts w:ascii="Cambria Math" w:eastAsiaTheme="minorEastAsia" w:hAnsi="Cambria Math" w:cs="Times New Roman"/>
                         </w:rPr>
-                        <m:t>+</m:t>
+                        <m:t>n</m:t>
                       </m:r>
-                      <m:r>
-                        <w:rPr>
-                          <w:rFonts w:ascii="Cambria Math" w:hAnsi="Cambria Math"/>
-                        </w:rPr>
-                        <m:t xml:space="preserve"> </m:t>
-                      </m:r>
-                      <m:r>
-                        <w:rPr>
-                          <w:rFonts w:ascii="Cambria Math" w:hAnsi="Cambria Math"/>
-                        </w:rPr>
-                        <m:t>1</m:t>
-                      </m:r>
-                    </m:e>
-                  </m:d>
-                </m:sub>
-                <m:sup/>
+                    </m:sup>
+                  </m:sSup>
+                </m:e>
+              </m:d>
+            </m:e>
+          </m:nary>
+          <m:r>
+            <w:rPr>
+              <w:rFonts w:ascii="Cambria Math" w:hAnsi="Cambria Math"/>
+            </w:rPr>
+            <m:t xml:space="preserve"> = </m:t>
+          </m:r>
+          <m:nary>
+            <m:naryPr>
+              <m:chr m:val="∑"/>
+              <m:limLoc m:val="undOvr"/>
+              <m:supHide m:val="1"/>
+              <m:ctrlPr>
+                <w:rPr>
+                  <w:rFonts w:ascii="Cambria Math" w:hAnsi="Cambria Math"/>
+                  <w:i/>
+                </w:rPr>
+              </m:ctrlPr>
+            </m:naryPr>
+            <m:sub>
+              <m:d>
+                <m:dPr>
+                  <m:ctrlPr>
+                    <w:rPr>
+                      <w:rFonts w:ascii="Cambria Math" w:hAnsi="Cambria Math"/>
+                      <w:i/>
+                    </w:rPr>
+                  </m:ctrlPr>
+                </m:dPr>
+                <m:e>
+                  <m:r>
+                    <w:rPr>
+                      <w:rFonts w:ascii="Cambria Math" w:hAnsi="Cambria Math"/>
+                    </w:rPr>
+                    <m:t xml:space="preserve">x + </m:t>
+                  </m:r>
+                  <m:r>
+                    <w:rPr>
+                      <w:rFonts w:ascii="Cambria Math" w:hAnsi="Cambria Math"/>
+                    </w:rPr>
+                    <m:t>a</m:t>
+                  </m:r>
+                </m:e>
+              </m:d>
+            </m:sub>
+            <m:sup/>
+            <m:e>
+              <m:d>
+                <m:dPr>
+                  <m:begChr m:val="{"/>
+                  <m:endChr m:val="}"/>
+                  <m:ctrlPr>
+                    <w:rPr>
+                      <w:rFonts w:ascii="Cambria Math" w:hAnsi="Cambria Math"/>
+                      <w:i/>
+                    </w:rPr>
+                  </m:ctrlPr>
+                </m:dPr>
                 <m:e>
                   <m:d>
                     <m:dPr>
@@ -719,40 +951,98 @@
                         <w:rPr>
                           <w:rFonts w:ascii="Cambria Math" w:hAnsi="Cambria Math"/>
                         </w:rPr>
-                        <m:t xml:space="preserve">2 </m:t>
+                        <m:t xml:space="preserve">x × </m:t>
                       </m:r>
-                      <m:r>
-                        <w:rPr>
-                          <w:rFonts w:ascii="Cambria Math" w:hAnsi="Cambria Math"/>
-                        </w:rPr>
-                        <m:t>×</m:t>
-                      </m:r>
-                      <m:r>
-                        <w:rPr>
-                          <w:rFonts w:ascii="Cambria Math" w:hAnsi="Cambria Math"/>
-                        </w:rPr>
-                        <m:t xml:space="preserve"> </m:t>
-                      </m:r>
-                      <m:r>
-                        <w:rPr>
-                          <w:rFonts w:ascii="Cambria Math" w:hAnsi="Cambria Math"/>
-                        </w:rPr>
-                        <m:t>x</m:t>
-                      </m:r>
+                      <m:d>
+                        <m:dPr>
+                          <m:begChr m:val="{"/>
+                          <m:endChr m:val="}"/>
+                          <m:ctrlPr>
+                            <w:rPr>
+                              <w:rFonts w:ascii="Cambria Math" w:hAnsi="Cambria Math"/>
+                              <w:i/>
+                            </w:rPr>
+                          </m:ctrlPr>
+                        </m:dPr>
+                        <m:e>
+                          <m:r>
+                            <w:rPr>
+                              <w:rFonts w:ascii="Cambria Math" w:hAnsi="Cambria Math"/>
+                            </w:rPr>
+                            <m:t>a+</m:t>
+                          </m:r>
+                          <m:d>
+                            <m:dPr>
+                              <m:ctrlPr>
+                                <w:rPr>
+                                  <w:rFonts w:ascii="Cambria Math" w:hAnsi="Cambria Math"/>
+                                  <w:i/>
+                                </w:rPr>
+                              </m:ctrlPr>
+                            </m:dPr>
+                            <m:e>
+                              <m:r>
+                                <w:rPr>
+                                  <w:rFonts w:ascii="Cambria Math" w:hAnsi="Cambria Math"/>
+                                </w:rPr>
+                                <m:t xml:space="preserve">a × </m:t>
+                              </m:r>
+                              <m:sSup>
+                                <m:sSupPr>
+                                  <m:ctrlPr>
+                                    <w:rPr>
+                                      <w:rFonts w:ascii="Cambria Math" w:hAnsi="Cambria Math"/>
+                                      <w:i/>
+                                    </w:rPr>
+                                  </m:ctrlPr>
+                                </m:sSupPr>
+                                <m:e>
+                                  <m:r>
+                                    <w:rPr>
+                                      <w:rFonts w:ascii="Cambria Math" w:hAnsi="Cambria Math"/>
+                                    </w:rPr>
+                                    <m:t>x</m:t>
+                                  </m:r>
+                                </m:e>
+                                <m:sup>
+                                  <m:d>
+                                    <m:dPr>
+                                      <m:ctrlPr>
+                                        <w:rPr>
+                                          <w:rFonts w:ascii="Cambria Math" w:hAnsi="Cambria Math"/>
+                                          <w:i/>
+                                        </w:rPr>
+                                      </m:ctrlPr>
+                                    </m:dPr>
+                                    <m:e>
+                                      <m:r>
+                                        <w:rPr>
+                                          <w:rFonts w:ascii="Cambria Math" w:hAnsi="Cambria Math"/>
+                                        </w:rPr>
+                                        <m:t xml:space="preserve"> -1</m:t>
+                                      </m:r>
+                                    </m:e>
+                                  </m:d>
+                                </m:sup>
+                              </m:sSup>
+                            </m:e>
+                          </m:d>
+                        </m:e>
+                      </m:d>
                     </m:e>
                   </m:d>
+                  <m:r>
+                    <w:rPr>
+                      <w:rFonts w:ascii="Cambria Math" w:hAnsi="Cambria Math"/>
+                    </w:rPr>
+                    <m:t xml:space="preserve"> + x</m:t>
+                  </m:r>
                 </m:e>
-              </m:nary>
+              </m:d>
             </m:e>
-          </m:d>
+          </m:nary>
         </m:oMath>
       </m:oMathPara>
-    </w:p>
-    <w:p>
-      <w:pPr>
-        <w:spacing w:line="360" w:lineRule="auto"/>
-        <w:jc w:val="center"/>
-      </w:pPr>
     </w:p>
     <w:p>
       <w:pPr>

</xml_diff>

<commit_message>
Exponential of Delta Exponent Equation || (17:43 (W.I.B [Waktu Indonesia bagian Barat]), 29/03/2026), Kepulauan Riau Indonesia || Exponential of Delta Exponent Equation #LORDBLESSUS #LORDWITHUS #LORDGUARDUS #EXODUS14VERSES14 #JOHN24VERSES7 #LUCAS8VERSES21
Exponential of Delta Exponent Equation || (17:43 (W.I.B [Waktu Indonesia bagian Barat]), 29/03/2026), Kepulauan Riau Indonesia || Exponential of Delta Exponent Equation #LORDBLESSUS #LORDWITHUS #LORDGUARDUS #EXODUS14VERSES14 #JOHN24VERSES7 #LUCAS8VERSES21
</commit_message>
<xml_diff>
--- a/Exponential of Delta Exponent Equation.docx
+++ b/Exponential of Delta Exponent Equation.docx
@@ -927,8 +927,6 @@
             <m:e>
               <m:d>
                 <m:dPr>
-                  <m:begChr m:val="{"/>
-                  <m:endChr m:val="}"/>
                   <m:ctrlPr>
                     <w:rPr>
                       <w:rFonts w:ascii="Cambria Math" w:hAnsi="Cambria Math"/>
@@ -937,8 +935,16 @@
                   </m:ctrlPr>
                 </m:dPr>
                 <m:e>
+                  <m:r>
+                    <w:rPr>
+                      <w:rFonts w:ascii="Cambria Math" w:hAnsi="Cambria Math"/>
+                    </w:rPr>
+                    <m:t xml:space="preserve">x × </m:t>
+                  </m:r>
                   <m:d>
                     <m:dPr>
+                      <m:begChr m:val="{"/>
+                      <m:endChr m:val="}"/>
                       <m:ctrlPr>
                         <w:rPr>
                           <w:rFonts w:ascii="Cambria Math" w:hAnsi="Cambria Math"/>
@@ -951,12 +957,10 @@
                         <w:rPr>
                           <w:rFonts w:ascii="Cambria Math" w:hAnsi="Cambria Math"/>
                         </w:rPr>
-                        <m:t xml:space="preserve">x × </m:t>
+                        <m:t>a+</m:t>
                       </m:r>
                       <m:d>
                         <m:dPr>
-                          <m:begChr m:val="{"/>
-                          <m:endChr m:val="}"/>
                           <m:ctrlPr>
                             <w:rPr>
                               <w:rFonts w:ascii="Cambria Math" w:hAnsi="Cambria Math"/>
@@ -969,74 +973,50 @@
                             <w:rPr>
                               <w:rFonts w:ascii="Cambria Math" w:hAnsi="Cambria Math"/>
                             </w:rPr>
-                            <m:t>a+</m:t>
+                            <m:t xml:space="preserve">a × </m:t>
                           </m:r>
-                          <m:d>
-                            <m:dPr>
+                          <m:sSup>
+                            <m:sSupPr>
                               <m:ctrlPr>
                                 <w:rPr>
                                   <w:rFonts w:ascii="Cambria Math" w:hAnsi="Cambria Math"/>
                                   <w:i/>
                                 </w:rPr>
                               </m:ctrlPr>
-                            </m:dPr>
+                            </m:sSupPr>
                             <m:e>
                               <m:r>
                                 <w:rPr>
                                   <w:rFonts w:ascii="Cambria Math" w:hAnsi="Cambria Math"/>
                                 </w:rPr>
-                                <m:t xml:space="preserve">a × </m:t>
+                                <m:t>x</m:t>
                               </m:r>
-                              <m:sSup>
-                                <m:sSupPr>
+                            </m:e>
+                            <m:sup>
+                              <m:d>
+                                <m:dPr>
                                   <m:ctrlPr>
                                     <w:rPr>
                                       <w:rFonts w:ascii="Cambria Math" w:hAnsi="Cambria Math"/>
                                       <w:i/>
                                     </w:rPr>
                                   </m:ctrlPr>
-                                </m:sSupPr>
+                                </m:dPr>
                                 <m:e>
                                   <m:r>
                                     <w:rPr>
                                       <w:rFonts w:ascii="Cambria Math" w:hAnsi="Cambria Math"/>
                                     </w:rPr>
-                                    <m:t>x</m:t>
+                                    <m:t xml:space="preserve"> -1</m:t>
                                   </m:r>
                                 </m:e>
-                                <m:sup>
-                                  <m:d>
-                                    <m:dPr>
-                                      <m:ctrlPr>
-                                        <w:rPr>
-                                          <w:rFonts w:ascii="Cambria Math" w:hAnsi="Cambria Math"/>
-                                          <w:i/>
-                                        </w:rPr>
-                                      </m:ctrlPr>
-                                    </m:dPr>
-                                    <m:e>
-                                      <m:r>
-                                        <w:rPr>
-                                          <w:rFonts w:ascii="Cambria Math" w:hAnsi="Cambria Math"/>
-                                        </w:rPr>
-                                        <m:t xml:space="preserve"> -1</m:t>
-                                      </m:r>
-                                    </m:e>
-                                  </m:d>
-                                </m:sup>
-                              </m:sSup>
-                            </m:e>
-                          </m:d>
+                              </m:d>
+                            </m:sup>
+                          </m:sSup>
                         </m:e>
                       </m:d>
                     </m:e>
                   </m:d>
-                  <m:r>
-                    <w:rPr>
-                      <w:rFonts w:ascii="Cambria Math" w:hAnsi="Cambria Math"/>
-                    </w:rPr>
-                    <m:t xml:space="preserve"> + x</m:t>
-                  </m:r>
                 </m:e>
               </m:d>
             </m:e>

</xml_diff>

<commit_message>
Exponential of Delta Exponent Equation || (17:50 (W.I.B [Waktu Indonesia bagian Barat]), 29/03/2026), Batam, Kepulauan Riau Indonesia || Exponential of Delta Exponent Equation #LORDBLESSUS #LORDWITHUS #LORDGUARDUS #EXODUS14VERSES14 #JOHN24VERSES7 #LUCAS8VERSES21
Exponential of Delta Exponent Equation || (17:50 (W.I.B [Waktu Indonesia bagian Barat]), 29/03/2026), Batam, Kepulauan Riau Indonesia || Exponential of Delta Exponent Equation #LORDBLESSUS #LORDWITHUS #LORDGUARDUS #EXODUS14VERSES14 #JOHN24VERSES7 #LUCAS8VERSES21
</commit_message>
<xml_diff>
--- a/Exponential of Delta Exponent Equation.docx
+++ b/Exponential of Delta Exponent Equation.docx
@@ -33,7 +33,6 @@
           <w:lang w:val="id-ID"/>
         </w:rPr>
       </w:pPr>
-      <w:proofErr w:type="spellStart"/>
       <w:r>
         <w:rPr>
           <w:rFonts w:ascii="Times New Roman" w:eastAsiaTheme="minorEastAsia" w:hAnsi="Times New Roman" w:cs="Times New Roman"/>
@@ -41,37 +40,7 @@
           <w:szCs w:val="24"/>
           <w:lang w:val="id-ID"/>
         </w:rPr>
-        <w:t>by</w:t>
-      </w:r>
-      <w:proofErr w:type="spellEnd"/>
-      <w:r>
-        <w:rPr>
-          <w:rFonts w:ascii="Times New Roman" w:eastAsiaTheme="minorEastAsia" w:hAnsi="Times New Roman" w:cs="Times New Roman"/>
-          <w:sz w:val="24"/>
-          <w:szCs w:val="24"/>
-          <w:lang w:val="id-ID"/>
-        </w:rPr>
-        <w:t xml:space="preserve"> : Samuel Hasiholan Omega Purba, S. </w:t>
-      </w:r>
-      <w:proofErr w:type="spellStart"/>
-      <w:r>
-        <w:rPr>
-          <w:rFonts w:ascii="Times New Roman" w:eastAsiaTheme="minorEastAsia" w:hAnsi="Times New Roman" w:cs="Times New Roman"/>
-          <w:sz w:val="24"/>
-          <w:szCs w:val="24"/>
-          <w:lang w:val="id-ID"/>
-        </w:rPr>
-        <w:t>Tr</w:t>
-      </w:r>
-      <w:proofErr w:type="spellEnd"/>
-      <w:r>
-        <w:rPr>
-          <w:rFonts w:ascii="Times New Roman" w:eastAsiaTheme="minorEastAsia" w:hAnsi="Times New Roman" w:cs="Times New Roman"/>
-          <w:sz w:val="24"/>
-          <w:szCs w:val="24"/>
-          <w:lang w:val="id-ID"/>
-        </w:rPr>
-        <w:t>. T.</w:t>
+        <w:t>by : Samuel Hasiholan Omega Purba, S. Tr. T.</w:t>
       </w:r>
     </w:p>
     <w:p>
@@ -106,7 +75,6 @@
           <w:lang w:val="id-ID"/>
         </w:rPr>
       </w:pPr>
-      <w:proofErr w:type="spellStart"/>
       <w:r>
         <w:rPr>
           <w:rFonts w:ascii="Times New Roman" w:eastAsiaTheme="minorEastAsia" w:hAnsi="Times New Roman" w:cs="Times New Roman"/>
@@ -114,17 +82,7 @@
           <w:szCs w:val="24"/>
           <w:lang w:val="id-ID"/>
         </w:rPr>
-        <w:t>Prodi</w:t>
-      </w:r>
-      <w:proofErr w:type="spellEnd"/>
-      <w:r>
-        <w:rPr>
-          <w:rFonts w:ascii="Times New Roman" w:eastAsiaTheme="minorEastAsia" w:hAnsi="Times New Roman" w:cs="Times New Roman"/>
-          <w:sz w:val="24"/>
-          <w:szCs w:val="24"/>
-          <w:lang w:val="id-ID"/>
-        </w:rPr>
-        <w:t xml:space="preserve"> Teknik Robotika dan Kecerdasan buatan</w:t>
+        <w:t>Prodi Teknik Robotika dan Kecerdasan buatan</w:t>
       </w:r>
     </w:p>
     <w:p>
@@ -1017,6 +975,286 @@
                       </m:d>
                     </m:e>
                   </m:d>
+                </m:e>
+              </m:d>
+            </m:e>
+          </m:nary>
+        </m:oMath>
+      </m:oMathPara>
+    </w:p>
+    <w:p>
+      <w:pPr>
+        <w:spacing w:line="360" w:lineRule="auto"/>
+        <w:jc w:val="center"/>
+        <w:rPr>
+          <w:rFonts w:ascii="Times New Roman" w:eastAsiaTheme="minorEastAsia" w:hAnsi="Times New Roman" w:cs="Times New Roman"/>
+          <w:sz w:val="24"/>
+          <w:szCs w:val="24"/>
+          <w:lang w:val="id-ID"/>
+        </w:rPr>
+      </w:pPr>
+    </w:p>
+    <w:p>
+      <w:pPr>
+        <w:spacing w:line="360" w:lineRule="auto"/>
+        <w:jc w:val="center"/>
+        <w:rPr>
+          <w:rFonts w:eastAsiaTheme="minorEastAsia"/>
+        </w:rPr>
+      </w:pPr>
+      <m:oMathPara>
+        <m:oMathParaPr>
+          <m:jc m:val="center"/>
+        </m:oMathParaPr>
+        <m:oMath>
+          <m:nary>
+            <m:naryPr>
+              <m:chr m:val="∑"/>
+              <m:limLoc m:val="undOvr"/>
+              <m:ctrlPr>
+                <w:rPr>
+                  <w:rFonts w:ascii="Cambria Math" w:eastAsiaTheme="minorEastAsia" w:hAnsi="Cambria Math" w:cs="Times New Roman"/>
+                  <w:i/>
+                </w:rPr>
+              </m:ctrlPr>
+            </m:naryPr>
+            <m:sub>
+              <m:d>
+                <m:dPr>
+                  <m:ctrlPr>
+                    <w:rPr>
+                      <w:rFonts w:ascii="Cambria Math" w:eastAsiaTheme="minorEastAsia" w:hAnsi="Cambria Math" w:cs="Times New Roman"/>
+                      <w:i/>
+                    </w:rPr>
+                  </m:ctrlPr>
+                </m:dPr>
+                <m:e>
+                  <m:r>
+                    <w:rPr>
+                      <w:rFonts w:ascii="Cambria Math" w:eastAsiaTheme="minorEastAsia" w:hAnsi="Cambria Math" w:cs="Times New Roman"/>
+                    </w:rPr>
+                    <m:t>x + a</m:t>
+                  </m:r>
+                </m:e>
+              </m:d>
+            </m:sub>
+            <m:sup>
+              <m:d>
+                <m:dPr>
+                  <m:ctrlPr>
+                    <w:rPr>
+                      <w:rFonts w:ascii="Cambria Math" w:eastAsiaTheme="minorEastAsia" w:hAnsi="Cambria Math" w:cs="Times New Roman"/>
+                      <w:i/>
+                    </w:rPr>
+                  </m:ctrlPr>
+                </m:dPr>
+                <m:e>
+                  <m:r>
+                    <w:rPr>
+                      <w:rFonts w:ascii="Cambria Math" w:eastAsiaTheme="minorEastAsia" w:hAnsi="Cambria Math" w:cs="Times New Roman"/>
+                    </w:rPr>
+                    <m:t>n → ∞</m:t>
+                  </m:r>
+                </m:e>
+              </m:d>
+            </m:sup>
+            <m:e>
+              <m:d>
+                <m:dPr>
+                  <m:ctrlPr>
+                    <w:rPr>
+                      <w:rFonts w:ascii="Cambria Math" w:eastAsiaTheme="minorEastAsia" w:hAnsi="Cambria Math" w:cs="Times New Roman"/>
+                      <w:i/>
+                    </w:rPr>
+                  </m:ctrlPr>
+                </m:dPr>
+                <m:e>
+                  <m:sSup>
+                    <m:sSupPr>
+                      <m:ctrlPr>
+                        <w:rPr>
+                          <w:rFonts w:ascii="Cambria Math" w:eastAsiaTheme="minorEastAsia" w:hAnsi="Cambria Math" w:cs="Times New Roman"/>
+                          <w:i/>
+                        </w:rPr>
+                      </m:ctrlPr>
+                    </m:sSupPr>
+                    <m:e>
+                      <m:r>
+                        <w:rPr>
+                          <w:rFonts w:ascii="Cambria Math" w:eastAsiaTheme="minorEastAsia" w:hAnsi="Cambria Math" w:cs="Times New Roman"/>
+                        </w:rPr>
+                        <m:t>x</m:t>
+                      </m:r>
+                    </m:e>
+                    <m:sup>
+                      <m:r>
+                        <w:rPr>
+                          <w:rFonts w:ascii="Cambria Math" w:eastAsiaTheme="minorEastAsia" w:hAnsi="Cambria Math" w:cs="Times New Roman"/>
+                        </w:rPr>
+                        <m:t>n</m:t>
+                      </m:r>
+                    </m:sup>
+                  </m:sSup>
+                  <m:r>
+                    <w:rPr>
+                      <w:rFonts w:ascii="Cambria Math" w:eastAsiaTheme="minorEastAsia" w:hAnsi="Cambria Math" w:cs="Times New Roman"/>
+                    </w:rPr>
+                    <m:t xml:space="preserve">- </m:t>
+                  </m:r>
+                  <m:sSup>
+                    <m:sSupPr>
+                      <m:ctrlPr>
+                        <w:rPr>
+                          <w:rFonts w:ascii="Cambria Math" w:eastAsiaTheme="minorEastAsia" w:hAnsi="Cambria Math" w:cs="Times New Roman"/>
+                          <w:i/>
+                        </w:rPr>
+                      </m:ctrlPr>
+                    </m:sSupPr>
+                    <m:e>
+                      <m:d>
+                        <m:dPr>
+                          <m:ctrlPr>
+                            <w:rPr>
+                              <w:rFonts w:ascii="Cambria Math" w:eastAsiaTheme="minorEastAsia" w:hAnsi="Cambria Math" w:cs="Times New Roman"/>
+                              <w:i/>
+                            </w:rPr>
+                          </m:ctrlPr>
+                        </m:dPr>
+                        <m:e>
+                          <m:r>
+                            <w:rPr>
+                              <w:rFonts w:ascii="Cambria Math" w:eastAsiaTheme="minorEastAsia" w:hAnsi="Cambria Math" w:cs="Times New Roman"/>
+                            </w:rPr>
+                            <m:t>x - a</m:t>
+                          </m:r>
+                        </m:e>
+                      </m:d>
+                    </m:e>
+                    <m:sup>
+                      <m:r>
+                        <w:rPr>
+                          <w:rFonts w:ascii="Cambria Math" w:eastAsiaTheme="minorEastAsia" w:hAnsi="Cambria Math" w:cs="Times New Roman"/>
+                        </w:rPr>
+                        <m:t>n</m:t>
+                      </m:r>
+                    </m:sup>
+                  </m:sSup>
+                </m:e>
+              </m:d>
+            </m:e>
+          </m:nary>
+          <m:r>
+            <w:rPr>
+              <w:rFonts w:ascii="Cambria Math" w:hAnsi="Cambria Math"/>
+            </w:rPr>
+            <m:t xml:space="preserve"> = </m:t>
+          </m:r>
+          <m:nary>
+            <m:naryPr>
+              <m:chr m:val="∑"/>
+              <m:limLoc m:val="undOvr"/>
+              <m:supHide m:val="1"/>
+              <m:ctrlPr>
+                <w:rPr>
+                  <w:rFonts w:ascii="Cambria Math" w:hAnsi="Cambria Math"/>
+                  <w:i/>
+                </w:rPr>
+              </m:ctrlPr>
+            </m:naryPr>
+            <m:sub>
+              <m:d>
+                <m:dPr>
+                  <m:ctrlPr>
+                    <w:rPr>
+                      <w:rFonts w:ascii="Cambria Math" w:hAnsi="Cambria Math"/>
+                      <w:i/>
+                    </w:rPr>
+                  </m:ctrlPr>
+                </m:dPr>
+                <m:e>
+                  <m:r>
+                    <w:rPr>
+                      <w:rFonts w:ascii="Cambria Math" w:hAnsi="Cambria Math"/>
+                    </w:rPr>
+                    <m:t>x + a</m:t>
+                  </m:r>
+                </m:e>
+              </m:d>
+            </m:sub>
+            <m:sup/>
+            <m:e>
+              <m:d>
+                <m:dPr>
+                  <m:ctrlPr>
+                    <w:rPr>
+                      <w:rFonts w:ascii="Cambria Math" w:hAnsi="Cambria Math"/>
+                      <w:i/>
+                    </w:rPr>
+                  </m:ctrlPr>
+                </m:dPr>
+                <m:e>
+                  <m:sSup>
+                    <m:sSupPr>
+                      <m:ctrlPr>
+                        <w:rPr>
+                          <w:rFonts w:ascii="Cambria Math" w:hAnsi="Cambria Math"/>
+                          <w:i/>
+                        </w:rPr>
+                      </m:ctrlPr>
+                    </m:sSupPr>
+                    <m:e>
+                      <m:r>
+                        <w:rPr>
+                          <w:rFonts w:ascii="Cambria Math" w:hAnsi="Cambria Math"/>
+                        </w:rPr>
+                        <m:t>a</m:t>
+                      </m:r>
+                    </m:e>
+                    <m:sup>
+                      <m:r>
+                        <w:rPr>
+                          <w:rFonts w:ascii="Cambria Math" w:hAnsi="Cambria Math"/>
+                        </w:rPr>
+                        <m:t>2</m:t>
+                      </m:r>
+                    </m:sup>
+                  </m:sSup>
+                  <m:r>
+                    <w:rPr>
+                      <w:rFonts w:ascii="Cambria Math" w:hAnsi="Cambria Math"/>
+                    </w:rPr>
+                    <m:t xml:space="preserve"> + </m:t>
+                  </m:r>
+                  <m:d>
+                    <m:dPr>
+                      <m:ctrlPr>
+                        <w:rPr>
+                          <w:rFonts w:ascii="Cambria Math" w:hAnsi="Cambria Math"/>
+                          <w:i/>
+                        </w:rPr>
+                      </m:ctrlPr>
+                    </m:dPr>
+                    <m:e>
+                      <m:r>
+                        <w:rPr>
+                          <w:rFonts w:ascii="Cambria Math" w:hAnsi="Cambria Math"/>
+                        </w:rPr>
+                        <m:t xml:space="preserve">x × </m:t>
+                      </m:r>
+                      <m:r>
+                        <w:rPr>
+                          <w:rFonts w:ascii="Cambria Math" w:hAnsi="Cambria Math"/>
+                        </w:rPr>
+                        <m:t>a</m:t>
+                      </m:r>
+                    </m:e>
+                  </m:d>
+                  <m:r>
+                    <w:rPr>
+                      <w:rFonts w:ascii="Cambria Math" w:hAnsi="Cambria Math"/>
+                    </w:rPr>
+                    <m:t xml:space="preserve"> + a</m:t>
+                  </m:r>
                 </m:e>
               </m:d>
             </m:e>

</xml_diff>

<commit_message>
Exponential of Delta Exponent Equation || (19:17 (W.I.B [Waktu Indonesia bagian Barat]), 29/03/2026), Batam, Kepulauan Riau Indonesia || Exponential of Delta Exponent Equation #LORDBLESSUS #LORDWITHUS #LORDGUARDUS #EXODUS14VERSES14 #JOHN24VERSES7 #LUCAS8VERSES21
Exponential of Delta Exponent Equation || (19:17 (W.I.B [Waktu Indonesia bagian Barat]), 29/03/2026), Batam, Kepulauan Riau Indonesia || Exponential of Delta Exponent Equation #LORDBLESSUS #LORDWITHUS #LORDGUARDUS #EXODUS14VERSES14 #JOHN24VERSES7 #LUCAS8VERSES21
</commit_message>
<xml_diff>
--- a/Exponential of Delta Exponent Equation.docx
+++ b/Exponential of Delta Exponent Equation.docx
@@ -33,6 +33,7 @@
           <w:lang w:val="id-ID"/>
         </w:rPr>
       </w:pPr>
+      <w:proofErr w:type="spellStart"/>
       <w:r>
         <w:rPr>
           <w:rFonts w:ascii="Times New Roman" w:eastAsiaTheme="minorEastAsia" w:hAnsi="Times New Roman" w:cs="Times New Roman"/>
@@ -40,7 +41,37 @@
           <w:szCs w:val="24"/>
           <w:lang w:val="id-ID"/>
         </w:rPr>
-        <w:t>by : Samuel Hasiholan Omega Purba, S. Tr. T.</w:t>
+        <w:t>by</w:t>
+      </w:r>
+      <w:proofErr w:type="spellEnd"/>
+      <w:r>
+        <w:rPr>
+          <w:rFonts w:ascii="Times New Roman" w:eastAsiaTheme="minorEastAsia" w:hAnsi="Times New Roman" w:cs="Times New Roman"/>
+          <w:sz w:val="24"/>
+          <w:szCs w:val="24"/>
+          <w:lang w:val="id-ID"/>
+        </w:rPr>
+        <w:t xml:space="preserve"> : Samuel Hasiholan Omega Purba, S. </w:t>
+      </w:r>
+      <w:proofErr w:type="spellStart"/>
+      <w:r>
+        <w:rPr>
+          <w:rFonts w:ascii="Times New Roman" w:eastAsiaTheme="minorEastAsia" w:hAnsi="Times New Roman" w:cs="Times New Roman"/>
+          <w:sz w:val="24"/>
+          <w:szCs w:val="24"/>
+          <w:lang w:val="id-ID"/>
+        </w:rPr>
+        <w:t>Tr</w:t>
+      </w:r>
+      <w:proofErr w:type="spellEnd"/>
+      <w:r>
+        <w:rPr>
+          <w:rFonts w:ascii="Times New Roman" w:eastAsiaTheme="minorEastAsia" w:hAnsi="Times New Roman" w:cs="Times New Roman"/>
+          <w:sz w:val="24"/>
+          <w:szCs w:val="24"/>
+          <w:lang w:val="id-ID"/>
+        </w:rPr>
+        <w:t>. T.</w:t>
       </w:r>
     </w:p>
     <w:p>
@@ -75,6 +106,7 @@
           <w:lang w:val="id-ID"/>
         </w:rPr>
       </w:pPr>
+      <w:proofErr w:type="spellStart"/>
       <w:r>
         <w:rPr>
           <w:rFonts w:ascii="Times New Roman" w:eastAsiaTheme="minorEastAsia" w:hAnsi="Times New Roman" w:cs="Times New Roman"/>
@@ -82,7 +114,17 @@
           <w:szCs w:val="24"/>
           <w:lang w:val="id-ID"/>
         </w:rPr>
-        <w:t>Prodi Teknik Robotika dan Kecerdasan buatan</w:t>
+        <w:t>Prodi</w:t>
+      </w:r>
+      <w:proofErr w:type="spellEnd"/>
+      <w:r>
+        <w:rPr>
+          <w:rFonts w:ascii="Times New Roman" w:eastAsiaTheme="minorEastAsia" w:hAnsi="Times New Roman" w:cs="Times New Roman"/>
+          <w:sz w:val="24"/>
+          <w:szCs w:val="24"/>
+          <w:lang w:val="id-ID"/>
+        </w:rPr>
+        <w:t xml:space="preserve"> Teknik Robotika dan Kecerdasan buatan</w:t>
       </w:r>
     </w:p>
     <w:p>
@@ -217,13 +259,7 @@
             <w:rPr>
               <w:rFonts w:ascii="Cambria Math" w:hAnsi="Cambria Math"/>
             </w:rPr>
-            <m:t xml:space="preserve"> </m:t>
-          </m:r>
-          <m:r>
-            <w:rPr>
-              <w:rFonts w:ascii="Cambria Math" w:hAnsi="Cambria Math"/>
-            </w:rPr>
-            <m:t xml:space="preserve">= </m:t>
+            <m:t xml:space="preserve"> = </m:t>
           </m:r>
           <m:d>
             <m:dPr>
@@ -409,13 +445,7 @@
                 <w:rPr>
                   <w:rFonts w:ascii="Cambria Math" w:hAnsi="Cambria Math"/>
                 </w:rPr>
-                <m:t xml:space="preserve"> + </m:t>
-              </m:r>
-              <m:r>
-                <w:rPr>
-                  <w:rFonts w:ascii="Cambria Math" w:hAnsi="Cambria Math"/>
-                </w:rPr>
-                <m:t>1</m:t>
+                <m:t xml:space="preserve"> + 1</m:t>
               </m:r>
             </m:e>
           </m:d>
@@ -539,13 +569,7 @@
                     <w:rPr>
                       <w:rFonts w:ascii="Cambria Math" w:eastAsiaTheme="minorEastAsia" w:hAnsi="Cambria Math" w:cs="Times New Roman"/>
                     </w:rPr>
-                    <m:t>-</m:t>
-                  </m:r>
-                  <m:r>
-                    <w:rPr>
-                      <w:rFonts w:ascii="Cambria Math" w:eastAsiaTheme="minorEastAsia" w:hAnsi="Cambria Math" w:cs="Times New Roman"/>
-                    </w:rPr>
-                    <m:t xml:space="preserve"> </m:t>
+                    <m:t xml:space="preserve">- </m:t>
                   </m:r>
                   <m:sSup>
                     <m:sSupPr>
@@ -703,336 +727,6 @@
                     <w:rPr>
                       <w:rFonts w:ascii="Cambria Math" w:eastAsiaTheme="minorEastAsia" w:hAnsi="Cambria Math" w:cs="Times New Roman"/>
                     </w:rPr>
-                    <m:t xml:space="preserve">x + </m:t>
-                  </m:r>
-                  <m:r>
-                    <w:rPr>
-                      <w:rFonts w:ascii="Cambria Math" w:eastAsiaTheme="minorEastAsia" w:hAnsi="Cambria Math" w:cs="Times New Roman"/>
-                    </w:rPr>
-                    <m:t>a</m:t>
-                  </m:r>
-                </m:e>
-              </m:d>
-            </m:sub>
-            <m:sup>
-              <m:d>
-                <m:dPr>
-                  <m:ctrlPr>
-                    <w:rPr>
-                      <w:rFonts w:ascii="Cambria Math" w:eastAsiaTheme="minorEastAsia" w:hAnsi="Cambria Math" w:cs="Times New Roman"/>
-                      <w:i/>
-                    </w:rPr>
-                  </m:ctrlPr>
-                </m:dPr>
-                <m:e>
-                  <m:r>
-                    <w:rPr>
-                      <w:rFonts w:ascii="Cambria Math" w:eastAsiaTheme="minorEastAsia" w:hAnsi="Cambria Math" w:cs="Times New Roman"/>
-                    </w:rPr>
-                    <m:t>n → ∞</m:t>
-                  </m:r>
-                </m:e>
-              </m:d>
-            </m:sup>
-            <m:e>
-              <m:d>
-                <m:dPr>
-                  <m:ctrlPr>
-                    <w:rPr>
-                      <w:rFonts w:ascii="Cambria Math" w:eastAsiaTheme="minorEastAsia" w:hAnsi="Cambria Math" w:cs="Times New Roman"/>
-                      <w:i/>
-                    </w:rPr>
-                  </m:ctrlPr>
-                </m:dPr>
-                <m:e>
-                  <m:sSup>
-                    <m:sSupPr>
-                      <m:ctrlPr>
-                        <w:rPr>
-                          <w:rFonts w:ascii="Cambria Math" w:eastAsiaTheme="minorEastAsia" w:hAnsi="Cambria Math" w:cs="Times New Roman"/>
-                          <w:i/>
-                        </w:rPr>
-                      </m:ctrlPr>
-                    </m:sSupPr>
-                    <m:e>
-                      <m:r>
-                        <w:rPr>
-                          <w:rFonts w:ascii="Cambria Math" w:eastAsiaTheme="minorEastAsia" w:hAnsi="Cambria Math" w:cs="Times New Roman"/>
-                        </w:rPr>
-                        <m:t>x</m:t>
-                      </m:r>
-                    </m:e>
-                    <m:sup>
-                      <m:r>
-                        <w:rPr>
-                          <w:rFonts w:ascii="Cambria Math" w:eastAsiaTheme="minorEastAsia" w:hAnsi="Cambria Math" w:cs="Times New Roman"/>
-                        </w:rPr>
-                        <m:t>n</m:t>
-                      </m:r>
-                    </m:sup>
-                  </m:sSup>
-                  <m:r>
-                    <w:rPr>
-                      <w:rFonts w:ascii="Cambria Math" w:eastAsiaTheme="minorEastAsia" w:hAnsi="Cambria Math" w:cs="Times New Roman"/>
-                    </w:rPr>
-                    <m:t xml:space="preserve">- </m:t>
-                  </m:r>
-                  <m:sSup>
-                    <m:sSupPr>
-                      <m:ctrlPr>
-                        <w:rPr>
-                          <w:rFonts w:ascii="Cambria Math" w:eastAsiaTheme="minorEastAsia" w:hAnsi="Cambria Math" w:cs="Times New Roman"/>
-                          <w:i/>
-                        </w:rPr>
-                      </m:ctrlPr>
-                    </m:sSupPr>
-                    <m:e>
-                      <m:d>
-                        <m:dPr>
-                          <m:ctrlPr>
-                            <w:rPr>
-                              <w:rFonts w:ascii="Cambria Math" w:eastAsiaTheme="minorEastAsia" w:hAnsi="Cambria Math" w:cs="Times New Roman"/>
-                              <w:i/>
-                            </w:rPr>
-                          </m:ctrlPr>
-                        </m:dPr>
-                        <m:e>
-                          <m:r>
-                            <w:rPr>
-                              <w:rFonts w:ascii="Cambria Math" w:eastAsiaTheme="minorEastAsia" w:hAnsi="Cambria Math" w:cs="Times New Roman"/>
-                            </w:rPr>
-                            <m:t>x</m:t>
-                          </m:r>
-                          <m:r>
-                            <w:rPr>
-                              <w:rFonts w:ascii="Cambria Math" w:eastAsiaTheme="minorEastAsia" w:hAnsi="Cambria Math" w:cs="Times New Roman"/>
-                            </w:rPr>
-                            <m:t xml:space="preserve"> </m:t>
-                          </m:r>
-                          <m:r>
-                            <w:rPr>
-                              <w:rFonts w:ascii="Cambria Math" w:eastAsiaTheme="minorEastAsia" w:hAnsi="Cambria Math" w:cs="Times New Roman"/>
-                            </w:rPr>
-                            <m:t>-</m:t>
-                          </m:r>
-                          <m:r>
-                            <w:rPr>
-                              <w:rFonts w:ascii="Cambria Math" w:eastAsiaTheme="minorEastAsia" w:hAnsi="Cambria Math" w:cs="Times New Roman"/>
-                            </w:rPr>
-                            <m:t xml:space="preserve"> a</m:t>
-                          </m:r>
-                        </m:e>
-                      </m:d>
-                    </m:e>
-                    <m:sup>
-                      <m:r>
-                        <w:rPr>
-                          <w:rFonts w:ascii="Cambria Math" w:eastAsiaTheme="minorEastAsia" w:hAnsi="Cambria Math" w:cs="Times New Roman"/>
-                        </w:rPr>
-                        <m:t>n</m:t>
-                      </m:r>
-                    </m:sup>
-                  </m:sSup>
-                </m:e>
-              </m:d>
-            </m:e>
-          </m:nary>
-          <m:r>
-            <w:rPr>
-              <w:rFonts w:ascii="Cambria Math" w:hAnsi="Cambria Math"/>
-            </w:rPr>
-            <m:t xml:space="preserve"> = </m:t>
-          </m:r>
-          <m:nary>
-            <m:naryPr>
-              <m:chr m:val="∑"/>
-              <m:limLoc m:val="undOvr"/>
-              <m:supHide m:val="1"/>
-              <m:ctrlPr>
-                <w:rPr>
-                  <w:rFonts w:ascii="Cambria Math" w:hAnsi="Cambria Math"/>
-                  <w:i/>
-                </w:rPr>
-              </m:ctrlPr>
-            </m:naryPr>
-            <m:sub>
-              <m:d>
-                <m:dPr>
-                  <m:ctrlPr>
-                    <w:rPr>
-                      <w:rFonts w:ascii="Cambria Math" w:hAnsi="Cambria Math"/>
-                      <w:i/>
-                    </w:rPr>
-                  </m:ctrlPr>
-                </m:dPr>
-                <m:e>
-                  <m:r>
-                    <w:rPr>
-                      <w:rFonts w:ascii="Cambria Math" w:hAnsi="Cambria Math"/>
-                    </w:rPr>
-                    <m:t xml:space="preserve">x + </m:t>
-                  </m:r>
-                  <m:r>
-                    <w:rPr>
-                      <w:rFonts w:ascii="Cambria Math" w:hAnsi="Cambria Math"/>
-                    </w:rPr>
-                    <m:t>a</m:t>
-                  </m:r>
-                </m:e>
-              </m:d>
-            </m:sub>
-            <m:sup/>
-            <m:e>
-              <m:d>
-                <m:dPr>
-                  <m:ctrlPr>
-                    <w:rPr>
-                      <w:rFonts w:ascii="Cambria Math" w:hAnsi="Cambria Math"/>
-                      <w:i/>
-                    </w:rPr>
-                  </m:ctrlPr>
-                </m:dPr>
-                <m:e>
-                  <m:r>
-                    <w:rPr>
-                      <w:rFonts w:ascii="Cambria Math" w:hAnsi="Cambria Math"/>
-                    </w:rPr>
-                    <m:t xml:space="preserve">x × </m:t>
-                  </m:r>
-                  <m:d>
-                    <m:dPr>
-                      <m:begChr m:val="{"/>
-                      <m:endChr m:val="}"/>
-                      <m:ctrlPr>
-                        <w:rPr>
-                          <w:rFonts w:ascii="Cambria Math" w:hAnsi="Cambria Math"/>
-                          <w:i/>
-                        </w:rPr>
-                      </m:ctrlPr>
-                    </m:dPr>
-                    <m:e>
-                      <m:r>
-                        <w:rPr>
-                          <w:rFonts w:ascii="Cambria Math" w:hAnsi="Cambria Math"/>
-                        </w:rPr>
-                        <m:t>a+</m:t>
-                      </m:r>
-                      <m:d>
-                        <m:dPr>
-                          <m:ctrlPr>
-                            <w:rPr>
-                              <w:rFonts w:ascii="Cambria Math" w:hAnsi="Cambria Math"/>
-                              <w:i/>
-                            </w:rPr>
-                          </m:ctrlPr>
-                        </m:dPr>
-                        <m:e>
-                          <m:r>
-                            <w:rPr>
-                              <w:rFonts w:ascii="Cambria Math" w:hAnsi="Cambria Math"/>
-                            </w:rPr>
-                            <m:t xml:space="preserve">a × </m:t>
-                          </m:r>
-                          <m:sSup>
-                            <m:sSupPr>
-                              <m:ctrlPr>
-                                <w:rPr>
-                                  <w:rFonts w:ascii="Cambria Math" w:hAnsi="Cambria Math"/>
-                                  <w:i/>
-                                </w:rPr>
-                              </m:ctrlPr>
-                            </m:sSupPr>
-                            <m:e>
-                              <m:r>
-                                <w:rPr>
-                                  <w:rFonts w:ascii="Cambria Math" w:hAnsi="Cambria Math"/>
-                                </w:rPr>
-                                <m:t>x</m:t>
-                              </m:r>
-                            </m:e>
-                            <m:sup>
-                              <m:d>
-                                <m:dPr>
-                                  <m:ctrlPr>
-                                    <w:rPr>
-                                      <w:rFonts w:ascii="Cambria Math" w:hAnsi="Cambria Math"/>
-                                      <w:i/>
-                                    </w:rPr>
-                                  </m:ctrlPr>
-                                </m:dPr>
-                                <m:e>
-                                  <m:r>
-                                    <w:rPr>
-                                      <w:rFonts w:ascii="Cambria Math" w:hAnsi="Cambria Math"/>
-                                    </w:rPr>
-                                    <m:t xml:space="preserve"> -1</m:t>
-                                  </m:r>
-                                </m:e>
-                              </m:d>
-                            </m:sup>
-                          </m:sSup>
-                        </m:e>
-                      </m:d>
-                    </m:e>
-                  </m:d>
-                </m:e>
-              </m:d>
-            </m:e>
-          </m:nary>
-        </m:oMath>
-      </m:oMathPara>
-    </w:p>
-    <w:p>
-      <w:pPr>
-        <w:spacing w:line="360" w:lineRule="auto"/>
-        <w:jc w:val="center"/>
-        <w:rPr>
-          <w:rFonts w:ascii="Times New Roman" w:eastAsiaTheme="minorEastAsia" w:hAnsi="Times New Roman" w:cs="Times New Roman"/>
-          <w:sz w:val="24"/>
-          <w:szCs w:val="24"/>
-          <w:lang w:val="id-ID"/>
-        </w:rPr>
-      </w:pPr>
-    </w:p>
-    <w:p>
-      <w:pPr>
-        <w:spacing w:line="360" w:lineRule="auto"/>
-        <w:jc w:val="center"/>
-        <w:rPr>
-          <w:rFonts w:eastAsiaTheme="minorEastAsia"/>
-        </w:rPr>
-      </w:pPr>
-      <m:oMathPara>
-        <m:oMathParaPr>
-          <m:jc m:val="center"/>
-        </m:oMathParaPr>
-        <m:oMath>
-          <m:nary>
-            <m:naryPr>
-              <m:chr m:val="∑"/>
-              <m:limLoc m:val="undOvr"/>
-              <m:ctrlPr>
-                <w:rPr>
-                  <w:rFonts w:ascii="Cambria Math" w:eastAsiaTheme="minorEastAsia" w:hAnsi="Cambria Math" w:cs="Times New Roman"/>
-                  <w:i/>
-                </w:rPr>
-              </m:ctrlPr>
-            </m:naryPr>
-            <m:sub>
-              <m:d>
-                <m:dPr>
-                  <m:ctrlPr>
-                    <w:rPr>
-                      <w:rFonts w:ascii="Cambria Math" w:eastAsiaTheme="minorEastAsia" w:hAnsi="Cambria Math" w:cs="Times New Roman"/>
-                      <w:i/>
-                    </w:rPr>
-                  </m:ctrlPr>
-                </m:dPr>
-                <m:e>
-                  <m:r>
-                    <w:rPr>
-                      <w:rFonts w:ascii="Cambria Math" w:eastAsiaTheme="minorEastAsia" w:hAnsi="Cambria Math" w:cs="Times New Roman"/>
-                    </w:rPr>
                     <m:t>x + a</m:t>
                   </m:r>
                 </m:e>
@@ -1193,40 +887,10 @@
                   </m:ctrlPr>
                 </m:dPr>
                 <m:e>
-                  <m:sSup>
-                    <m:sSupPr>
-                      <m:ctrlPr>
-                        <w:rPr>
-                          <w:rFonts w:ascii="Cambria Math" w:hAnsi="Cambria Math"/>
-                          <w:i/>
-                        </w:rPr>
-                      </m:ctrlPr>
-                    </m:sSupPr>
-                    <m:e>
-                      <m:r>
-                        <w:rPr>
-                          <w:rFonts w:ascii="Cambria Math" w:hAnsi="Cambria Math"/>
-                        </w:rPr>
-                        <m:t>a</m:t>
-                      </m:r>
-                    </m:e>
-                    <m:sup>
-                      <m:r>
-                        <w:rPr>
-                          <w:rFonts w:ascii="Cambria Math" w:hAnsi="Cambria Math"/>
-                        </w:rPr>
-                        <m:t>2</m:t>
-                      </m:r>
-                    </m:sup>
-                  </m:sSup>
-                  <m:r>
-                    <w:rPr>
-                      <w:rFonts w:ascii="Cambria Math" w:hAnsi="Cambria Math"/>
-                    </w:rPr>
-                    <m:t xml:space="preserve"> + </m:t>
-                  </m:r>
                   <m:d>
                     <m:dPr>
+                      <m:begChr m:val="{"/>
+                      <m:endChr m:val="}"/>
                       <m:ctrlPr>
                         <w:rPr>
                           <w:rFonts w:ascii="Cambria Math" w:hAnsi="Cambria Math"/>
@@ -1241,11 +905,285 @@
                         </w:rPr>
                         <m:t xml:space="preserve">x × </m:t>
                       </m:r>
+                      <m:d>
+                        <m:dPr>
+                          <m:ctrlPr>
+                            <w:rPr>
+                              <w:rFonts w:ascii="Cambria Math" w:hAnsi="Cambria Math"/>
+                              <w:i/>
+                            </w:rPr>
+                          </m:ctrlPr>
+                        </m:dPr>
+                        <m:e>
+                          <m:r>
+                            <w:rPr>
+                              <w:rFonts w:ascii="Cambria Math" w:hAnsi="Cambria Math"/>
+                            </w:rPr>
+                            <m:t>a + 1</m:t>
+                          </m:r>
+                        </m:e>
+                      </m:d>
+                    </m:e>
+                  </m:d>
+                  <m:r>
+                    <w:rPr>
+                      <w:rFonts w:ascii="Cambria Math" w:hAnsi="Cambria Math"/>
+                    </w:rPr>
+                    <m:t xml:space="preserve"> - a</m:t>
+                  </m:r>
+                </m:e>
+              </m:d>
+            </m:e>
+          </m:nary>
+        </m:oMath>
+      </m:oMathPara>
+    </w:p>
+    <w:p>
+      <w:pPr>
+        <w:spacing w:line="360" w:lineRule="auto"/>
+        <w:jc w:val="center"/>
+        <w:rPr>
+          <w:rFonts w:ascii="Times New Roman" w:eastAsiaTheme="minorEastAsia" w:hAnsi="Times New Roman" w:cs="Times New Roman"/>
+          <w:sz w:val="24"/>
+          <w:szCs w:val="24"/>
+          <w:lang w:val="id-ID"/>
+        </w:rPr>
+      </w:pPr>
+    </w:p>
+    <w:p>
+      <w:pPr>
+        <w:spacing w:line="360" w:lineRule="auto"/>
+        <w:jc w:val="center"/>
+        <w:rPr>
+          <w:rFonts w:eastAsiaTheme="minorEastAsia"/>
+        </w:rPr>
+      </w:pPr>
+      <m:oMathPara>
+        <m:oMathParaPr>
+          <m:jc m:val="center"/>
+        </m:oMathParaPr>
+        <m:oMath>
+          <m:nary>
+            <m:naryPr>
+              <m:chr m:val="∑"/>
+              <m:limLoc m:val="undOvr"/>
+              <m:ctrlPr>
+                <w:rPr>
+                  <w:rFonts w:ascii="Cambria Math" w:eastAsiaTheme="minorEastAsia" w:hAnsi="Cambria Math" w:cs="Times New Roman"/>
+                  <w:i/>
+                </w:rPr>
+              </m:ctrlPr>
+            </m:naryPr>
+            <m:sub>
+              <m:d>
+                <m:dPr>
+                  <m:ctrlPr>
+                    <w:rPr>
+                      <w:rFonts w:ascii="Cambria Math" w:eastAsiaTheme="minorEastAsia" w:hAnsi="Cambria Math" w:cs="Times New Roman"/>
+                      <w:i/>
+                    </w:rPr>
+                  </m:ctrlPr>
+                </m:dPr>
+                <m:e>
+                  <m:r>
+                    <w:rPr>
+                      <w:rFonts w:ascii="Cambria Math" w:eastAsiaTheme="minorEastAsia" w:hAnsi="Cambria Math" w:cs="Times New Roman"/>
+                    </w:rPr>
+                    <m:t>x + a</m:t>
+                  </m:r>
+                </m:e>
+              </m:d>
+            </m:sub>
+            <m:sup>
+              <m:d>
+                <m:dPr>
+                  <m:ctrlPr>
+                    <w:rPr>
+                      <w:rFonts w:ascii="Cambria Math" w:eastAsiaTheme="minorEastAsia" w:hAnsi="Cambria Math" w:cs="Times New Roman"/>
+                      <w:i/>
+                    </w:rPr>
+                  </m:ctrlPr>
+                </m:dPr>
+                <m:e>
+                  <m:r>
+                    <w:rPr>
+                      <w:rFonts w:ascii="Cambria Math" w:eastAsiaTheme="minorEastAsia" w:hAnsi="Cambria Math" w:cs="Times New Roman"/>
+                    </w:rPr>
+                    <m:t>n → ∞</m:t>
+                  </m:r>
+                </m:e>
+              </m:d>
+            </m:sup>
+            <m:e>
+              <m:d>
+                <m:dPr>
+                  <m:ctrlPr>
+                    <w:rPr>
+                      <w:rFonts w:ascii="Cambria Math" w:eastAsiaTheme="minorEastAsia" w:hAnsi="Cambria Math" w:cs="Times New Roman"/>
+                      <w:i/>
+                    </w:rPr>
+                  </m:ctrlPr>
+                </m:dPr>
+                <m:e>
+                  <m:sSup>
+                    <m:sSupPr>
+                      <m:ctrlPr>
+                        <w:rPr>
+                          <w:rFonts w:ascii="Cambria Math" w:eastAsiaTheme="minorEastAsia" w:hAnsi="Cambria Math" w:cs="Times New Roman"/>
+                          <w:i/>
+                        </w:rPr>
+                      </m:ctrlPr>
+                    </m:sSupPr>
+                    <m:e>
+                      <m:r>
+                        <w:rPr>
+                          <w:rFonts w:ascii="Cambria Math" w:eastAsiaTheme="minorEastAsia" w:hAnsi="Cambria Math" w:cs="Times New Roman"/>
+                        </w:rPr>
+                        <m:t>x</m:t>
+                      </m:r>
+                    </m:e>
+                    <m:sup>
+                      <m:r>
+                        <w:rPr>
+                          <w:rFonts w:ascii="Cambria Math" w:eastAsiaTheme="minorEastAsia" w:hAnsi="Cambria Math" w:cs="Times New Roman"/>
+                        </w:rPr>
+                        <m:t>n</m:t>
+                      </m:r>
+                    </m:sup>
+                  </m:sSup>
+                  <m:r>
+                    <w:rPr>
+                      <w:rFonts w:ascii="Cambria Math" w:eastAsiaTheme="minorEastAsia" w:hAnsi="Cambria Math" w:cs="Times New Roman"/>
+                    </w:rPr>
+                    <m:t xml:space="preserve">- </m:t>
+                  </m:r>
+                  <m:sSup>
+                    <m:sSupPr>
+                      <m:ctrlPr>
+                        <w:rPr>
+                          <w:rFonts w:ascii="Cambria Math" w:eastAsiaTheme="minorEastAsia" w:hAnsi="Cambria Math" w:cs="Times New Roman"/>
+                          <w:i/>
+                        </w:rPr>
+                      </m:ctrlPr>
+                    </m:sSupPr>
+                    <m:e>
+                      <m:d>
+                        <m:dPr>
+                          <m:ctrlPr>
+                            <w:rPr>
+                              <w:rFonts w:ascii="Cambria Math" w:eastAsiaTheme="minorEastAsia" w:hAnsi="Cambria Math" w:cs="Times New Roman"/>
+                              <w:i/>
+                            </w:rPr>
+                          </m:ctrlPr>
+                        </m:dPr>
+                        <m:e>
+                          <m:r>
+                            <w:rPr>
+                              <w:rFonts w:ascii="Cambria Math" w:eastAsiaTheme="minorEastAsia" w:hAnsi="Cambria Math" w:cs="Times New Roman"/>
+                            </w:rPr>
+                            <m:t>x - a</m:t>
+                          </m:r>
+                        </m:e>
+                      </m:d>
+                    </m:e>
+                    <m:sup>
+                      <m:r>
+                        <w:rPr>
+                          <w:rFonts w:ascii="Cambria Math" w:eastAsiaTheme="minorEastAsia" w:hAnsi="Cambria Math" w:cs="Times New Roman"/>
+                        </w:rPr>
+                        <m:t>n</m:t>
+                      </m:r>
+                    </m:sup>
+                  </m:sSup>
+                </m:e>
+              </m:d>
+            </m:e>
+          </m:nary>
+          <m:r>
+            <w:rPr>
+              <w:rFonts w:ascii="Cambria Math" w:hAnsi="Cambria Math"/>
+            </w:rPr>
+            <m:t xml:space="preserve"> = </m:t>
+          </m:r>
+          <m:nary>
+            <m:naryPr>
+              <m:chr m:val="∑"/>
+              <m:limLoc m:val="undOvr"/>
+              <m:supHide m:val="1"/>
+              <m:ctrlPr>
+                <w:rPr>
+                  <w:rFonts w:ascii="Cambria Math" w:hAnsi="Cambria Math"/>
+                  <w:i/>
+                </w:rPr>
+              </m:ctrlPr>
+            </m:naryPr>
+            <m:sub>
+              <m:d>
+                <m:dPr>
+                  <m:ctrlPr>
+                    <w:rPr>
+                      <w:rFonts w:ascii="Cambria Math" w:hAnsi="Cambria Math"/>
+                      <w:i/>
+                    </w:rPr>
+                  </m:ctrlPr>
+                </m:dPr>
+                <m:e>
+                  <m:r>
+                    <w:rPr>
+                      <w:rFonts w:ascii="Cambria Math" w:hAnsi="Cambria Math"/>
+                    </w:rPr>
+                    <m:t>x + a</m:t>
+                  </m:r>
+                </m:e>
+              </m:d>
+            </m:sub>
+            <m:sup/>
+            <m:e>
+              <m:d>
+                <m:dPr>
+                  <m:ctrlPr>
+                    <w:rPr>
+                      <w:rFonts w:ascii="Cambria Math" w:hAnsi="Cambria Math"/>
+                      <w:i/>
+                    </w:rPr>
+                  </m:ctrlPr>
+                </m:dPr>
+                <m:e>
+                  <m:d>
+                    <m:dPr>
+                      <m:begChr m:val="{"/>
+                      <m:endChr m:val="}"/>
+                      <m:ctrlPr>
+                        <w:rPr>
+                          <w:rFonts w:ascii="Cambria Math" w:hAnsi="Cambria Math"/>
+                          <w:i/>
+                        </w:rPr>
+                      </m:ctrlPr>
+                    </m:dPr>
+                    <m:e>
+                      <m:d>
+                        <m:dPr>
+                          <m:ctrlPr>
+                            <w:rPr>
+                              <w:rFonts w:ascii="Cambria Math" w:hAnsi="Cambria Math"/>
+                              <w:i/>
+                            </w:rPr>
+                          </m:ctrlPr>
+                        </m:dPr>
+                        <m:e>
+                          <m:r>
+                            <w:rPr>
+                              <w:rFonts w:ascii="Cambria Math" w:hAnsi="Cambria Math"/>
+                            </w:rPr>
+                            <m:t>x × a</m:t>
+                          </m:r>
+                        </m:e>
+                      </m:d>
                       <m:r>
                         <w:rPr>
                           <w:rFonts w:ascii="Cambria Math" w:hAnsi="Cambria Math"/>
                         </w:rPr>
-                        <m:t>a</m:t>
+                        <m:t xml:space="preserve"> + x</m:t>
                       </m:r>
                     </m:e>
                   </m:d>
@@ -1253,12 +1191,262 @@
                     <w:rPr>
                       <w:rFonts w:ascii="Cambria Math" w:hAnsi="Cambria Math"/>
                     </w:rPr>
-                    <m:t xml:space="preserve"> + a</m:t>
+                    <m:t xml:space="preserve"> - a</m:t>
                   </m:r>
                 </m:e>
               </m:d>
             </m:e>
           </m:nary>
+        </m:oMath>
+      </m:oMathPara>
+    </w:p>
+    <w:p>
+      <w:pPr>
+        <w:spacing w:line="360" w:lineRule="auto"/>
+        <w:jc w:val="center"/>
+        <w:rPr>
+          <w:rFonts w:ascii="Times New Roman" w:eastAsiaTheme="minorEastAsia" w:hAnsi="Times New Roman" w:cs="Times New Roman"/>
+          <w:sz w:val="24"/>
+          <w:szCs w:val="24"/>
+          <w:lang w:val="id-ID"/>
+        </w:rPr>
+      </w:pPr>
+    </w:p>
+    <w:p>
+      <w:pPr>
+        <w:spacing w:line="360" w:lineRule="auto"/>
+        <w:jc w:val="center"/>
+        <w:rPr>
+          <w:rFonts w:eastAsiaTheme="minorEastAsia"/>
+        </w:rPr>
+      </w:pPr>
+      <m:oMathPara>
+        <m:oMathParaPr>
+          <m:jc m:val="center"/>
+        </m:oMathParaPr>
+        <m:oMath>
+          <m:nary>
+            <m:naryPr>
+              <m:chr m:val="∑"/>
+              <m:limLoc m:val="undOvr"/>
+              <m:ctrlPr>
+                <w:rPr>
+                  <w:rFonts w:ascii="Cambria Math" w:eastAsiaTheme="minorEastAsia" w:hAnsi="Cambria Math" w:cs="Times New Roman"/>
+                  <w:i/>
+                </w:rPr>
+              </m:ctrlPr>
+            </m:naryPr>
+            <m:sub>
+              <m:d>
+                <m:dPr>
+                  <m:ctrlPr>
+                    <w:rPr>
+                      <w:rFonts w:ascii="Cambria Math" w:eastAsiaTheme="minorEastAsia" w:hAnsi="Cambria Math" w:cs="Times New Roman"/>
+                      <w:i/>
+                    </w:rPr>
+                  </m:ctrlPr>
+                </m:dPr>
+                <m:e>
+                  <m:r>
+                    <w:rPr>
+                      <w:rFonts w:ascii="Cambria Math" w:eastAsiaTheme="minorEastAsia" w:hAnsi="Cambria Math" w:cs="Times New Roman"/>
+                    </w:rPr>
+                    <m:t>x + a</m:t>
+                  </m:r>
+                </m:e>
+              </m:d>
+            </m:sub>
+            <m:sup>
+              <m:d>
+                <m:dPr>
+                  <m:ctrlPr>
+                    <w:rPr>
+                      <w:rFonts w:ascii="Cambria Math" w:eastAsiaTheme="minorEastAsia" w:hAnsi="Cambria Math" w:cs="Times New Roman"/>
+                      <w:i/>
+                    </w:rPr>
+                  </m:ctrlPr>
+                </m:dPr>
+                <m:e>
+                  <m:r>
+                    <w:rPr>
+                      <w:rFonts w:ascii="Cambria Math" w:eastAsiaTheme="minorEastAsia" w:hAnsi="Cambria Math" w:cs="Times New Roman"/>
+                    </w:rPr>
+                    <m:t>n → ∞</m:t>
+                  </m:r>
+                </m:e>
+              </m:d>
+            </m:sup>
+            <m:e>
+              <m:d>
+                <m:dPr>
+                  <m:ctrlPr>
+                    <w:rPr>
+                      <w:rFonts w:ascii="Cambria Math" w:eastAsiaTheme="minorEastAsia" w:hAnsi="Cambria Math" w:cs="Times New Roman"/>
+                      <w:i/>
+                    </w:rPr>
+                  </m:ctrlPr>
+                </m:dPr>
+                <m:e>
+                  <m:sSup>
+                    <m:sSupPr>
+                      <m:ctrlPr>
+                        <w:rPr>
+                          <w:rFonts w:ascii="Cambria Math" w:eastAsiaTheme="minorEastAsia" w:hAnsi="Cambria Math" w:cs="Times New Roman"/>
+                          <w:i/>
+                        </w:rPr>
+                      </m:ctrlPr>
+                    </m:sSupPr>
+                    <m:e>
+                      <m:r>
+                        <w:rPr>
+                          <w:rFonts w:ascii="Cambria Math" w:eastAsiaTheme="minorEastAsia" w:hAnsi="Cambria Math" w:cs="Times New Roman"/>
+                        </w:rPr>
+                        <m:t>x</m:t>
+                      </m:r>
+                    </m:e>
+                    <m:sup>
+                      <m:r>
+                        <w:rPr>
+                          <w:rFonts w:ascii="Cambria Math" w:eastAsiaTheme="minorEastAsia" w:hAnsi="Cambria Math" w:cs="Times New Roman"/>
+                        </w:rPr>
+                        <m:t>n</m:t>
+                      </m:r>
+                    </m:sup>
+                  </m:sSup>
+                  <m:r>
+                    <w:rPr>
+                      <w:rFonts w:ascii="Cambria Math" w:eastAsiaTheme="minorEastAsia" w:hAnsi="Cambria Math" w:cs="Times New Roman"/>
+                    </w:rPr>
+                    <m:t xml:space="preserve">- </m:t>
+                  </m:r>
+                  <m:sSup>
+                    <m:sSupPr>
+                      <m:ctrlPr>
+                        <w:rPr>
+                          <w:rFonts w:ascii="Cambria Math" w:eastAsiaTheme="minorEastAsia" w:hAnsi="Cambria Math" w:cs="Times New Roman"/>
+                          <w:i/>
+                        </w:rPr>
+                      </m:ctrlPr>
+                    </m:sSupPr>
+                    <m:e>
+                      <m:d>
+                        <m:dPr>
+                          <m:ctrlPr>
+                            <w:rPr>
+                              <w:rFonts w:ascii="Cambria Math" w:eastAsiaTheme="minorEastAsia" w:hAnsi="Cambria Math" w:cs="Times New Roman"/>
+                              <w:i/>
+                            </w:rPr>
+                          </m:ctrlPr>
+                        </m:dPr>
+                        <m:e>
+                          <m:r>
+                            <w:rPr>
+                              <w:rFonts w:ascii="Cambria Math" w:eastAsiaTheme="minorEastAsia" w:hAnsi="Cambria Math" w:cs="Times New Roman"/>
+                            </w:rPr>
+                            <m:t>x - a</m:t>
+                          </m:r>
+                        </m:e>
+                      </m:d>
+                    </m:e>
+                    <m:sup>
+                      <m:r>
+                        <w:rPr>
+                          <w:rFonts w:ascii="Cambria Math" w:eastAsiaTheme="minorEastAsia" w:hAnsi="Cambria Math" w:cs="Times New Roman"/>
+                        </w:rPr>
+                        <m:t>n</m:t>
+                      </m:r>
+                    </m:sup>
+                  </m:sSup>
+                </m:e>
+              </m:d>
+            </m:e>
+          </m:nary>
+          <m:r>
+            <w:rPr>
+              <w:rFonts w:ascii="Cambria Math" w:hAnsi="Cambria Math"/>
+            </w:rPr>
+            <m:t xml:space="preserve"> = </m:t>
+          </m:r>
+          <m:d>
+            <m:dPr>
+              <m:ctrlPr>
+                <w:rPr>
+                  <w:rFonts w:ascii="Cambria Math" w:hAnsi="Cambria Math"/>
+                  <w:i/>
+                </w:rPr>
+              </m:ctrlPr>
+            </m:dPr>
+            <m:e>
+              <m:sSup>
+                <m:sSupPr>
+                  <m:ctrlPr>
+                    <w:rPr>
+                      <w:rFonts w:ascii="Cambria Math" w:hAnsi="Cambria Math"/>
+                      <w:i/>
+                    </w:rPr>
+                  </m:ctrlPr>
+                </m:sSupPr>
+                <m:e>
+                  <m:r>
+                    <w:rPr>
+                      <w:rFonts w:ascii="Cambria Math" w:hAnsi="Cambria Math"/>
+                    </w:rPr>
+                    <m:t>a</m:t>
+                  </m:r>
+                </m:e>
+                <m:sup>
+                  <m:r>
+                    <w:rPr>
+                      <w:rFonts w:ascii="Cambria Math" w:hAnsi="Cambria Math"/>
+                    </w:rPr>
+                    <m:t>2</m:t>
+                  </m:r>
+                </m:sup>
+              </m:sSup>
+              <m:r>
+                <w:rPr>
+                  <w:rFonts w:ascii="Cambria Math" w:hAnsi="Cambria Math"/>
+                </w:rPr>
+                <m:t>+</m:t>
+              </m:r>
+              <m:d>
+                <m:dPr>
+                  <m:ctrlPr>
+                    <w:rPr>
+                      <w:rFonts w:ascii="Cambria Math" w:hAnsi="Cambria Math"/>
+                      <w:i/>
+                    </w:rPr>
+                  </m:ctrlPr>
+                </m:dPr>
+                <m:e>
+                  <m:r>
+                    <w:rPr>
+                      <w:rFonts w:ascii="Cambria Math" w:hAnsi="Cambria Math"/>
+                    </w:rPr>
+                    <m:t xml:space="preserve">x </m:t>
+                  </m:r>
+                  <m:r>
+                    <w:rPr>
+                      <w:rFonts w:ascii="Cambria Math" w:hAnsi="Cambria Math"/>
+                    </w:rPr>
+                    <m:t>×</m:t>
+                  </m:r>
+                  <m:r>
+                    <w:rPr>
+                      <w:rFonts w:ascii="Cambria Math" w:hAnsi="Cambria Math"/>
+                    </w:rPr>
+                    <m:t xml:space="preserve"> a</m:t>
+                  </m:r>
+                </m:e>
+              </m:d>
+              <m:r>
+                <w:rPr>
+                  <w:rFonts w:ascii="Cambria Math" w:hAnsi="Cambria Math"/>
+                </w:rPr>
+                <m:t>+x</m:t>
+              </m:r>
+            </m:e>
+          </m:d>
         </m:oMath>
       </m:oMathPara>
     </w:p>

</xml_diff>

<commit_message>
Exponential of Delta Exponent Equation || (19:20 (W.I.B [Waktu Indonesia bagian Barat]), 29/03/2026), Batam, Kepulauan Riau Indonesia || Exponential of Delta Exponent Equation #LORDBLESSUS #LORDWITHUS #LORDGUARDUS
Exponential of Delta Exponent Equation || (19:20 (W.I.B [Waktu Indonesia bagian Barat]), 29/03/2026), Batam, Kepulauan Riau Indonesia || Exponential of Delta Exponent Equation #LORDBLESSUS #LORDWITHUS #LORDGUARDUS
</commit_message>
<xml_diff>
--- a/Exponential of Delta Exponent Equation.docx
+++ b/Exponential of Delta Exponent Equation.docx
@@ -1407,7 +1407,19 @@
                 <w:rPr>
                   <w:rFonts w:ascii="Cambria Math" w:hAnsi="Cambria Math"/>
                 </w:rPr>
+                <m:t xml:space="preserve"> </m:t>
+              </m:r>
+              <m:r>
+                <w:rPr>
+                  <w:rFonts w:ascii="Cambria Math" w:hAnsi="Cambria Math"/>
+                </w:rPr>
                 <m:t>+</m:t>
+              </m:r>
+              <m:r>
+                <w:rPr>
+                  <w:rFonts w:ascii="Cambria Math" w:hAnsi="Cambria Math"/>
+                </w:rPr>
+                <m:t xml:space="preserve"> </m:t>
               </m:r>
               <m:d>
                 <m:dPr>
@@ -1443,7 +1455,25 @@
                 <w:rPr>
                   <w:rFonts w:ascii="Cambria Math" w:hAnsi="Cambria Math"/>
                 </w:rPr>
-                <m:t>+x</m:t>
+                <m:t xml:space="preserve"> </m:t>
+              </m:r>
+              <m:r>
+                <w:rPr>
+                  <w:rFonts w:ascii="Cambria Math" w:hAnsi="Cambria Math"/>
+                </w:rPr>
+                <m:t>+</m:t>
+              </m:r>
+              <m:r>
+                <w:rPr>
+                  <w:rFonts w:ascii="Cambria Math" w:hAnsi="Cambria Math"/>
+                </w:rPr>
+                <m:t xml:space="preserve"> </m:t>
+              </m:r>
+              <m:r>
+                <w:rPr>
+                  <w:rFonts w:ascii="Cambria Math" w:hAnsi="Cambria Math"/>
+                </w:rPr>
+                <m:t>x</m:t>
               </m:r>
             </m:e>
           </m:d>

</xml_diff>

<commit_message>
Exponential of Delta Exponent Equation || (21:04 (W.I.B [Waktu Indonesia bagian Barat]), 29/03/2026), Batam, Kepulauan Riau Indonesia || Exponential of Delta Exponent Equation #LORDBLESSUS #LORDWITHUS #LORDGUARDUS #EXODUS14VERSES14 #JOHN24VERSES7 #LUCAS8VERS03
Exponential of Delta Exponent Equation || (21:04 (W.I.B [Waktu Indonesia bagian Barat]), 29/03/2026), Batam, Kepulauan Riau Indonesia || Exponential of Delta Exponent Equation #LORDBLESSUS #LORDWITHUS #LORDGUARDUS #EXODUS14VERSES14 #JOHN24VERSES7 #LUCAS8VERS03
</commit_message>
<xml_diff>
--- a/Exponential of Delta Exponent Equation.docx
+++ b/Exponential of Delta Exponent Equation.docx
@@ -663,11 +663,29 @@
                   </m:ctrlPr>
                 </m:dPr>
                 <m:e>
+                  <m:d>
+                    <m:dPr>
+                      <m:ctrlPr>
+                        <w:rPr>
+                          <w:rFonts w:ascii="Cambria Math" w:hAnsi="Cambria Math"/>
+                          <w:i/>
+                        </w:rPr>
+                      </m:ctrlPr>
+                    </m:dPr>
+                    <m:e>
+                      <m:r>
+                        <w:rPr>
+                          <w:rFonts w:ascii="Cambria Math" w:hAnsi="Cambria Math"/>
+                        </w:rPr>
+                        <m:t>2 × x</m:t>
+                      </m:r>
+                    </m:e>
+                  </m:d>
                   <m:r>
                     <w:rPr>
                       <w:rFonts w:ascii="Cambria Math" w:hAnsi="Cambria Math"/>
                     </w:rPr>
-                    <m:t>2 × x</m:t>
+                    <m:t xml:space="preserve"> - 1</m:t>
                   </m:r>
                 </m:e>
               </m:d>

</xml_diff>

<commit_message>
Exponential of Delta Exponent Equation || (13:38 (W.I.B [Waktu Indonesia bagian Barat]), 31/03/2026), Batam, Kepulauan Riau Indonesia || Exponential of Delta Exponent Equation #LORDBLESSUS #LORDWITHUS #LORDGUARDUS
Exponential of Delta Exponent Equation || (13:38 (W.I.B [Waktu Indonesia bagian Barat]), 31/03/2026), Batam, Kepulauan Riau Indonesia || Exponential of Delta Exponent Equation #LORDBLESSUS #LORDWITHUS #LORDGUARDUS
</commit_message>
<xml_diff>
--- a/Exponential of Delta Exponent Equation.docx
+++ b/Exponential of Delta Exponent Equation.docx
@@ -19,7 +19,7 @@
           <w:sz w:val="24"/>
           <w:szCs w:val="24"/>
         </w:rPr>
-        <w:t>Exponential of Delta Exponent Equation</w:t>
+        <w:t>Exponential of Delta Exponent Variable</w:t>
       </w:r>
     </w:p>
     <w:p>
@@ -33,7 +33,6 @@
           <w:lang w:val="id-ID"/>
         </w:rPr>
       </w:pPr>
-      <w:proofErr w:type="spellStart"/>
       <w:r>
         <w:rPr>
           <w:rFonts w:ascii="Times New Roman" w:eastAsiaTheme="minorEastAsia" w:hAnsi="Times New Roman" w:cs="Times New Roman"/>
@@ -41,37 +40,7 @@
           <w:szCs w:val="24"/>
           <w:lang w:val="id-ID"/>
         </w:rPr>
-        <w:t>by</w:t>
-      </w:r>
-      <w:proofErr w:type="spellEnd"/>
-      <w:r>
-        <w:rPr>
-          <w:rFonts w:ascii="Times New Roman" w:eastAsiaTheme="minorEastAsia" w:hAnsi="Times New Roman" w:cs="Times New Roman"/>
-          <w:sz w:val="24"/>
-          <w:szCs w:val="24"/>
-          <w:lang w:val="id-ID"/>
-        </w:rPr>
-        <w:t xml:space="preserve"> : Samuel Hasiholan Omega Purba, S. </w:t>
-      </w:r>
-      <w:proofErr w:type="spellStart"/>
-      <w:r>
-        <w:rPr>
-          <w:rFonts w:ascii="Times New Roman" w:eastAsiaTheme="minorEastAsia" w:hAnsi="Times New Roman" w:cs="Times New Roman"/>
-          <w:sz w:val="24"/>
-          <w:szCs w:val="24"/>
-          <w:lang w:val="id-ID"/>
-        </w:rPr>
-        <w:t>Tr</w:t>
-      </w:r>
-      <w:proofErr w:type="spellEnd"/>
-      <w:r>
-        <w:rPr>
-          <w:rFonts w:ascii="Times New Roman" w:eastAsiaTheme="minorEastAsia" w:hAnsi="Times New Roman" w:cs="Times New Roman"/>
-          <w:sz w:val="24"/>
-          <w:szCs w:val="24"/>
-          <w:lang w:val="id-ID"/>
-        </w:rPr>
-        <w:t>. T.</w:t>
+        <w:t>by : Samuel Hasiholan Omega Purba, S. Tr. T.</w:t>
       </w:r>
     </w:p>
     <w:p>
@@ -106,7 +75,6 @@
           <w:lang w:val="id-ID"/>
         </w:rPr>
       </w:pPr>
-      <w:proofErr w:type="spellStart"/>
       <w:r>
         <w:rPr>
           <w:rFonts w:ascii="Times New Roman" w:eastAsiaTheme="minorEastAsia" w:hAnsi="Times New Roman" w:cs="Times New Roman"/>
@@ -114,17 +82,7 @@
           <w:szCs w:val="24"/>
           <w:lang w:val="id-ID"/>
         </w:rPr>
-        <w:t>Prodi</w:t>
-      </w:r>
-      <w:proofErr w:type="spellEnd"/>
-      <w:r>
-        <w:rPr>
-          <w:rFonts w:ascii="Times New Roman" w:eastAsiaTheme="minorEastAsia" w:hAnsi="Times New Roman" w:cs="Times New Roman"/>
-          <w:sz w:val="24"/>
-          <w:szCs w:val="24"/>
-          <w:lang w:val="id-ID"/>
-        </w:rPr>
-        <w:t xml:space="preserve"> Teknik Robotika dan Kecerdasan buatan</w:t>
+        <w:t>Prodi Teknik Robotika dan Kecerdasan buatan</w:t>
       </w:r>
     </w:p>
     <w:p>
@@ -543,39 +501,7 @@
                     <m:sSupPr>
                       <m:ctrlPr>
                         <w:rPr>
-                          <w:rFonts w:ascii="Cambria Math" w:eastAsiaTheme="minorEastAsia" w:hAnsi="Cambria Math" w:cs="Times New Roman"/>
-                          <w:i/>
-                        </w:rPr>
-                      </m:ctrlPr>
-                    </m:sSupPr>
-                    <m:e>
-                      <m:r>
-                        <w:rPr>
-                          <w:rFonts w:ascii="Cambria Math" w:eastAsiaTheme="minorEastAsia" w:hAnsi="Cambria Math" w:cs="Times New Roman"/>
-                        </w:rPr>
-                        <m:t>x</m:t>
-                      </m:r>
-                    </m:e>
-                    <m:sup>
-                      <m:r>
-                        <w:rPr>
-                          <w:rFonts w:ascii="Cambria Math" w:eastAsiaTheme="minorEastAsia" w:hAnsi="Cambria Math" w:cs="Times New Roman"/>
-                        </w:rPr>
-                        <m:t>n</m:t>
-                      </m:r>
-                    </m:sup>
-                  </m:sSup>
-                  <m:r>
-                    <w:rPr>
-                      <w:rFonts w:ascii="Cambria Math" w:eastAsiaTheme="minorEastAsia" w:hAnsi="Cambria Math" w:cs="Times New Roman"/>
-                    </w:rPr>
-                    <m:t xml:space="preserve">- </m:t>
-                  </m:r>
-                  <m:sSup>
-                    <m:sSupPr>
-                      <m:ctrlPr>
-                        <w:rPr>
-                          <w:rFonts w:ascii="Cambria Math" w:eastAsiaTheme="minorEastAsia" w:hAnsi="Cambria Math" w:cs="Times New Roman"/>
+                          <w:rFonts w:ascii="Cambria Math" w:hAnsi="Cambria Math"/>
                           <w:i/>
                         </w:rPr>
                       </m:ctrlPr>
@@ -585,7 +511,7 @@
                         <m:dPr>
                           <m:ctrlPr>
                             <w:rPr>
-                              <w:rFonts w:ascii="Cambria Math" w:eastAsiaTheme="minorEastAsia" w:hAnsi="Cambria Math" w:cs="Times New Roman"/>
+                              <w:rFonts w:ascii="Cambria Math" w:hAnsi="Cambria Math"/>
                               <w:i/>
                             </w:rPr>
                           </m:ctrlPr>
@@ -593,12 +519,44 @@
                         <m:e>
                           <m:r>
                             <w:rPr>
-                              <w:rFonts w:ascii="Cambria Math" w:eastAsiaTheme="minorEastAsia" w:hAnsi="Cambria Math" w:cs="Times New Roman"/>
+                              <w:rFonts w:ascii="Cambria Math" w:hAnsi="Cambria Math"/>
                             </w:rPr>
-                            <m:t>x-1</m:t>
+                            <m:t>x+1</m:t>
                           </m:r>
                         </m:e>
                       </m:d>
+                    </m:e>
+                    <m:sup>
+                      <m:r>
+                        <w:rPr>
+                          <w:rFonts w:ascii="Cambria Math" w:hAnsi="Cambria Math"/>
+                        </w:rPr>
+                        <m:t>n</m:t>
+                      </m:r>
+                    </m:sup>
+                  </m:sSup>
+                  <m:r>
+                    <w:rPr>
+                      <w:rFonts w:ascii="Cambria Math" w:hAnsi="Cambria Math"/>
+                    </w:rPr>
+                    <m:t xml:space="preserve"> - </m:t>
+                  </m:r>
+                  <m:sSup>
+                    <m:sSupPr>
+                      <m:ctrlPr>
+                        <w:rPr>
+                          <w:rFonts w:ascii="Cambria Math" w:eastAsiaTheme="minorEastAsia" w:hAnsi="Cambria Math" w:cs="Times New Roman"/>
+                          <w:i/>
+                        </w:rPr>
+                      </m:ctrlPr>
+                    </m:sSupPr>
+                    <m:e>
+                      <m:r>
+                        <w:rPr>
+                          <w:rFonts w:ascii="Cambria Math" w:eastAsiaTheme="minorEastAsia" w:hAnsi="Cambria Math" w:cs="Times New Roman"/>
+                        </w:rPr>
+                        <m:t>x</m:t>
+                      </m:r>
                     </m:e>
                     <m:sup>
                       <m:r>
@@ -685,7 +643,7 @@
                     <w:rPr>
                       <w:rFonts w:ascii="Cambria Math" w:hAnsi="Cambria Math"/>
                     </w:rPr>
-                    <m:t xml:space="preserve"> - 1</m:t>
+                    <m:t xml:space="preserve"> + 1</m:t>
                   </m:r>
                 </m:e>
               </m:d>
@@ -785,39 +743,7 @@
                     <m:sSupPr>
                       <m:ctrlPr>
                         <w:rPr>
-                          <w:rFonts w:ascii="Cambria Math" w:eastAsiaTheme="minorEastAsia" w:hAnsi="Cambria Math" w:cs="Times New Roman"/>
-                          <w:i/>
-                        </w:rPr>
-                      </m:ctrlPr>
-                    </m:sSupPr>
-                    <m:e>
-                      <m:r>
-                        <w:rPr>
-                          <w:rFonts w:ascii="Cambria Math" w:eastAsiaTheme="minorEastAsia" w:hAnsi="Cambria Math" w:cs="Times New Roman"/>
-                        </w:rPr>
-                        <m:t>x</m:t>
-                      </m:r>
-                    </m:e>
-                    <m:sup>
-                      <m:r>
-                        <w:rPr>
-                          <w:rFonts w:ascii="Cambria Math" w:eastAsiaTheme="minorEastAsia" w:hAnsi="Cambria Math" w:cs="Times New Roman"/>
-                        </w:rPr>
-                        <m:t>n</m:t>
-                      </m:r>
-                    </m:sup>
-                  </m:sSup>
-                  <m:r>
-                    <w:rPr>
-                      <w:rFonts w:ascii="Cambria Math" w:eastAsiaTheme="minorEastAsia" w:hAnsi="Cambria Math" w:cs="Times New Roman"/>
-                    </w:rPr>
-                    <m:t xml:space="preserve">- </m:t>
-                  </m:r>
-                  <m:sSup>
-                    <m:sSupPr>
-                      <m:ctrlPr>
-                        <w:rPr>
-                          <w:rFonts w:ascii="Cambria Math" w:eastAsiaTheme="minorEastAsia" w:hAnsi="Cambria Math" w:cs="Times New Roman"/>
+                          <w:rFonts w:ascii="Cambria Math" w:hAnsi="Cambria Math"/>
                           <w:i/>
                         </w:rPr>
                       </m:ctrlPr>
@@ -827,7 +753,7 @@
                         <m:dPr>
                           <m:ctrlPr>
                             <w:rPr>
-                              <w:rFonts w:ascii="Cambria Math" w:eastAsiaTheme="minorEastAsia" w:hAnsi="Cambria Math" w:cs="Times New Roman"/>
+                              <w:rFonts w:ascii="Cambria Math" w:hAnsi="Cambria Math"/>
                               <w:i/>
                             </w:rPr>
                           </m:ctrlPr>
@@ -835,12 +761,44 @@
                         <m:e>
                           <m:r>
                             <w:rPr>
-                              <w:rFonts w:ascii="Cambria Math" w:eastAsiaTheme="minorEastAsia" w:hAnsi="Cambria Math" w:cs="Times New Roman"/>
+                              <w:rFonts w:ascii="Cambria Math" w:hAnsi="Cambria Math"/>
                             </w:rPr>
-                            <m:t>x - a</m:t>
+                            <m:t>x+1</m:t>
                           </m:r>
                         </m:e>
                       </m:d>
+                    </m:e>
+                    <m:sup>
+                      <m:r>
+                        <w:rPr>
+                          <w:rFonts w:ascii="Cambria Math" w:hAnsi="Cambria Math"/>
+                        </w:rPr>
+                        <m:t>n</m:t>
+                      </m:r>
+                    </m:sup>
+                  </m:sSup>
+                  <m:r>
+                    <w:rPr>
+                      <w:rFonts w:ascii="Cambria Math" w:hAnsi="Cambria Math"/>
+                    </w:rPr>
+                    <m:t xml:space="preserve"> - </m:t>
+                  </m:r>
+                  <m:sSup>
+                    <m:sSupPr>
+                      <m:ctrlPr>
+                        <w:rPr>
+                          <w:rFonts w:ascii="Cambria Math" w:eastAsiaTheme="minorEastAsia" w:hAnsi="Cambria Math" w:cs="Times New Roman"/>
+                          <w:i/>
+                        </w:rPr>
+                      </m:ctrlPr>
+                    </m:sSupPr>
+                    <m:e>
+                      <m:r>
+                        <w:rPr>
+                          <w:rFonts w:ascii="Cambria Math" w:eastAsiaTheme="minorEastAsia" w:hAnsi="Cambria Math" w:cs="Times New Roman"/>
+                        </w:rPr>
+                        <m:t>x</m:t>
+                      </m:r>
                     </m:e>
                     <m:sup>
                       <m:r>
@@ -897,6 +855,8 @@
             <m:e>
               <m:d>
                 <m:dPr>
+                  <m:begChr m:val="{"/>
+                  <m:endChr m:val="}"/>
                   <m:ctrlPr>
                     <w:rPr>
                       <w:rFonts w:ascii="Cambria Math" w:hAnsi="Cambria Math"/>
@@ -907,8 +867,6 @@
                 <m:e>
                   <m:d>
                     <m:dPr>
-                      <m:begChr m:val="{"/>
-                      <m:endChr m:val="}"/>
                       <m:ctrlPr>
                         <w:rPr>
                           <w:rFonts w:ascii="Cambria Math" w:hAnsi="Cambria Math"/>
@@ -921,33 +879,15 @@
                         <w:rPr>
                           <w:rFonts w:ascii="Cambria Math" w:hAnsi="Cambria Math"/>
                         </w:rPr>
-                        <m:t xml:space="preserve">x × </m:t>
+                        <m:t>x × a</m:t>
                       </m:r>
-                      <m:d>
-                        <m:dPr>
-                          <m:ctrlPr>
-                            <w:rPr>
-                              <w:rFonts w:ascii="Cambria Math" w:hAnsi="Cambria Math"/>
-                              <w:i/>
-                            </w:rPr>
-                          </m:ctrlPr>
-                        </m:dPr>
-                        <m:e>
-                          <m:r>
-                            <w:rPr>
-                              <w:rFonts w:ascii="Cambria Math" w:hAnsi="Cambria Math"/>
-                            </w:rPr>
-                            <m:t>a + 1</m:t>
-                          </m:r>
-                        </m:e>
-                      </m:d>
                     </m:e>
                   </m:d>
                   <m:r>
                     <w:rPr>
                       <w:rFonts w:ascii="Cambria Math" w:hAnsi="Cambria Math"/>
                     </w:rPr>
-                    <m:t xml:space="preserve"> - a</m:t>
+                    <m:t>+ a</m:t>
                   </m:r>
                 </m:e>
               </m:d>
@@ -1047,137 +987,11 @@
                     <m:sSupPr>
                       <m:ctrlPr>
                         <w:rPr>
-                          <w:rFonts w:ascii="Cambria Math" w:eastAsiaTheme="minorEastAsia" w:hAnsi="Cambria Math" w:cs="Times New Roman"/>
+                          <w:rFonts w:ascii="Cambria Math" w:hAnsi="Cambria Math"/>
                           <w:i/>
                         </w:rPr>
                       </m:ctrlPr>
                     </m:sSupPr>
-                    <m:e>
-                      <m:r>
-                        <w:rPr>
-                          <w:rFonts w:ascii="Cambria Math" w:eastAsiaTheme="minorEastAsia" w:hAnsi="Cambria Math" w:cs="Times New Roman"/>
-                        </w:rPr>
-                        <m:t>x</m:t>
-                      </m:r>
-                    </m:e>
-                    <m:sup>
-                      <m:r>
-                        <w:rPr>
-                          <w:rFonts w:ascii="Cambria Math" w:eastAsiaTheme="minorEastAsia" w:hAnsi="Cambria Math" w:cs="Times New Roman"/>
-                        </w:rPr>
-                        <m:t>n</m:t>
-                      </m:r>
-                    </m:sup>
-                  </m:sSup>
-                  <m:r>
-                    <w:rPr>
-                      <w:rFonts w:ascii="Cambria Math" w:eastAsiaTheme="minorEastAsia" w:hAnsi="Cambria Math" w:cs="Times New Roman"/>
-                    </w:rPr>
-                    <m:t xml:space="preserve">- </m:t>
-                  </m:r>
-                  <m:sSup>
-                    <m:sSupPr>
-                      <m:ctrlPr>
-                        <w:rPr>
-                          <w:rFonts w:ascii="Cambria Math" w:eastAsiaTheme="minorEastAsia" w:hAnsi="Cambria Math" w:cs="Times New Roman"/>
-                          <w:i/>
-                        </w:rPr>
-                      </m:ctrlPr>
-                    </m:sSupPr>
-                    <m:e>
-                      <m:d>
-                        <m:dPr>
-                          <m:ctrlPr>
-                            <w:rPr>
-                              <w:rFonts w:ascii="Cambria Math" w:eastAsiaTheme="minorEastAsia" w:hAnsi="Cambria Math" w:cs="Times New Roman"/>
-                              <w:i/>
-                            </w:rPr>
-                          </m:ctrlPr>
-                        </m:dPr>
-                        <m:e>
-                          <m:r>
-                            <w:rPr>
-                              <w:rFonts w:ascii="Cambria Math" w:eastAsiaTheme="minorEastAsia" w:hAnsi="Cambria Math" w:cs="Times New Roman"/>
-                            </w:rPr>
-                            <m:t>x - a</m:t>
-                          </m:r>
-                        </m:e>
-                      </m:d>
-                    </m:e>
-                    <m:sup>
-                      <m:r>
-                        <w:rPr>
-                          <w:rFonts w:ascii="Cambria Math" w:eastAsiaTheme="minorEastAsia" w:hAnsi="Cambria Math" w:cs="Times New Roman"/>
-                        </w:rPr>
-                        <m:t>n</m:t>
-                      </m:r>
-                    </m:sup>
-                  </m:sSup>
-                </m:e>
-              </m:d>
-            </m:e>
-          </m:nary>
-          <m:r>
-            <w:rPr>
-              <w:rFonts w:ascii="Cambria Math" w:hAnsi="Cambria Math"/>
-            </w:rPr>
-            <m:t xml:space="preserve"> = </m:t>
-          </m:r>
-          <m:nary>
-            <m:naryPr>
-              <m:chr m:val="∑"/>
-              <m:limLoc m:val="undOvr"/>
-              <m:supHide m:val="1"/>
-              <m:ctrlPr>
-                <w:rPr>
-                  <w:rFonts w:ascii="Cambria Math" w:hAnsi="Cambria Math"/>
-                  <w:i/>
-                </w:rPr>
-              </m:ctrlPr>
-            </m:naryPr>
-            <m:sub>
-              <m:d>
-                <m:dPr>
-                  <m:ctrlPr>
-                    <w:rPr>
-                      <w:rFonts w:ascii="Cambria Math" w:hAnsi="Cambria Math"/>
-                      <w:i/>
-                    </w:rPr>
-                  </m:ctrlPr>
-                </m:dPr>
-                <m:e>
-                  <m:r>
-                    <w:rPr>
-                      <w:rFonts w:ascii="Cambria Math" w:hAnsi="Cambria Math"/>
-                    </w:rPr>
-                    <m:t>x + a</m:t>
-                  </m:r>
-                </m:e>
-              </m:d>
-            </m:sub>
-            <m:sup/>
-            <m:e>
-              <m:d>
-                <m:dPr>
-                  <m:ctrlPr>
-                    <w:rPr>
-                      <w:rFonts w:ascii="Cambria Math" w:hAnsi="Cambria Math"/>
-                      <w:i/>
-                    </w:rPr>
-                  </m:ctrlPr>
-                </m:dPr>
-                <m:e>
-                  <m:d>
-                    <m:dPr>
-                      <m:begChr m:val="{"/>
-                      <m:endChr m:val="}"/>
-                      <m:ctrlPr>
-                        <w:rPr>
-                          <w:rFonts w:ascii="Cambria Math" w:hAnsi="Cambria Math"/>
-                          <w:i/>
-                        </w:rPr>
-                      </m:ctrlPr>
-                    </m:dPr>
                     <m:e>
                       <m:d>
                         <m:dPr>
@@ -1193,28 +1007,118 @@
                             <w:rPr>
                               <w:rFonts w:ascii="Cambria Math" w:hAnsi="Cambria Math"/>
                             </w:rPr>
-                            <m:t>x × a</m:t>
+                            <m:t>x+1</m:t>
                           </m:r>
                         </m:e>
                       </m:d>
+                    </m:e>
+                    <m:sup>
                       <m:r>
                         <w:rPr>
                           <w:rFonts w:ascii="Cambria Math" w:hAnsi="Cambria Math"/>
                         </w:rPr>
-                        <m:t xml:space="preserve"> + x</m:t>
+                        <m:t>n</m:t>
+                      </m:r>
+                    </m:sup>
+                  </m:sSup>
+                  <m:r>
+                    <w:rPr>
+                      <w:rFonts w:ascii="Cambria Math" w:hAnsi="Cambria Math"/>
+                    </w:rPr>
+                    <m:t xml:space="preserve"> - </m:t>
+                  </m:r>
+                  <m:sSup>
+                    <m:sSupPr>
+                      <m:ctrlPr>
+                        <w:rPr>
+                          <w:rFonts w:ascii="Cambria Math" w:eastAsiaTheme="minorEastAsia" w:hAnsi="Cambria Math" w:cs="Times New Roman"/>
+                          <w:i/>
+                        </w:rPr>
+                      </m:ctrlPr>
+                    </m:sSupPr>
+                    <m:e>
+                      <m:r>
+                        <w:rPr>
+                          <w:rFonts w:ascii="Cambria Math" w:eastAsiaTheme="minorEastAsia" w:hAnsi="Cambria Math" w:cs="Times New Roman"/>
+                        </w:rPr>
+                        <m:t>x</m:t>
                       </m:r>
                     </m:e>
-                  </m:d>
-                  <m:r>
-                    <w:rPr>
-                      <w:rFonts w:ascii="Cambria Math" w:hAnsi="Cambria Math"/>
-                    </w:rPr>
-                    <m:t xml:space="preserve"> - a</m:t>
-                  </m:r>
+                    <m:sup>
+                      <m:r>
+                        <w:rPr>
+                          <w:rFonts w:ascii="Cambria Math" w:eastAsiaTheme="minorEastAsia" w:hAnsi="Cambria Math" w:cs="Times New Roman"/>
+                        </w:rPr>
+                        <m:t>n</m:t>
+                      </m:r>
+                    </m:sup>
+                  </m:sSup>
                 </m:e>
               </m:d>
             </m:e>
           </m:nary>
+          <m:r>
+            <w:rPr>
+              <w:rFonts w:ascii="Cambria Math" w:hAnsi="Cambria Math"/>
+            </w:rPr>
+            <m:t xml:space="preserve"> = </m:t>
+          </m:r>
+          <m:d>
+            <m:dPr>
+              <m:ctrlPr>
+                <w:rPr>
+                  <w:rFonts w:ascii="Cambria Math" w:hAnsi="Cambria Math"/>
+                  <w:i/>
+                </w:rPr>
+              </m:ctrlPr>
+            </m:dPr>
+            <m:e>
+              <m:d>
+                <m:dPr>
+                  <m:begChr m:val="{"/>
+                  <m:endChr m:val="}"/>
+                  <m:ctrlPr>
+                    <w:rPr>
+                      <w:rFonts w:ascii="Cambria Math" w:hAnsi="Cambria Math"/>
+                      <w:i/>
+                    </w:rPr>
+                  </m:ctrlPr>
+                </m:dPr>
+                <m:e>
+                  <m:d>
+                    <m:dPr>
+                      <m:ctrlPr>
+                        <w:rPr>
+                          <w:rFonts w:ascii="Cambria Math" w:hAnsi="Cambria Math"/>
+                          <w:i/>
+                        </w:rPr>
+                      </m:ctrlPr>
+                    </m:dPr>
+                    <m:e>
+                      <m:r>
+                        <w:rPr>
+                          <w:rFonts w:ascii="Cambria Math" w:hAnsi="Cambria Math"/>
+                        </w:rPr>
+                        <m:t>x + a</m:t>
+                      </m:r>
+                    </m:e>
+                  </m:d>
+                  <m:r>
+                    <w:rPr>
+                      <w:rFonts w:ascii="Cambria Math" w:hAnsi="Cambria Math"/>
+                    </w:rPr>
+                    <m:t xml:space="preserve"> × a</m:t>
+                  </m:r>
+                </m:e>
+              </m:d>
+              <m:r>
+                <w:rPr>
+                  <w:rFonts w:ascii="Cambria Math" w:hAnsi="Cambria Math"/>
+                </w:rPr>
+                <m:t xml:space="preserve"> + a</m:t>
+              </m:r>
+            </m:e>
+          </m:d>
         </m:oMath>
       </m:oMathPara>
     </w:p>
@@ -1309,39 +1213,7 @@
                     <m:sSupPr>
                       <m:ctrlPr>
                         <w:rPr>
-                          <w:rFonts w:ascii="Cambria Math" w:eastAsiaTheme="minorEastAsia" w:hAnsi="Cambria Math" w:cs="Times New Roman"/>
-                          <w:i/>
-                        </w:rPr>
-                      </m:ctrlPr>
-                    </m:sSupPr>
-                    <m:e>
-                      <m:r>
-                        <w:rPr>
-                          <w:rFonts w:ascii="Cambria Math" w:eastAsiaTheme="minorEastAsia" w:hAnsi="Cambria Math" w:cs="Times New Roman"/>
-                        </w:rPr>
-                        <m:t>x</m:t>
-                      </m:r>
-                    </m:e>
-                    <m:sup>
-                      <m:r>
-                        <w:rPr>
-                          <w:rFonts w:ascii="Cambria Math" w:eastAsiaTheme="minorEastAsia" w:hAnsi="Cambria Math" w:cs="Times New Roman"/>
-                        </w:rPr>
-                        <m:t>n</m:t>
-                      </m:r>
-                    </m:sup>
-                  </m:sSup>
-                  <m:r>
-                    <w:rPr>
-                      <w:rFonts w:ascii="Cambria Math" w:eastAsiaTheme="minorEastAsia" w:hAnsi="Cambria Math" w:cs="Times New Roman"/>
-                    </w:rPr>
-                    <m:t xml:space="preserve">- </m:t>
-                  </m:r>
-                  <m:sSup>
-                    <m:sSupPr>
-                      <m:ctrlPr>
-                        <w:rPr>
-                          <w:rFonts w:ascii="Cambria Math" w:eastAsiaTheme="minorEastAsia" w:hAnsi="Cambria Math" w:cs="Times New Roman"/>
+                          <w:rFonts w:ascii="Cambria Math" w:hAnsi="Cambria Math"/>
                           <w:i/>
                         </w:rPr>
                       </m:ctrlPr>
@@ -1351,7 +1223,7 @@
                         <m:dPr>
                           <m:ctrlPr>
                             <w:rPr>
-                              <w:rFonts w:ascii="Cambria Math" w:eastAsiaTheme="minorEastAsia" w:hAnsi="Cambria Math" w:cs="Times New Roman"/>
+                              <w:rFonts w:ascii="Cambria Math" w:hAnsi="Cambria Math"/>
                               <w:i/>
                             </w:rPr>
                           </m:ctrlPr>
@@ -1359,12 +1231,44 @@
                         <m:e>
                           <m:r>
                             <w:rPr>
-                              <w:rFonts w:ascii="Cambria Math" w:eastAsiaTheme="minorEastAsia" w:hAnsi="Cambria Math" w:cs="Times New Roman"/>
+                              <w:rFonts w:ascii="Cambria Math" w:hAnsi="Cambria Math"/>
                             </w:rPr>
-                            <m:t>x - a</m:t>
+                            <m:t>x+1</m:t>
                           </m:r>
                         </m:e>
                       </m:d>
+                    </m:e>
+                    <m:sup>
+                      <m:r>
+                        <w:rPr>
+                          <w:rFonts w:ascii="Cambria Math" w:hAnsi="Cambria Math"/>
+                        </w:rPr>
+                        <m:t>n</m:t>
+                      </m:r>
+                    </m:sup>
+                  </m:sSup>
+                  <m:r>
+                    <w:rPr>
+                      <w:rFonts w:ascii="Cambria Math" w:hAnsi="Cambria Math"/>
+                    </w:rPr>
+                    <m:t xml:space="preserve"> - </m:t>
+                  </m:r>
+                  <m:sSup>
+                    <m:sSupPr>
+                      <m:ctrlPr>
+                        <w:rPr>
+                          <w:rFonts w:ascii="Cambria Math" w:eastAsiaTheme="minorEastAsia" w:hAnsi="Cambria Math" w:cs="Times New Roman"/>
+                          <w:i/>
+                        </w:rPr>
+                      </m:ctrlPr>
+                    </m:sSupPr>
+                    <m:e>
+                      <m:r>
+                        <w:rPr>
+                          <w:rFonts w:ascii="Cambria Math" w:eastAsiaTheme="minorEastAsia" w:hAnsi="Cambria Math" w:cs="Times New Roman"/>
+                        </w:rPr>
+                        <m:t>x</m:t>
+                      </m:r>
                     </m:e>
                     <m:sup>
                       <m:r>
@@ -1425,19 +1329,7 @@
                 <w:rPr>
                   <w:rFonts w:ascii="Cambria Math" w:hAnsi="Cambria Math"/>
                 </w:rPr>
-                <m:t xml:space="preserve"> </m:t>
-              </m:r>
-              <m:r>
-                <w:rPr>
-                  <w:rFonts w:ascii="Cambria Math" w:hAnsi="Cambria Math"/>
-                </w:rPr>
-                <m:t>+</m:t>
-              </m:r>
-              <m:r>
-                <w:rPr>
-                  <w:rFonts w:ascii="Cambria Math" w:hAnsi="Cambria Math"/>
-                </w:rPr>
-                <m:t xml:space="preserve"> </m:t>
+                <m:t xml:space="preserve"> + </m:t>
               </m:r>
               <m:d>
                 <m:dPr>
@@ -1453,19 +1345,7 @@
                     <w:rPr>
                       <w:rFonts w:ascii="Cambria Math" w:hAnsi="Cambria Math"/>
                     </w:rPr>
-                    <m:t xml:space="preserve">x </m:t>
-                  </m:r>
-                  <m:r>
-                    <w:rPr>
-                      <w:rFonts w:ascii="Cambria Math" w:hAnsi="Cambria Math"/>
-                    </w:rPr>
-                    <m:t>×</m:t>
-                  </m:r>
-                  <m:r>
-                    <w:rPr>
-                      <w:rFonts w:ascii="Cambria Math" w:hAnsi="Cambria Math"/>
-                    </w:rPr>
-                    <m:t xml:space="preserve"> a</m:t>
+                    <m:t>x × a</m:t>
                   </m:r>
                 </m:e>
               </m:d>
@@ -1473,37 +1353,14 @@
                 <w:rPr>
                   <w:rFonts w:ascii="Cambria Math" w:hAnsi="Cambria Math"/>
                 </w:rPr>
-                <m:t xml:space="preserve"> </m:t>
-              </m:r>
-              <m:r>
-                <w:rPr>
-                  <w:rFonts w:ascii="Cambria Math" w:hAnsi="Cambria Math"/>
-                </w:rPr>
-                <m:t>+</m:t>
-              </m:r>
-              <m:r>
-                <w:rPr>
-                  <w:rFonts w:ascii="Cambria Math" w:hAnsi="Cambria Math"/>
-                </w:rPr>
-                <m:t xml:space="preserve"> </m:t>
-              </m:r>
-              <m:r>
-                <w:rPr>
-                  <w:rFonts w:ascii="Cambria Math" w:hAnsi="Cambria Math"/>
-                </w:rPr>
-                <m:t>x</m:t>
+                <m:t xml:space="preserve"> + a</m:t>
               </m:r>
             </m:e>
           </m:d>
         </m:oMath>
       </m:oMathPara>
     </w:p>
-    <w:p>
-      <w:pPr>
-        <w:spacing w:line="360" w:lineRule="auto"/>
-        <w:jc w:val="center"/>
-      </w:pPr>
-    </w:p>
+    <w:p/>
     <w:sectPr>
       <w:pgSz w:w="11906" w:h="16838" w:code="9"/>
       <w:pgMar w:top="1701" w:right="2268" w:bottom="2268" w:left="1701" w:header="708" w:footer="708" w:gutter="0"/>

</xml_diff>

<commit_message>
Exponential of Delta Exponent Equation || (23:48 (W.I.B [Waktu Indonesia bagian Barat]), 31/03/2026), Batam, Kepulauan Riau Indonesia || Exponential of Delta Exponent Equation #LORDBLESSUS #LORDWITHUS #LORDGUARDUS
Exponential of Delta Exponent Equation || (23:48 (W.I.B [Waktu Indonesia bagian Barat]), 31/03/2026), Batam, Kepulauan Riau Indonesia || Exponential of Delta Exponent Equation #LORDBLESSUS #LORDWITHUS #LORDGUARDUS
</commit_message>
<xml_diff>
--- a/Exponential of Delta Exponent Equation.docx
+++ b/Exponential of Delta Exponent Equation.docx
@@ -33,6 +33,7 @@
           <w:lang w:val="id-ID"/>
         </w:rPr>
       </w:pPr>
+      <w:proofErr w:type="spellStart"/>
       <w:r>
         <w:rPr>
           <w:rFonts w:ascii="Times New Roman" w:eastAsiaTheme="minorEastAsia" w:hAnsi="Times New Roman" w:cs="Times New Roman"/>
@@ -40,7 +41,37 @@
           <w:szCs w:val="24"/>
           <w:lang w:val="id-ID"/>
         </w:rPr>
-        <w:t>by : Samuel Hasiholan Omega Purba, S. Tr. T.</w:t>
+        <w:t>by</w:t>
+      </w:r>
+      <w:proofErr w:type="spellEnd"/>
+      <w:r>
+        <w:rPr>
+          <w:rFonts w:ascii="Times New Roman" w:eastAsiaTheme="minorEastAsia" w:hAnsi="Times New Roman" w:cs="Times New Roman"/>
+          <w:sz w:val="24"/>
+          <w:szCs w:val="24"/>
+          <w:lang w:val="id-ID"/>
+        </w:rPr>
+        <w:t xml:space="preserve"> : Samuel Hasiholan Omega Purba, S. </w:t>
+      </w:r>
+      <w:proofErr w:type="spellStart"/>
+      <w:r>
+        <w:rPr>
+          <w:rFonts w:ascii="Times New Roman" w:eastAsiaTheme="minorEastAsia" w:hAnsi="Times New Roman" w:cs="Times New Roman"/>
+          <w:sz w:val="24"/>
+          <w:szCs w:val="24"/>
+          <w:lang w:val="id-ID"/>
+        </w:rPr>
+        <w:t>Tr</w:t>
+      </w:r>
+      <w:proofErr w:type="spellEnd"/>
+      <w:r>
+        <w:rPr>
+          <w:rFonts w:ascii="Times New Roman" w:eastAsiaTheme="minorEastAsia" w:hAnsi="Times New Roman" w:cs="Times New Roman"/>
+          <w:sz w:val="24"/>
+          <w:szCs w:val="24"/>
+          <w:lang w:val="id-ID"/>
+        </w:rPr>
+        <w:t>. T.</w:t>
       </w:r>
     </w:p>
     <w:p>
@@ -75,6 +106,7 @@
           <w:lang w:val="id-ID"/>
         </w:rPr>
       </w:pPr>
+      <w:proofErr w:type="spellStart"/>
       <w:r>
         <w:rPr>
           <w:rFonts w:ascii="Times New Roman" w:eastAsiaTheme="minorEastAsia" w:hAnsi="Times New Roman" w:cs="Times New Roman"/>
@@ -82,7 +114,17 @@
           <w:szCs w:val="24"/>
           <w:lang w:val="id-ID"/>
         </w:rPr>
-        <w:t>Prodi Teknik Robotika dan Kecerdasan buatan</w:t>
+        <w:t>Prodi</w:t>
+      </w:r>
+      <w:proofErr w:type="spellEnd"/>
+      <w:r>
+        <w:rPr>
+          <w:rFonts w:ascii="Times New Roman" w:eastAsiaTheme="minorEastAsia" w:hAnsi="Times New Roman" w:cs="Times New Roman"/>
+          <w:sz w:val="24"/>
+          <w:szCs w:val="24"/>
+          <w:lang w:val="id-ID"/>
+        </w:rPr>
+        <w:t xml:space="preserve"> Teknik Robotika dan Kecerdasan buatan</w:t>
       </w:r>
     </w:p>
     <w:p>
@@ -1063,20 +1105,42 @@
             </w:rPr>
             <m:t xml:space="preserve"> = </m:t>
           </m:r>
-          <m:d>
-            <m:dPr>
+          <m:nary>
+            <m:naryPr>
+              <m:chr m:val="∑"/>
+              <m:limLoc m:val="undOvr"/>
+              <m:supHide m:val="1"/>
               <m:ctrlPr>
                 <w:rPr>
                   <w:rFonts w:ascii="Cambria Math" w:hAnsi="Cambria Math"/>
                   <w:i/>
                 </w:rPr>
               </m:ctrlPr>
-            </m:dPr>
+            </m:naryPr>
+            <m:sub>
+              <m:d>
+                <m:dPr>
+                  <m:ctrlPr>
+                    <w:rPr>
+                      <w:rFonts w:ascii="Cambria Math" w:eastAsiaTheme="minorEastAsia" w:hAnsi="Cambria Math" w:cs="Times New Roman"/>
+                      <w:i/>
+                    </w:rPr>
+                  </m:ctrlPr>
+                </m:dPr>
+                <m:e>
+                  <m:r>
+                    <w:rPr>
+                      <w:rFonts w:ascii="Cambria Math" w:eastAsiaTheme="minorEastAsia" w:hAnsi="Cambria Math" w:cs="Times New Roman"/>
+                    </w:rPr>
+                    <m:t>x + a</m:t>
+                  </m:r>
+                </m:e>
+              </m:d>
+            </m:sub>
+            <m:sup/>
             <m:e>
               <m:d>
                 <m:dPr>
-                  <m:begChr m:val="{"/>
-                  <m:endChr m:val="}"/>
                   <m:ctrlPr>
                     <w:rPr>
                       <w:rFonts w:ascii="Cambria Math" w:hAnsi="Cambria Math"/>
@@ -1087,6 +1151,8 @@
                 <m:e>
                   <m:d>
                     <m:dPr>
+                      <m:begChr m:val="{"/>
+                      <m:endChr m:val="}"/>
                       <m:ctrlPr>
                         <w:rPr>
                           <w:rFonts w:ascii="Cambria Math" w:hAnsi="Cambria Math"/>
@@ -1095,11 +1161,29 @@
                       </m:ctrlPr>
                     </m:dPr>
                     <m:e>
+                      <m:d>
+                        <m:dPr>
+                          <m:ctrlPr>
+                            <w:rPr>
+                              <w:rFonts w:ascii="Cambria Math" w:hAnsi="Cambria Math"/>
+                              <w:i/>
+                            </w:rPr>
+                          </m:ctrlPr>
+                        </m:dPr>
+                        <m:e>
+                          <m:r>
+                            <w:rPr>
+                              <w:rFonts w:ascii="Cambria Math" w:hAnsi="Cambria Math"/>
+                            </w:rPr>
+                            <m:t>x + a</m:t>
+                          </m:r>
+                        </m:e>
+                      </m:d>
                       <m:r>
                         <w:rPr>
                           <w:rFonts w:ascii="Cambria Math" w:hAnsi="Cambria Math"/>
                         </w:rPr>
-                        <m:t>x + a</m:t>
+                        <m:t xml:space="preserve"> × a</m:t>
                       </m:r>
                     </m:e>
                   </m:d>
@@ -1107,18 +1191,12 @@
                     <w:rPr>
                       <w:rFonts w:ascii="Cambria Math" w:hAnsi="Cambria Math"/>
                     </w:rPr>
-                    <m:t xml:space="preserve"> × a</m:t>
+                    <m:t xml:space="preserve"> + a</m:t>
                   </m:r>
                 </m:e>
               </m:d>
-              <m:r>
-                <w:rPr>
-                  <w:rFonts w:ascii="Cambria Math" w:hAnsi="Cambria Math"/>
-                </w:rPr>
-                <m:t xml:space="preserve"> + a</m:t>
-              </m:r>
             </m:e>
-          </m:d>
+          </m:nary>
         </m:oMath>
       </m:oMathPara>
     </w:p>
@@ -1143,9 +1221,6 @@
         </w:rPr>
       </w:pPr>
       <m:oMathPara>
-        <m:oMathParaPr>
-          <m:jc m:val="center"/>
-        </m:oMathParaPr>
         <m:oMath>
           <m:nary>
             <m:naryPr>
@@ -1289,53 +1364,24 @@
             </w:rPr>
             <m:t xml:space="preserve"> = </m:t>
           </m:r>
-          <m:d>
-            <m:dPr>
+          <m:nary>
+            <m:naryPr>
+              <m:chr m:val="∑"/>
+              <m:limLoc m:val="undOvr"/>
+              <m:supHide m:val="1"/>
               <m:ctrlPr>
                 <w:rPr>
                   <w:rFonts w:ascii="Cambria Math" w:hAnsi="Cambria Math"/>
                   <w:i/>
                 </w:rPr>
               </m:ctrlPr>
-            </m:dPr>
-            <m:e>
-              <m:sSup>
-                <m:sSupPr>
-                  <m:ctrlPr>
-                    <w:rPr>
-                      <w:rFonts w:ascii="Cambria Math" w:hAnsi="Cambria Math"/>
-                      <w:i/>
-                    </w:rPr>
-                  </m:ctrlPr>
-                </m:sSupPr>
-                <m:e>
-                  <m:r>
-                    <w:rPr>
-                      <w:rFonts w:ascii="Cambria Math" w:hAnsi="Cambria Math"/>
-                    </w:rPr>
-                    <m:t>a</m:t>
-                  </m:r>
-                </m:e>
-                <m:sup>
-                  <m:r>
-                    <w:rPr>
-                      <w:rFonts w:ascii="Cambria Math" w:hAnsi="Cambria Math"/>
-                    </w:rPr>
-                    <m:t>2</m:t>
-                  </m:r>
-                </m:sup>
-              </m:sSup>
-              <m:r>
-                <w:rPr>
-                  <w:rFonts w:ascii="Cambria Math" w:hAnsi="Cambria Math"/>
-                </w:rPr>
-                <m:t xml:space="preserve"> + </m:t>
-              </m:r>
+            </m:naryPr>
+            <m:sub>
               <m:d>
                 <m:dPr>
                   <m:ctrlPr>
                     <w:rPr>
-                      <w:rFonts w:ascii="Cambria Math" w:hAnsi="Cambria Math"/>
+                      <w:rFonts w:ascii="Cambria Math" w:eastAsiaTheme="minorEastAsia" w:hAnsi="Cambria Math" w:cs="Times New Roman"/>
                       <w:i/>
                     </w:rPr>
                   </m:ctrlPr>
@@ -1343,24 +1389,88 @@
                 <m:e>
                   <m:r>
                     <w:rPr>
-                      <w:rFonts w:ascii="Cambria Math" w:hAnsi="Cambria Math"/>
-                    </w:rPr>
-                    <m:t>x × a</m:t>
+                      <w:rFonts w:ascii="Cambria Math" w:eastAsiaTheme="minorEastAsia" w:hAnsi="Cambria Math" w:cs="Times New Roman"/>
+                    </w:rPr>
+                    <m:t>x + a</m:t>
                   </m:r>
                 </m:e>
               </m:d>
-              <m:r>
-                <w:rPr>
-                  <w:rFonts w:ascii="Cambria Math" w:hAnsi="Cambria Math"/>
-                </w:rPr>
-                <m:t xml:space="preserve"> + a</m:t>
-              </m:r>
+            </m:sub>
+            <m:sup/>
+            <m:e>
+              <m:d>
+                <m:dPr>
+                  <m:ctrlPr>
+                    <w:rPr>
+                      <w:rFonts w:ascii="Cambria Math" w:hAnsi="Cambria Math"/>
+                      <w:i/>
+                    </w:rPr>
+                  </m:ctrlPr>
+                </m:dPr>
+                <m:e>
+                  <m:sSup>
+                    <m:sSupPr>
+                      <m:ctrlPr>
+                        <w:rPr>
+                          <w:rFonts w:ascii="Cambria Math" w:hAnsi="Cambria Math"/>
+                          <w:i/>
+                        </w:rPr>
+                      </m:ctrlPr>
+                    </m:sSupPr>
+                    <m:e>
+                      <m:r>
+                        <w:rPr>
+                          <w:rFonts w:ascii="Cambria Math" w:hAnsi="Cambria Math"/>
+                        </w:rPr>
+                        <m:t>a</m:t>
+                      </m:r>
+                    </m:e>
+                    <m:sup>
+                      <m:r>
+                        <w:rPr>
+                          <w:rFonts w:ascii="Cambria Math" w:hAnsi="Cambria Math"/>
+                        </w:rPr>
+                        <m:t>2</m:t>
+                      </m:r>
+                    </m:sup>
+                  </m:sSup>
+                  <m:r>
+                    <w:rPr>
+                      <w:rFonts w:ascii="Cambria Math" w:hAnsi="Cambria Math"/>
+                    </w:rPr>
+                    <m:t xml:space="preserve"> + </m:t>
+                  </m:r>
+                  <m:d>
+                    <m:dPr>
+                      <m:ctrlPr>
+                        <w:rPr>
+                          <w:rFonts w:ascii="Cambria Math" w:hAnsi="Cambria Math"/>
+                          <w:i/>
+                        </w:rPr>
+                      </m:ctrlPr>
+                    </m:dPr>
+                    <m:e>
+                      <m:r>
+                        <w:rPr>
+                          <w:rFonts w:ascii="Cambria Math" w:hAnsi="Cambria Math"/>
+                        </w:rPr>
+                        <m:t>x × a</m:t>
+                      </m:r>
+                    </m:e>
+                  </m:d>
+                  <m:r>
+                    <w:rPr>
+                      <w:rFonts w:ascii="Cambria Math" w:hAnsi="Cambria Math"/>
+                    </w:rPr>
+                    <m:t xml:space="preserve"> + a</m:t>
+                  </m:r>
+                </m:e>
+              </m:d>
             </m:e>
-          </m:d>
+          </m:nary>
         </m:oMath>
       </m:oMathPara>
     </w:p>
-    <w:p/>
     <w:sectPr>
       <w:pgSz w:w="11906" w:h="16838" w:code="9"/>
       <w:pgMar w:top="1701" w:right="2268" w:bottom="2268" w:left="1701" w:header="708" w:footer="708" w:gutter="0"/>

</xml_diff>

<commit_message>
Exponential of Delta Exponent Equation || (23:58 (W.I.B [Waktu Indonesia bagian Barat]), 31/03/2026), Batam, Kepulauan Riau Indonesia || Exponential of Delta Exponent Equation #LORDBLESSUS #LORDWITHUS #LORDGUARDUS
Exponential of Delta Exponent Equation || (23:58 (W.I.B [Waktu Indonesia bagian Barat]), 31/03/2026), Batam, Kepulauan Riau Indonesia || Exponential of Delta Exponent Equation #LORDBLESSUS #LORDWITHUS #LORDGUARDUS
</commit_message>
<xml_diff>
--- a/Exponential of Delta Exponent Equation.docx
+++ b/Exponential of Delta Exponent Equation.docx
@@ -1470,6 +1470,196 @@
           </m:nary>
         </m:oMath>
       </m:oMathPara>
+    </w:p>
+    <w:p>
+      <w:pPr>
+        <w:spacing w:line="360" w:lineRule="auto"/>
+        <w:jc w:val="center"/>
+        <w:rPr>
+          <w:rFonts w:ascii="Times New Roman" w:eastAsiaTheme="minorEastAsia" w:hAnsi="Times New Roman" w:cs="Times New Roman"/>
+          <w:sz w:val="24"/>
+          <w:szCs w:val="24"/>
+          <w:lang w:val="id-ID"/>
+        </w:rPr>
+      </w:pPr>
+    </w:p>
+    <w:p>
+      <w:pPr>
+        <w:spacing w:line="360" w:lineRule="auto"/>
+        <w:jc w:val="center"/>
+        <w:rPr>
+          <w:rFonts w:eastAsiaTheme="minorEastAsia"/>
+        </w:rPr>
+      </w:pPr>
+      <m:oMathPara>
+        <m:oMath>
+          <m:d>
+            <m:dPr>
+              <m:ctrlPr>
+                <w:rPr>
+                  <w:rFonts w:ascii="Cambria Math" w:eastAsiaTheme="minorEastAsia" w:hAnsi="Cambria Math" w:cs="Times New Roman"/>
+                  <w:i/>
+                </w:rPr>
+              </m:ctrlPr>
+            </m:dPr>
+            <m:e>
+              <m:sSup>
+                <m:sSupPr>
+                  <m:ctrlPr>
+                    <w:rPr>
+                      <w:rFonts w:ascii="Cambria Math" w:hAnsi="Cambria Math"/>
+                      <w:i/>
+                    </w:rPr>
+                  </m:ctrlPr>
+                </m:sSupPr>
+                <m:e>
+                  <m:d>
+                    <m:dPr>
+                      <m:ctrlPr>
+                        <w:rPr>
+                          <w:rFonts w:ascii="Cambria Math" w:hAnsi="Cambria Math"/>
+                          <w:i/>
+                        </w:rPr>
+                      </m:ctrlPr>
+                    </m:dPr>
+                    <m:e>
+                      <m:r>
+                        <w:rPr>
+                          <w:rFonts w:ascii="Cambria Math" w:hAnsi="Cambria Math"/>
+                        </w:rPr>
+                        <m:t>x+1</m:t>
+                      </m:r>
+                    </m:e>
+                  </m:d>
+                </m:e>
+                <m:sup>
+                  <m:r>
+                    <w:rPr>
+                      <w:rFonts w:ascii="Cambria Math" w:hAnsi="Cambria Math"/>
+                    </w:rPr>
+                    <m:t>n</m:t>
+                  </m:r>
+                </m:sup>
+              </m:sSup>
+              <m:r>
+                <w:rPr>
+                  <w:rFonts w:ascii="Cambria Math" w:hAnsi="Cambria Math"/>
+                </w:rPr>
+                <m:t xml:space="preserve"> - </m:t>
+              </m:r>
+              <m:sSup>
+                <m:sSupPr>
+                  <m:ctrlPr>
+                    <w:rPr>
+                      <w:rFonts w:ascii="Cambria Math" w:eastAsiaTheme="minorEastAsia" w:hAnsi="Cambria Math" w:cs="Times New Roman"/>
+                      <w:i/>
+                    </w:rPr>
+                  </m:ctrlPr>
+                </m:sSupPr>
+                <m:e>
+                  <m:r>
+                    <w:rPr>
+                      <w:rFonts w:ascii="Cambria Math" w:eastAsiaTheme="minorEastAsia" w:hAnsi="Cambria Math" w:cs="Times New Roman"/>
+                    </w:rPr>
+                    <m:t>x</m:t>
+                  </m:r>
+                </m:e>
+                <m:sup>
+                  <m:r>
+                    <w:rPr>
+                      <w:rFonts w:ascii="Cambria Math" w:eastAsiaTheme="minorEastAsia" w:hAnsi="Cambria Math" w:cs="Times New Roman"/>
+                    </w:rPr>
+                    <m:t>n</m:t>
+                  </m:r>
+                </m:sup>
+              </m:sSup>
+            </m:e>
+          </m:d>
+          <m:r>
+            <w:rPr>
+              <w:rFonts w:ascii="Cambria Math" w:hAnsi="Cambria Math"/>
+            </w:rPr>
+            <m:t xml:space="preserve"> = </m:t>
+          </m:r>
+          <m:d>
+            <m:dPr>
+              <m:ctrlPr>
+                <w:rPr>
+                  <w:rFonts w:ascii="Cambria Math" w:hAnsi="Cambria Math"/>
+                  <w:i/>
+                </w:rPr>
+              </m:ctrlPr>
+            </m:dPr>
+            <m:e>
+              <m:sSup>
+                <m:sSupPr>
+                  <m:ctrlPr>
+                    <w:rPr>
+                      <w:rFonts w:ascii="Cambria Math" w:hAnsi="Cambria Math"/>
+                      <w:i/>
+                    </w:rPr>
+                  </m:ctrlPr>
+                </m:sSupPr>
+                <m:e>
+                  <m:r>
+                    <w:rPr>
+                      <w:rFonts w:ascii="Cambria Math" w:hAnsi="Cambria Math"/>
+                    </w:rPr>
+                    <m:t>a</m:t>
+                  </m:r>
+                </m:e>
+                <m:sup>
+                  <m:r>
+                    <w:rPr>
+                      <w:rFonts w:ascii="Cambria Math" w:hAnsi="Cambria Math"/>
+                    </w:rPr>
+                    <m:t>2</m:t>
+                  </m:r>
+                </m:sup>
+              </m:sSup>
+              <m:r>
+                <w:rPr>
+                  <w:rFonts w:ascii="Cambria Math" w:hAnsi="Cambria Math"/>
+                </w:rPr>
+                <m:t xml:space="preserve"> + </m:t>
+              </m:r>
+              <m:d>
+                <m:dPr>
+                  <m:ctrlPr>
+                    <w:rPr>
+                      <w:rFonts w:ascii="Cambria Math" w:hAnsi="Cambria Math"/>
+                      <w:i/>
+                    </w:rPr>
+                  </m:ctrlPr>
+                </m:dPr>
+                <m:e>
+                  <m:r>
+                    <w:rPr>
+                      <w:rFonts w:ascii="Cambria Math" w:hAnsi="Cambria Math"/>
+                    </w:rPr>
+                    <m:t>x × a</m:t>
+                  </m:r>
+                </m:e>
+              </m:d>
+              <m:r>
+                <w:rPr>
+                  <w:rFonts w:ascii="Cambria Math" w:hAnsi="Cambria Math"/>
+                </w:rPr>
+                <m:t xml:space="preserve"> + a</m:t>
+              </m:r>
+            </m:e>
+          </m:d>
+        </m:oMath>
+      </m:oMathPara>
+    </w:p>
+    <w:p>
+      <w:pPr>
+        <w:spacing w:line="360" w:lineRule="auto"/>
+        <w:jc w:val="center"/>
+        <w:rPr>
+          <w:rFonts w:eastAsiaTheme="minorEastAsia"/>
+        </w:rPr>
+      </w:pPr>
     </w:p>
     <w:sectPr>
       <w:pgSz w:w="11906" w:h="16838" w:code="9"/>

</xml_diff>

<commit_message>
Exponential of Delta Exponent Equation || (00:54 (W.I.B [Waktu Indonesia bagian Barat]), 31/03/2026), Batam, Kepulauan Riau Indonesia || Exponential of Delta Exponent Equation #LORDBLESSUS #LORDWITHUS #LORDGUARDUS
Exponential of Delta Exponent Equation || (00:54 (W.I.B [Waktu Indonesia bagian Barat]), 31/03/2026), Batam, Kepulauan Riau Indonesia || Exponential of Delta Exponent Equation #LORDBLESSUS #LORDWITHUS #LORDGUARDUS
</commit_message>
<xml_diff>
--- a/Exponential of Delta Exponent Equation.docx
+++ b/Exponential of Delta Exponent Equation.docx
@@ -33,7 +33,6 @@
           <w:lang w:val="id-ID"/>
         </w:rPr>
       </w:pPr>
-      <w:proofErr w:type="spellStart"/>
       <w:r>
         <w:rPr>
           <w:rFonts w:ascii="Times New Roman" w:eastAsiaTheme="minorEastAsia" w:hAnsi="Times New Roman" w:cs="Times New Roman"/>
@@ -41,37 +40,7 @@
           <w:szCs w:val="24"/>
           <w:lang w:val="id-ID"/>
         </w:rPr>
-        <w:t>by</w:t>
-      </w:r>
-      <w:proofErr w:type="spellEnd"/>
-      <w:r>
-        <w:rPr>
-          <w:rFonts w:ascii="Times New Roman" w:eastAsiaTheme="minorEastAsia" w:hAnsi="Times New Roman" w:cs="Times New Roman"/>
-          <w:sz w:val="24"/>
-          <w:szCs w:val="24"/>
-          <w:lang w:val="id-ID"/>
-        </w:rPr>
-        <w:t xml:space="preserve"> : Samuel Hasiholan Omega Purba, S. </w:t>
-      </w:r>
-      <w:proofErr w:type="spellStart"/>
-      <w:r>
-        <w:rPr>
-          <w:rFonts w:ascii="Times New Roman" w:eastAsiaTheme="minorEastAsia" w:hAnsi="Times New Roman" w:cs="Times New Roman"/>
-          <w:sz w:val="24"/>
-          <w:szCs w:val="24"/>
-          <w:lang w:val="id-ID"/>
-        </w:rPr>
-        <w:t>Tr</w:t>
-      </w:r>
-      <w:proofErr w:type="spellEnd"/>
-      <w:r>
-        <w:rPr>
-          <w:rFonts w:ascii="Times New Roman" w:eastAsiaTheme="minorEastAsia" w:hAnsi="Times New Roman" w:cs="Times New Roman"/>
-          <w:sz w:val="24"/>
-          <w:szCs w:val="24"/>
-          <w:lang w:val="id-ID"/>
-        </w:rPr>
-        <w:t>. T.</w:t>
+        <w:t>by : Samuel Hasiholan Omega Purba, S. Tr. T.</w:t>
       </w:r>
     </w:p>
     <w:p>
@@ -106,7 +75,6 @@
           <w:lang w:val="id-ID"/>
         </w:rPr>
       </w:pPr>
-      <w:proofErr w:type="spellStart"/>
       <w:r>
         <w:rPr>
           <w:rFonts w:ascii="Times New Roman" w:eastAsiaTheme="minorEastAsia" w:hAnsi="Times New Roman" w:cs="Times New Roman"/>
@@ -114,17 +82,7 @@
           <w:szCs w:val="24"/>
           <w:lang w:val="id-ID"/>
         </w:rPr>
-        <w:t>Prodi</w:t>
-      </w:r>
-      <w:proofErr w:type="spellEnd"/>
-      <w:r>
-        <w:rPr>
-          <w:rFonts w:ascii="Times New Roman" w:eastAsiaTheme="minorEastAsia" w:hAnsi="Times New Roman" w:cs="Times New Roman"/>
-          <w:sz w:val="24"/>
-          <w:szCs w:val="24"/>
-          <w:lang w:val="id-ID"/>
-        </w:rPr>
-        <w:t xml:space="preserve"> Teknik Robotika dan Kecerdasan buatan</w:t>
+        <w:t>Prodi Teknik Robotika dan Kecerdasan buatan</w:t>
       </w:r>
     </w:p>
     <w:p>
@@ -1637,7 +1595,25 @@
                     <w:rPr>
                       <w:rFonts w:ascii="Cambria Math" w:hAnsi="Cambria Math"/>
                     </w:rPr>
-                    <m:t>x × a</m:t>
+                    <m:t>2</m:t>
+                  </m:r>
+                  <m:r>
+                    <w:rPr>
+                      <w:rFonts w:ascii="Cambria Math" w:hAnsi="Cambria Math"/>
+                    </w:rPr>
+                    <m:t xml:space="preserve"> × </m:t>
+                  </m:r>
+                  <m:r>
+                    <w:rPr>
+                      <w:rFonts w:ascii="Cambria Math" w:hAnsi="Cambria Math"/>
+                    </w:rPr>
+                    <m:t xml:space="preserve">x × </m:t>
+                  </m:r>
+                  <m:r>
+                    <w:rPr>
+                      <w:rFonts w:ascii="Cambria Math" w:hAnsi="Cambria Math"/>
+                    </w:rPr>
+                    <m:t>a</m:t>
                   </m:r>
                 </m:e>
               </m:d>
@@ -1645,8 +1621,40 @@
                 <w:rPr>
                   <w:rFonts w:ascii="Cambria Math" w:hAnsi="Cambria Math"/>
                 </w:rPr>
-                <m:t xml:space="preserve"> + a</m:t>
+                <m:t xml:space="preserve"> -</m:t>
               </m:r>
+              <m:r>
+                <w:rPr>
+                  <w:rFonts w:ascii="Cambria Math" w:hAnsi="Cambria Math"/>
+                </w:rPr>
+                <m:t xml:space="preserve"> </m:t>
+              </m:r>
+              <m:sSup>
+                <m:sSupPr>
+                  <m:ctrlPr>
+                    <w:rPr>
+                      <w:rFonts w:ascii="Cambria Math" w:hAnsi="Cambria Math"/>
+                      <w:i/>
+                    </w:rPr>
+                  </m:ctrlPr>
+                </m:sSupPr>
+                <m:e>
+                  <m:r>
+                    <w:rPr>
+                      <w:rFonts w:ascii="Cambria Math" w:hAnsi="Cambria Math"/>
+                    </w:rPr>
+                    <m:t>x</m:t>
+                  </m:r>
+                </m:e>
+                <m:sup>
+                  <m:r>
+                    <w:rPr>
+                      <w:rFonts w:ascii="Cambria Math" w:hAnsi="Cambria Math"/>
+                    </w:rPr>
+                    <m:t>2</m:t>
+                  </m:r>
+                </m:sup>
+              </m:sSup>
             </m:e>
           </m:d>
         </m:oMath>

</xml_diff>

<commit_message>
Exponential of Delta Exponent Equation || (13:41 (W.I.B [Waktu Indonesia bagian Barat]), 02/04/2026), Batam, Kepulauan Riau Indonesia || Exponential of Delta Exponent Equation #LORDBLESSUS #LORDWITHUS #LORDGUARDUS
Exponential of Delta Exponent Equation || (13:41 (W.I.B [Waktu Indonesia bagian Barat]), 02/04/2026), Batam, Kepulauan Riau Indonesia || Exponential of Delta Exponent Equation #LORDBLESSUS #LORDWITHUS #LORDGUARDUS
</commit_message>
<xml_diff>
--- a/Exponential of Delta Exponent Equation.docx
+++ b/Exponential of Delta Exponent Equation.docx
@@ -33,6 +33,7 @@
           <w:lang w:val="id-ID"/>
         </w:rPr>
       </w:pPr>
+      <w:proofErr w:type="spellStart"/>
       <w:r>
         <w:rPr>
           <w:rFonts w:ascii="Times New Roman" w:eastAsiaTheme="minorEastAsia" w:hAnsi="Times New Roman" w:cs="Times New Roman"/>
@@ -40,7 +41,37 @@
           <w:szCs w:val="24"/>
           <w:lang w:val="id-ID"/>
         </w:rPr>
-        <w:t>by : Samuel Hasiholan Omega Purba, S. Tr. T.</w:t>
+        <w:t>by</w:t>
+      </w:r>
+      <w:proofErr w:type="spellEnd"/>
+      <w:r>
+        <w:rPr>
+          <w:rFonts w:ascii="Times New Roman" w:eastAsiaTheme="minorEastAsia" w:hAnsi="Times New Roman" w:cs="Times New Roman"/>
+          <w:sz w:val="24"/>
+          <w:szCs w:val="24"/>
+          <w:lang w:val="id-ID"/>
+        </w:rPr>
+        <w:t xml:space="preserve"> : Samuel Hasiholan Omega Purba, S. </w:t>
+      </w:r>
+      <w:proofErr w:type="spellStart"/>
+      <w:r>
+        <w:rPr>
+          <w:rFonts w:ascii="Times New Roman" w:eastAsiaTheme="minorEastAsia" w:hAnsi="Times New Roman" w:cs="Times New Roman"/>
+          <w:sz w:val="24"/>
+          <w:szCs w:val="24"/>
+          <w:lang w:val="id-ID"/>
+        </w:rPr>
+        <w:t>Tr</w:t>
+      </w:r>
+      <w:proofErr w:type="spellEnd"/>
+      <w:r>
+        <w:rPr>
+          <w:rFonts w:ascii="Times New Roman" w:eastAsiaTheme="minorEastAsia" w:hAnsi="Times New Roman" w:cs="Times New Roman"/>
+          <w:sz w:val="24"/>
+          <w:szCs w:val="24"/>
+          <w:lang w:val="id-ID"/>
+        </w:rPr>
+        <w:t>. T.</w:t>
       </w:r>
     </w:p>
     <w:p>
@@ -75,6 +106,7 @@
           <w:lang w:val="id-ID"/>
         </w:rPr>
       </w:pPr>
+      <w:proofErr w:type="spellStart"/>
       <w:r>
         <w:rPr>
           <w:rFonts w:ascii="Times New Roman" w:eastAsiaTheme="minorEastAsia" w:hAnsi="Times New Roman" w:cs="Times New Roman"/>
@@ -82,7 +114,17 @@
           <w:szCs w:val="24"/>
           <w:lang w:val="id-ID"/>
         </w:rPr>
-        <w:t>Prodi Teknik Robotika dan Kecerdasan buatan</w:t>
+        <w:t>Prodi</w:t>
+      </w:r>
+      <w:proofErr w:type="spellEnd"/>
+      <w:r>
+        <w:rPr>
+          <w:rFonts w:ascii="Times New Roman" w:eastAsiaTheme="minorEastAsia" w:hAnsi="Times New Roman" w:cs="Times New Roman"/>
+          <w:sz w:val="24"/>
+          <w:szCs w:val="24"/>
+          <w:lang w:val="id-ID"/>
+        </w:rPr>
+        <w:t xml:space="preserve"> Teknik Robotika dan Kecerdasan buatan</w:t>
       </w:r>
     </w:p>
     <w:p>
@@ -431,1025 +473,6 @@
         </w:rPr>
       </w:pPr>
       <m:oMathPara>
-        <m:oMathParaPr>
-          <m:jc m:val="center"/>
-        </m:oMathParaPr>
-        <m:oMath>
-          <m:nary>
-            <m:naryPr>
-              <m:chr m:val="∑"/>
-              <m:limLoc m:val="undOvr"/>
-              <m:ctrlPr>
-                <w:rPr>
-                  <w:rFonts w:ascii="Cambria Math" w:eastAsiaTheme="minorEastAsia" w:hAnsi="Cambria Math" w:cs="Times New Roman"/>
-                  <w:i/>
-                </w:rPr>
-              </m:ctrlPr>
-            </m:naryPr>
-            <m:sub>
-              <m:d>
-                <m:dPr>
-                  <m:ctrlPr>
-                    <w:rPr>
-                      <w:rFonts w:ascii="Cambria Math" w:eastAsiaTheme="minorEastAsia" w:hAnsi="Cambria Math" w:cs="Times New Roman"/>
-                      <w:i/>
-                    </w:rPr>
-                  </m:ctrlPr>
-                </m:dPr>
-                <m:e>
-                  <m:r>
-                    <w:rPr>
-                      <w:rFonts w:ascii="Cambria Math" w:eastAsiaTheme="minorEastAsia" w:hAnsi="Cambria Math" w:cs="Times New Roman"/>
-                    </w:rPr>
-                    <m:t>x + 1</m:t>
-                  </m:r>
-                </m:e>
-              </m:d>
-            </m:sub>
-            <m:sup>
-              <m:d>
-                <m:dPr>
-                  <m:ctrlPr>
-                    <w:rPr>
-                      <w:rFonts w:ascii="Cambria Math" w:eastAsiaTheme="minorEastAsia" w:hAnsi="Cambria Math" w:cs="Times New Roman"/>
-                      <w:i/>
-                    </w:rPr>
-                  </m:ctrlPr>
-                </m:dPr>
-                <m:e>
-                  <m:r>
-                    <w:rPr>
-                      <w:rFonts w:ascii="Cambria Math" w:eastAsiaTheme="minorEastAsia" w:hAnsi="Cambria Math" w:cs="Times New Roman"/>
-                    </w:rPr>
-                    <m:t>n → ∞</m:t>
-                  </m:r>
-                </m:e>
-              </m:d>
-            </m:sup>
-            <m:e>
-              <m:d>
-                <m:dPr>
-                  <m:ctrlPr>
-                    <w:rPr>
-                      <w:rFonts w:ascii="Cambria Math" w:eastAsiaTheme="minorEastAsia" w:hAnsi="Cambria Math" w:cs="Times New Roman"/>
-                      <w:i/>
-                    </w:rPr>
-                  </m:ctrlPr>
-                </m:dPr>
-                <m:e>
-                  <m:sSup>
-                    <m:sSupPr>
-                      <m:ctrlPr>
-                        <w:rPr>
-                          <w:rFonts w:ascii="Cambria Math" w:hAnsi="Cambria Math"/>
-                          <w:i/>
-                        </w:rPr>
-                      </m:ctrlPr>
-                    </m:sSupPr>
-                    <m:e>
-                      <m:d>
-                        <m:dPr>
-                          <m:ctrlPr>
-                            <w:rPr>
-                              <w:rFonts w:ascii="Cambria Math" w:hAnsi="Cambria Math"/>
-                              <w:i/>
-                            </w:rPr>
-                          </m:ctrlPr>
-                        </m:dPr>
-                        <m:e>
-                          <m:r>
-                            <w:rPr>
-                              <w:rFonts w:ascii="Cambria Math" w:hAnsi="Cambria Math"/>
-                            </w:rPr>
-                            <m:t>x+1</m:t>
-                          </m:r>
-                        </m:e>
-                      </m:d>
-                    </m:e>
-                    <m:sup>
-                      <m:r>
-                        <w:rPr>
-                          <w:rFonts w:ascii="Cambria Math" w:hAnsi="Cambria Math"/>
-                        </w:rPr>
-                        <m:t>n</m:t>
-                      </m:r>
-                    </m:sup>
-                  </m:sSup>
-                  <m:r>
-                    <w:rPr>
-                      <w:rFonts w:ascii="Cambria Math" w:hAnsi="Cambria Math"/>
-                    </w:rPr>
-                    <m:t xml:space="preserve"> - </m:t>
-                  </m:r>
-                  <m:sSup>
-                    <m:sSupPr>
-                      <m:ctrlPr>
-                        <w:rPr>
-                          <w:rFonts w:ascii="Cambria Math" w:eastAsiaTheme="minorEastAsia" w:hAnsi="Cambria Math" w:cs="Times New Roman"/>
-                          <w:i/>
-                        </w:rPr>
-                      </m:ctrlPr>
-                    </m:sSupPr>
-                    <m:e>
-                      <m:r>
-                        <w:rPr>
-                          <w:rFonts w:ascii="Cambria Math" w:eastAsiaTheme="minorEastAsia" w:hAnsi="Cambria Math" w:cs="Times New Roman"/>
-                        </w:rPr>
-                        <m:t>x</m:t>
-                      </m:r>
-                    </m:e>
-                    <m:sup>
-                      <m:r>
-                        <w:rPr>
-                          <w:rFonts w:ascii="Cambria Math" w:eastAsiaTheme="minorEastAsia" w:hAnsi="Cambria Math" w:cs="Times New Roman"/>
-                        </w:rPr>
-                        <m:t>n</m:t>
-                      </m:r>
-                    </m:sup>
-                  </m:sSup>
-                </m:e>
-              </m:d>
-            </m:e>
-          </m:nary>
-          <m:r>
-            <w:rPr>
-              <w:rFonts w:ascii="Cambria Math" w:hAnsi="Cambria Math"/>
-            </w:rPr>
-            <m:t xml:space="preserve"> = </m:t>
-          </m:r>
-          <m:nary>
-            <m:naryPr>
-              <m:chr m:val="∑"/>
-              <m:limLoc m:val="undOvr"/>
-              <m:supHide m:val="1"/>
-              <m:ctrlPr>
-                <w:rPr>
-                  <w:rFonts w:ascii="Cambria Math" w:hAnsi="Cambria Math"/>
-                  <w:i/>
-                </w:rPr>
-              </m:ctrlPr>
-            </m:naryPr>
-            <m:sub>
-              <m:d>
-                <m:dPr>
-                  <m:ctrlPr>
-                    <w:rPr>
-                      <w:rFonts w:ascii="Cambria Math" w:hAnsi="Cambria Math"/>
-                      <w:i/>
-                    </w:rPr>
-                  </m:ctrlPr>
-                </m:dPr>
-                <m:e>
-                  <m:r>
-                    <w:rPr>
-                      <w:rFonts w:ascii="Cambria Math" w:hAnsi="Cambria Math"/>
-                    </w:rPr>
-                    <m:t>x + 1</m:t>
-                  </m:r>
-                </m:e>
-              </m:d>
-            </m:sub>
-            <m:sup/>
-            <m:e>
-              <m:d>
-                <m:dPr>
-                  <m:ctrlPr>
-                    <w:rPr>
-                      <w:rFonts w:ascii="Cambria Math" w:hAnsi="Cambria Math"/>
-                      <w:i/>
-                    </w:rPr>
-                  </m:ctrlPr>
-                </m:dPr>
-                <m:e>
-                  <m:d>
-                    <m:dPr>
-                      <m:ctrlPr>
-                        <w:rPr>
-                          <w:rFonts w:ascii="Cambria Math" w:hAnsi="Cambria Math"/>
-                          <w:i/>
-                        </w:rPr>
-                      </m:ctrlPr>
-                    </m:dPr>
-                    <m:e>
-                      <m:r>
-                        <w:rPr>
-                          <w:rFonts w:ascii="Cambria Math" w:hAnsi="Cambria Math"/>
-                        </w:rPr>
-                        <m:t>2 × x</m:t>
-                      </m:r>
-                    </m:e>
-                  </m:d>
-                  <m:r>
-                    <w:rPr>
-                      <w:rFonts w:ascii="Cambria Math" w:hAnsi="Cambria Math"/>
-                    </w:rPr>
-                    <m:t xml:space="preserve"> + 1</m:t>
-                  </m:r>
-                </m:e>
-              </m:d>
-            </m:e>
-          </m:nary>
-        </m:oMath>
-      </m:oMathPara>
-    </w:p>
-    <w:p>
-      <w:pPr>
-        <w:spacing w:line="360" w:lineRule="auto"/>
-        <w:jc w:val="center"/>
-        <w:rPr>
-          <w:rFonts w:ascii="Times New Roman" w:eastAsiaTheme="minorEastAsia" w:hAnsi="Times New Roman" w:cs="Times New Roman"/>
-          <w:sz w:val="24"/>
-          <w:szCs w:val="24"/>
-          <w:lang w:val="id-ID"/>
-        </w:rPr>
-      </w:pPr>
-    </w:p>
-    <w:p>
-      <w:pPr>
-        <w:spacing w:line="360" w:lineRule="auto"/>
-        <w:jc w:val="center"/>
-        <w:rPr>
-          <w:rFonts w:eastAsiaTheme="minorEastAsia"/>
-        </w:rPr>
-      </w:pPr>
-      <m:oMathPara>
-        <m:oMathParaPr>
-          <m:jc m:val="center"/>
-        </m:oMathParaPr>
-        <m:oMath>
-          <m:nary>
-            <m:naryPr>
-              <m:chr m:val="∑"/>
-              <m:limLoc m:val="undOvr"/>
-              <m:ctrlPr>
-                <w:rPr>
-                  <w:rFonts w:ascii="Cambria Math" w:eastAsiaTheme="minorEastAsia" w:hAnsi="Cambria Math" w:cs="Times New Roman"/>
-                  <w:i/>
-                </w:rPr>
-              </m:ctrlPr>
-            </m:naryPr>
-            <m:sub>
-              <m:d>
-                <m:dPr>
-                  <m:ctrlPr>
-                    <w:rPr>
-                      <w:rFonts w:ascii="Cambria Math" w:eastAsiaTheme="minorEastAsia" w:hAnsi="Cambria Math" w:cs="Times New Roman"/>
-                      <w:i/>
-                    </w:rPr>
-                  </m:ctrlPr>
-                </m:dPr>
-                <m:e>
-                  <m:r>
-                    <w:rPr>
-                      <w:rFonts w:ascii="Cambria Math" w:eastAsiaTheme="minorEastAsia" w:hAnsi="Cambria Math" w:cs="Times New Roman"/>
-                    </w:rPr>
-                    <m:t>x + a</m:t>
-                  </m:r>
-                </m:e>
-              </m:d>
-            </m:sub>
-            <m:sup>
-              <m:d>
-                <m:dPr>
-                  <m:ctrlPr>
-                    <w:rPr>
-                      <w:rFonts w:ascii="Cambria Math" w:eastAsiaTheme="minorEastAsia" w:hAnsi="Cambria Math" w:cs="Times New Roman"/>
-                      <w:i/>
-                    </w:rPr>
-                  </m:ctrlPr>
-                </m:dPr>
-                <m:e>
-                  <m:r>
-                    <w:rPr>
-                      <w:rFonts w:ascii="Cambria Math" w:eastAsiaTheme="minorEastAsia" w:hAnsi="Cambria Math" w:cs="Times New Roman"/>
-                    </w:rPr>
-                    <m:t>n → ∞</m:t>
-                  </m:r>
-                </m:e>
-              </m:d>
-            </m:sup>
-            <m:e>
-              <m:d>
-                <m:dPr>
-                  <m:ctrlPr>
-                    <w:rPr>
-                      <w:rFonts w:ascii="Cambria Math" w:eastAsiaTheme="minorEastAsia" w:hAnsi="Cambria Math" w:cs="Times New Roman"/>
-                      <w:i/>
-                    </w:rPr>
-                  </m:ctrlPr>
-                </m:dPr>
-                <m:e>
-                  <m:sSup>
-                    <m:sSupPr>
-                      <m:ctrlPr>
-                        <w:rPr>
-                          <w:rFonts w:ascii="Cambria Math" w:hAnsi="Cambria Math"/>
-                          <w:i/>
-                        </w:rPr>
-                      </m:ctrlPr>
-                    </m:sSupPr>
-                    <m:e>
-                      <m:d>
-                        <m:dPr>
-                          <m:ctrlPr>
-                            <w:rPr>
-                              <w:rFonts w:ascii="Cambria Math" w:hAnsi="Cambria Math"/>
-                              <w:i/>
-                            </w:rPr>
-                          </m:ctrlPr>
-                        </m:dPr>
-                        <m:e>
-                          <m:r>
-                            <w:rPr>
-                              <w:rFonts w:ascii="Cambria Math" w:hAnsi="Cambria Math"/>
-                            </w:rPr>
-                            <m:t>x+1</m:t>
-                          </m:r>
-                        </m:e>
-                      </m:d>
-                    </m:e>
-                    <m:sup>
-                      <m:r>
-                        <w:rPr>
-                          <w:rFonts w:ascii="Cambria Math" w:hAnsi="Cambria Math"/>
-                        </w:rPr>
-                        <m:t>n</m:t>
-                      </m:r>
-                    </m:sup>
-                  </m:sSup>
-                  <m:r>
-                    <w:rPr>
-                      <w:rFonts w:ascii="Cambria Math" w:hAnsi="Cambria Math"/>
-                    </w:rPr>
-                    <m:t xml:space="preserve"> - </m:t>
-                  </m:r>
-                  <m:sSup>
-                    <m:sSupPr>
-                      <m:ctrlPr>
-                        <w:rPr>
-                          <w:rFonts w:ascii="Cambria Math" w:eastAsiaTheme="minorEastAsia" w:hAnsi="Cambria Math" w:cs="Times New Roman"/>
-                          <w:i/>
-                        </w:rPr>
-                      </m:ctrlPr>
-                    </m:sSupPr>
-                    <m:e>
-                      <m:r>
-                        <w:rPr>
-                          <w:rFonts w:ascii="Cambria Math" w:eastAsiaTheme="minorEastAsia" w:hAnsi="Cambria Math" w:cs="Times New Roman"/>
-                        </w:rPr>
-                        <m:t>x</m:t>
-                      </m:r>
-                    </m:e>
-                    <m:sup>
-                      <m:r>
-                        <w:rPr>
-                          <w:rFonts w:ascii="Cambria Math" w:eastAsiaTheme="minorEastAsia" w:hAnsi="Cambria Math" w:cs="Times New Roman"/>
-                        </w:rPr>
-                        <m:t>n</m:t>
-                      </m:r>
-                    </m:sup>
-                  </m:sSup>
-                </m:e>
-              </m:d>
-            </m:e>
-          </m:nary>
-          <m:r>
-            <w:rPr>
-              <w:rFonts w:ascii="Cambria Math" w:hAnsi="Cambria Math"/>
-            </w:rPr>
-            <m:t xml:space="preserve"> = </m:t>
-          </m:r>
-          <m:nary>
-            <m:naryPr>
-              <m:chr m:val="∑"/>
-              <m:limLoc m:val="undOvr"/>
-              <m:supHide m:val="1"/>
-              <m:ctrlPr>
-                <w:rPr>
-                  <w:rFonts w:ascii="Cambria Math" w:hAnsi="Cambria Math"/>
-                  <w:i/>
-                </w:rPr>
-              </m:ctrlPr>
-            </m:naryPr>
-            <m:sub>
-              <m:d>
-                <m:dPr>
-                  <m:ctrlPr>
-                    <w:rPr>
-                      <w:rFonts w:ascii="Cambria Math" w:hAnsi="Cambria Math"/>
-                      <w:i/>
-                    </w:rPr>
-                  </m:ctrlPr>
-                </m:dPr>
-                <m:e>
-                  <m:r>
-                    <w:rPr>
-                      <w:rFonts w:ascii="Cambria Math" w:hAnsi="Cambria Math"/>
-                    </w:rPr>
-                    <m:t>x + a</m:t>
-                  </m:r>
-                </m:e>
-              </m:d>
-            </m:sub>
-            <m:sup/>
-            <m:e>
-              <m:d>
-                <m:dPr>
-                  <m:begChr m:val="{"/>
-                  <m:endChr m:val="}"/>
-                  <m:ctrlPr>
-                    <w:rPr>
-                      <w:rFonts w:ascii="Cambria Math" w:hAnsi="Cambria Math"/>
-                      <w:i/>
-                    </w:rPr>
-                  </m:ctrlPr>
-                </m:dPr>
-                <m:e>
-                  <m:d>
-                    <m:dPr>
-                      <m:ctrlPr>
-                        <w:rPr>
-                          <w:rFonts w:ascii="Cambria Math" w:hAnsi="Cambria Math"/>
-                          <w:i/>
-                        </w:rPr>
-                      </m:ctrlPr>
-                    </m:dPr>
-                    <m:e>
-                      <m:r>
-                        <w:rPr>
-                          <w:rFonts w:ascii="Cambria Math" w:hAnsi="Cambria Math"/>
-                        </w:rPr>
-                        <m:t>x × a</m:t>
-                      </m:r>
-                    </m:e>
-                  </m:d>
-                  <m:r>
-                    <w:rPr>
-                      <w:rFonts w:ascii="Cambria Math" w:hAnsi="Cambria Math"/>
-                    </w:rPr>
-                    <m:t>+ a</m:t>
-                  </m:r>
-                </m:e>
-              </m:d>
-            </m:e>
-          </m:nary>
-        </m:oMath>
-      </m:oMathPara>
-    </w:p>
-    <w:p>
-      <w:pPr>
-        <w:spacing w:line="360" w:lineRule="auto"/>
-        <w:jc w:val="center"/>
-        <w:rPr>
-          <w:rFonts w:ascii="Times New Roman" w:eastAsiaTheme="minorEastAsia" w:hAnsi="Times New Roman" w:cs="Times New Roman"/>
-          <w:sz w:val="24"/>
-          <w:szCs w:val="24"/>
-          <w:lang w:val="id-ID"/>
-        </w:rPr>
-      </w:pPr>
-    </w:p>
-    <w:p>
-      <w:pPr>
-        <w:spacing w:line="360" w:lineRule="auto"/>
-        <w:jc w:val="center"/>
-        <w:rPr>
-          <w:rFonts w:eastAsiaTheme="minorEastAsia"/>
-        </w:rPr>
-      </w:pPr>
-      <m:oMathPara>
-        <m:oMathParaPr>
-          <m:jc m:val="center"/>
-        </m:oMathParaPr>
-        <m:oMath>
-          <m:nary>
-            <m:naryPr>
-              <m:chr m:val="∑"/>
-              <m:limLoc m:val="undOvr"/>
-              <m:ctrlPr>
-                <w:rPr>
-                  <w:rFonts w:ascii="Cambria Math" w:eastAsiaTheme="minorEastAsia" w:hAnsi="Cambria Math" w:cs="Times New Roman"/>
-                  <w:i/>
-                </w:rPr>
-              </m:ctrlPr>
-            </m:naryPr>
-            <m:sub>
-              <m:d>
-                <m:dPr>
-                  <m:ctrlPr>
-                    <w:rPr>
-                      <w:rFonts w:ascii="Cambria Math" w:eastAsiaTheme="minorEastAsia" w:hAnsi="Cambria Math" w:cs="Times New Roman"/>
-                      <w:i/>
-                    </w:rPr>
-                  </m:ctrlPr>
-                </m:dPr>
-                <m:e>
-                  <m:r>
-                    <w:rPr>
-                      <w:rFonts w:ascii="Cambria Math" w:eastAsiaTheme="minorEastAsia" w:hAnsi="Cambria Math" w:cs="Times New Roman"/>
-                    </w:rPr>
-                    <m:t>x + a</m:t>
-                  </m:r>
-                </m:e>
-              </m:d>
-            </m:sub>
-            <m:sup>
-              <m:d>
-                <m:dPr>
-                  <m:ctrlPr>
-                    <w:rPr>
-                      <w:rFonts w:ascii="Cambria Math" w:eastAsiaTheme="minorEastAsia" w:hAnsi="Cambria Math" w:cs="Times New Roman"/>
-                      <w:i/>
-                    </w:rPr>
-                  </m:ctrlPr>
-                </m:dPr>
-                <m:e>
-                  <m:r>
-                    <w:rPr>
-                      <w:rFonts w:ascii="Cambria Math" w:eastAsiaTheme="minorEastAsia" w:hAnsi="Cambria Math" w:cs="Times New Roman"/>
-                    </w:rPr>
-                    <m:t>n → ∞</m:t>
-                  </m:r>
-                </m:e>
-              </m:d>
-            </m:sup>
-            <m:e>
-              <m:d>
-                <m:dPr>
-                  <m:ctrlPr>
-                    <w:rPr>
-                      <w:rFonts w:ascii="Cambria Math" w:eastAsiaTheme="minorEastAsia" w:hAnsi="Cambria Math" w:cs="Times New Roman"/>
-                      <w:i/>
-                    </w:rPr>
-                  </m:ctrlPr>
-                </m:dPr>
-                <m:e>
-                  <m:sSup>
-                    <m:sSupPr>
-                      <m:ctrlPr>
-                        <w:rPr>
-                          <w:rFonts w:ascii="Cambria Math" w:hAnsi="Cambria Math"/>
-                          <w:i/>
-                        </w:rPr>
-                      </m:ctrlPr>
-                    </m:sSupPr>
-                    <m:e>
-                      <m:d>
-                        <m:dPr>
-                          <m:ctrlPr>
-                            <w:rPr>
-                              <w:rFonts w:ascii="Cambria Math" w:hAnsi="Cambria Math"/>
-                              <w:i/>
-                            </w:rPr>
-                          </m:ctrlPr>
-                        </m:dPr>
-                        <m:e>
-                          <m:r>
-                            <w:rPr>
-                              <w:rFonts w:ascii="Cambria Math" w:hAnsi="Cambria Math"/>
-                            </w:rPr>
-                            <m:t>x+1</m:t>
-                          </m:r>
-                        </m:e>
-                      </m:d>
-                    </m:e>
-                    <m:sup>
-                      <m:r>
-                        <w:rPr>
-                          <w:rFonts w:ascii="Cambria Math" w:hAnsi="Cambria Math"/>
-                        </w:rPr>
-                        <m:t>n</m:t>
-                      </m:r>
-                    </m:sup>
-                  </m:sSup>
-                  <m:r>
-                    <w:rPr>
-                      <w:rFonts w:ascii="Cambria Math" w:hAnsi="Cambria Math"/>
-                    </w:rPr>
-                    <m:t xml:space="preserve"> - </m:t>
-                  </m:r>
-                  <m:sSup>
-                    <m:sSupPr>
-                      <m:ctrlPr>
-                        <w:rPr>
-                          <w:rFonts w:ascii="Cambria Math" w:eastAsiaTheme="minorEastAsia" w:hAnsi="Cambria Math" w:cs="Times New Roman"/>
-                          <w:i/>
-                        </w:rPr>
-                      </m:ctrlPr>
-                    </m:sSupPr>
-                    <m:e>
-                      <m:r>
-                        <w:rPr>
-                          <w:rFonts w:ascii="Cambria Math" w:eastAsiaTheme="minorEastAsia" w:hAnsi="Cambria Math" w:cs="Times New Roman"/>
-                        </w:rPr>
-                        <m:t>x</m:t>
-                      </m:r>
-                    </m:e>
-                    <m:sup>
-                      <m:r>
-                        <w:rPr>
-                          <w:rFonts w:ascii="Cambria Math" w:eastAsiaTheme="minorEastAsia" w:hAnsi="Cambria Math" w:cs="Times New Roman"/>
-                        </w:rPr>
-                        <m:t>n</m:t>
-                      </m:r>
-                    </m:sup>
-                  </m:sSup>
-                </m:e>
-              </m:d>
-            </m:e>
-          </m:nary>
-          <m:r>
-            <w:rPr>
-              <w:rFonts w:ascii="Cambria Math" w:hAnsi="Cambria Math"/>
-            </w:rPr>
-            <m:t xml:space="preserve"> = </m:t>
-          </m:r>
-          <m:nary>
-            <m:naryPr>
-              <m:chr m:val="∑"/>
-              <m:limLoc m:val="undOvr"/>
-              <m:supHide m:val="1"/>
-              <m:ctrlPr>
-                <w:rPr>
-                  <w:rFonts w:ascii="Cambria Math" w:hAnsi="Cambria Math"/>
-                  <w:i/>
-                </w:rPr>
-              </m:ctrlPr>
-            </m:naryPr>
-            <m:sub>
-              <m:d>
-                <m:dPr>
-                  <m:ctrlPr>
-                    <w:rPr>
-                      <w:rFonts w:ascii="Cambria Math" w:eastAsiaTheme="minorEastAsia" w:hAnsi="Cambria Math" w:cs="Times New Roman"/>
-                      <w:i/>
-                    </w:rPr>
-                  </m:ctrlPr>
-                </m:dPr>
-                <m:e>
-                  <m:r>
-                    <w:rPr>
-                      <w:rFonts w:ascii="Cambria Math" w:eastAsiaTheme="minorEastAsia" w:hAnsi="Cambria Math" w:cs="Times New Roman"/>
-                    </w:rPr>
-                    <m:t>x + a</m:t>
-                  </m:r>
-                </m:e>
-              </m:d>
-            </m:sub>
-            <m:sup/>
-            <m:e>
-              <m:d>
-                <m:dPr>
-                  <m:ctrlPr>
-                    <w:rPr>
-                      <w:rFonts w:ascii="Cambria Math" w:hAnsi="Cambria Math"/>
-                      <w:i/>
-                    </w:rPr>
-                  </m:ctrlPr>
-                </m:dPr>
-                <m:e>
-                  <m:d>
-                    <m:dPr>
-                      <m:begChr m:val="{"/>
-                      <m:endChr m:val="}"/>
-                      <m:ctrlPr>
-                        <w:rPr>
-                          <w:rFonts w:ascii="Cambria Math" w:hAnsi="Cambria Math"/>
-                          <w:i/>
-                        </w:rPr>
-                      </m:ctrlPr>
-                    </m:dPr>
-                    <m:e>
-                      <m:d>
-                        <m:dPr>
-                          <m:ctrlPr>
-                            <w:rPr>
-                              <w:rFonts w:ascii="Cambria Math" w:hAnsi="Cambria Math"/>
-                              <w:i/>
-                            </w:rPr>
-                          </m:ctrlPr>
-                        </m:dPr>
-                        <m:e>
-                          <m:r>
-                            <w:rPr>
-                              <w:rFonts w:ascii="Cambria Math" w:hAnsi="Cambria Math"/>
-                            </w:rPr>
-                            <m:t>x + a</m:t>
-                          </m:r>
-                        </m:e>
-                      </m:d>
-                      <m:r>
-                        <w:rPr>
-                          <w:rFonts w:ascii="Cambria Math" w:hAnsi="Cambria Math"/>
-                        </w:rPr>
-                        <m:t xml:space="preserve"> × a</m:t>
-                      </m:r>
-                    </m:e>
-                  </m:d>
-                  <m:r>
-                    <w:rPr>
-                      <w:rFonts w:ascii="Cambria Math" w:hAnsi="Cambria Math"/>
-                    </w:rPr>
-                    <m:t xml:space="preserve"> + a</m:t>
-                  </m:r>
-                </m:e>
-              </m:d>
-            </m:e>
-          </m:nary>
-        </m:oMath>
-      </m:oMathPara>
-    </w:p>
-    <w:p>
-      <w:pPr>
-        <w:spacing w:line="360" w:lineRule="auto"/>
-        <w:jc w:val="center"/>
-        <w:rPr>
-          <w:rFonts w:ascii="Times New Roman" w:eastAsiaTheme="minorEastAsia" w:hAnsi="Times New Roman" w:cs="Times New Roman"/>
-          <w:sz w:val="24"/>
-          <w:szCs w:val="24"/>
-          <w:lang w:val="id-ID"/>
-        </w:rPr>
-      </w:pPr>
-    </w:p>
-    <w:p>
-      <w:pPr>
-        <w:spacing w:line="360" w:lineRule="auto"/>
-        <w:jc w:val="center"/>
-        <w:rPr>
-          <w:rFonts w:eastAsiaTheme="minorEastAsia"/>
-        </w:rPr>
-      </w:pPr>
-      <m:oMathPara>
-        <m:oMath>
-          <m:nary>
-            <m:naryPr>
-              <m:chr m:val="∑"/>
-              <m:limLoc m:val="undOvr"/>
-              <m:ctrlPr>
-                <w:rPr>
-                  <w:rFonts w:ascii="Cambria Math" w:eastAsiaTheme="minorEastAsia" w:hAnsi="Cambria Math" w:cs="Times New Roman"/>
-                  <w:i/>
-                </w:rPr>
-              </m:ctrlPr>
-            </m:naryPr>
-            <m:sub>
-              <m:d>
-                <m:dPr>
-                  <m:ctrlPr>
-                    <w:rPr>
-                      <w:rFonts w:ascii="Cambria Math" w:eastAsiaTheme="minorEastAsia" w:hAnsi="Cambria Math" w:cs="Times New Roman"/>
-                      <w:i/>
-                    </w:rPr>
-                  </m:ctrlPr>
-                </m:dPr>
-                <m:e>
-                  <m:r>
-                    <w:rPr>
-                      <w:rFonts w:ascii="Cambria Math" w:eastAsiaTheme="minorEastAsia" w:hAnsi="Cambria Math" w:cs="Times New Roman"/>
-                    </w:rPr>
-                    <m:t>x + a</m:t>
-                  </m:r>
-                </m:e>
-              </m:d>
-            </m:sub>
-            <m:sup>
-              <m:d>
-                <m:dPr>
-                  <m:ctrlPr>
-                    <w:rPr>
-                      <w:rFonts w:ascii="Cambria Math" w:eastAsiaTheme="minorEastAsia" w:hAnsi="Cambria Math" w:cs="Times New Roman"/>
-                      <w:i/>
-                    </w:rPr>
-                  </m:ctrlPr>
-                </m:dPr>
-                <m:e>
-                  <m:r>
-                    <w:rPr>
-                      <w:rFonts w:ascii="Cambria Math" w:eastAsiaTheme="minorEastAsia" w:hAnsi="Cambria Math" w:cs="Times New Roman"/>
-                    </w:rPr>
-                    <m:t>n → ∞</m:t>
-                  </m:r>
-                </m:e>
-              </m:d>
-            </m:sup>
-            <m:e>
-              <m:d>
-                <m:dPr>
-                  <m:ctrlPr>
-                    <w:rPr>
-                      <w:rFonts w:ascii="Cambria Math" w:eastAsiaTheme="minorEastAsia" w:hAnsi="Cambria Math" w:cs="Times New Roman"/>
-                      <w:i/>
-                    </w:rPr>
-                  </m:ctrlPr>
-                </m:dPr>
-                <m:e>
-                  <m:sSup>
-                    <m:sSupPr>
-                      <m:ctrlPr>
-                        <w:rPr>
-                          <w:rFonts w:ascii="Cambria Math" w:hAnsi="Cambria Math"/>
-                          <w:i/>
-                        </w:rPr>
-                      </m:ctrlPr>
-                    </m:sSupPr>
-                    <m:e>
-                      <m:d>
-                        <m:dPr>
-                          <m:ctrlPr>
-                            <w:rPr>
-                              <w:rFonts w:ascii="Cambria Math" w:hAnsi="Cambria Math"/>
-                              <w:i/>
-                            </w:rPr>
-                          </m:ctrlPr>
-                        </m:dPr>
-                        <m:e>
-                          <m:r>
-                            <w:rPr>
-                              <w:rFonts w:ascii="Cambria Math" w:hAnsi="Cambria Math"/>
-                            </w:rPr>
-                            <m:t>x+1</m:t>
-                          </m:r>
-                        </m:e>
-                      </m:d>
-                    </m:e>
-                    <m:sup>
-                      <m:r>
-                        <w:rPr>
-                          <w:rFonts w:ascii="Cambria Math" w:hAnsi="Cambria Math"/>
-                        </w:rPr>
-                        <m:t>n</m:t>
-                      </m:r>
-                    </m:sup>
-                  </m:sSup>
-                  <m:r>
-                    <w:rPr>
-                      <w:rFonts w:ascii="Cambria Math" w:hAnsi="Cambria Math"/>
-                    </w:rPr>
-                    <m:t xml:space="preserve"> - </m:t>
-                  </m:r>
-                  <m:sSup>
-                    <m:sSupPr>
-                      <m:ctrlPr>
-                        <w:rPr>
-                          <w:rFonts w:ascii="Cambria Math" w:eastAsiaTheme="minorEastAsia" w:hAnsi="Cambria Math" w:cs="Times New Roman"/>
-                          <w:i/>
-                        </w:rPr>
-                      </m:ctrlPr>
-                    </m:sSupPr>
-                    <m:e>
-                      <m:r>
-                        <w:rPr>
-                          <w:rFonts w:ascii="Cambria Math" w:eastAsiaTheme="minorEastAsia" w:hAnsi="Cambria Math" w:cs="Times New Roman"/>
-                        </w:rPr>
-                        <m:t>x</m:t>
-                      </m:r>
-                    </m:e>
-                    <m:sup>
-                      <m:r>
-                        <w:rPr>
-                          <w:rFonts w:ascii="Cambria Math" w:eastAsiaTheme="minorEastAsia" w:hAnsi="Cambria Math" w:cs="Times New Roman"/>
-                        </w:rPr>
-                        <m:t>n</m:t>
-                      </m:r>
-                    </m:sup>
-                  </m:sSup>
-                </m:e>
-              </m:d>
-            </m:e>
-          </m:nary>
-          <m:r>
-            <w:rPr>
-              <w:rFonts w:ascii="Cambria Math" w:hAnsi="Cambria Math"/>
-            </w:rPr>
-            <m:t xml:space="preserve"> = </m:t>
-          </m:r>
-          <m:nary>
-            <m:naryPr>
-              <m:chr m:val="∑"/>
-              <m:limLoc m:val="undOvr"/>
-              <m:supHide m:val="1"/>
-              <m:ctrlPr>
-                <w:rPr>
-                  <w:rFonts w:ascii="Cambria Math" w:hAnsi="Cambria Math"/>
-                  <w:i/>
-                </w:rPr>
-              </m:ctrlPr>
-            </m:naryPr>
-            <m:sub>
-              <m:d>
-                <m:dPr>
-                  <m:ctrlPr>
-                    <w:rPr>
-                      <w:rFonts w:ascii="Cambria Math" w:eastAsiaTheme="minorEastAsia" w:hAnsi="Cambria Math" w:cs="Times New Roman"/>
-                      <w:i/>
-                    </w:rPr>
-                  </m:ctrlPr>
-                </m:dPr>
-                <m:e>
-                  <m:r>
-                    <w:rPr>
-                      <w:rFonts w:ascii="Cambria Math" w:eastAsiaTheme="minorEastAsia" w:hAnsi="Cambria Math" w:cs="Times New Roman"/>
-                    </w:rPr>
-                    <m:t>x + a</m:t>
-                  </m:r>
-                </m:e>
-              </m:d>
-            </m:sub>
-            <m:sup/>
-            <m:e>
-              <m:d>
-                <m:dPr>
-                  <m:ctrlPr>
-                    <w:rPr>
-                      <w:rFonts w:ascii="Cambria Math" w:hAnsi="Cambria Math"/>
-                      <w:i/>
-                    </w:rPr>
-                  </m:ctrlPr>
-                </m:dPr>
-                <m:e>
-                  <m:sSup>
-                    <m:sSupPr>
-                      <m:ctrlPr>
-                        <w:rPr>
-                          <w:rFonts w:ascii="Cambria Math" w:hAnsi="Cambria Math"/>
-                          <w:i/>
-                        </w:rPr>
-                      </m:ctrlPr>
-                    </m:sSupPr>
-                    <m:e>
-                      <m:r>
-                        <w:rPr>
-                          <w:rFonts w:ascii="Cambria Math" w:hAnsi="Cambria Math"/>
-                        </w:rPr>
-                        <m:t>a</m:t>
-                      </m:r>
-                    </m:e>
-                    <m:sup>
-                      <m:r>
-                        <w:rPr>
-                          <w:rFonts w:ascii="Cambria Math" w:hAnsi="Cambria Math"/>
-                        </w:rPr>
-                        <m:t>2</m:t>
-                      </m:r>
-                    </m:sup>
-                  </m:sSup>
-                  <m:r>
-                    <w:rPr>
-                      <w:rFonts w:ascii="Cambria Math" w:hAnsi="Cambria Math"/>
-                    </w:rPr>
-                    <m:t xml:space="preserve"> + </m:t>
-                  </m:r>
-                  <m:d>
-                    <m:dPr>
-                      <m:ctrlPr>
-                        <w:rPr>
-                          <w:rFonts w:ascii="Cambria Math" w:hAnsi="Cambria Math"/>
-                          <w:i/>
-                        </w:rPr>
-                      </m:ctrlPr>
-                    </m:dPr>
-                    <m:e>
-                      <m:r>
-                        <w:rPr>
-                          <w:rFonts w:ascii="Cambria Math" w:hAnsi="Cambria Math"/>
-                        </w:rPr>
-                        <m:t>x × a</m:t>
-                      </m:r>
-                    </m:e>
-                  </m:d>
-                  <m:r>
-                    <w:rPr>
-                      <w:rFonts w:ascii="Cambria Math" w:hAnsi="Cambria Math"/>
-                    </w:rPr>
-                    <m:t xml:space="preserve"> + a</m:t>
-                  </m:r>
-                </m:e>
-              </m:d>
-            </m:e>
-          </m:nary>
-        </m:oMath>
-      </m:oMathPara>
-    </w:p>
-    <w:p>
-      <w:pPr>
-        <w:spacing w:line="360" w:lineRule="auto"/>
-        <w:jc w:val="center"/>
-        <w:rPr>
-          <w:rFonts w:ascii="Times New Roman" w:eastAsiaTheme="minorEastAsia" w:hAnsi="Times New Roman" w:cs="Times New Roman"/>
-          <w:sz w:val="24"/>
-          <w:szCs w:val="24"/>
-          <w:lang w:val="id-ID"/>
-        </w:rPr>
-      </w:pPr>
-    </w:p>
-    <w:p>
-      <w:pPr>
-        <w:spacing w:line="360" w:lineRule="auto"/>
-        <w:jc w:val="center"/>
-        <w:rPr>
-          <w:rFonts w:eastAsiaTheme="minorEastAsia"/>
-        </w:rPr>
-      </w:pPr>
-      <m:oMathPara>
         <m:oMath>
           <m:d>
             <m:dPr>
@@ -1485,7 +508,25 @@
                         <w:rPr>
                           <w:rFonts w:ascii="Cambria Math" w:hAnsi="Cambria Math"/>
                         </w:rPr>
-                        <m:t>x+1</m:t>
+                        <m:t>x</m:t>
+                      </m:r>
+                      <m:r>
+                        <w:rPr>
+                          <w:rFonts w:ascii="Cambria Math" w:hAnsi="Cambria Math"/>
+                        </w:rPr>
+                        <m:t xml:space="preserve"> </m:t>
+                      </m:r>
+                      <m:r>
+                        <w:rPr>
+                          <w:rFonts w:ascii="Cambria Math" w:hAnsi="Cambria Math"/>
+                        </w:rPr>
+                        <m:t>+</m:t>
+                      </m:r>
+                      <m:r>
+                        <w:rPr>
+                          <w:rFonts w:ascii="Cambria Math" w:hAnsi="Cambria Math"/>
+                        </w:rPr>
+                        <m:t xml:space="preserve"> a</m:t>
                       </m:r>
                     </m:e>
                   </m:d>
@@ -1571,7 +612,7 @@
                     <w:rPr>
                       <w:rFonts w:ascii="Cambria Math" w:hAnsi="Cambria Math"/>
                     </w:rPr>
-                    <m:t>2</m:t>
+                    <m:t>n</m:t>
                   </m:r>
                 </m:sup>
               </m:sSup>
@@ -1595,25 +636,31 @@
                     <w:rPr>
                       <w:rFonts w:ascii="Cambria Math" w:hAnsi="Cambria Math"/>
                     </w:rPr>
-                    <m:t>2</m:t>
+                    <m:t>a</m:t>
                   </m:r>
                   <m:r>
                     <w:rPr>
                       <w:rFonts w:ascii="Cambria Math" w:hAnsi="Cambria Math"/>
                     </w:rPr>
-                    <m:t xml:space="preserve"> × </m:t>
+                    <m:t xml:space="preserve"> × x</m:t>
                   </m:r>
                   <m:r>
                     <w:rPr>
                       <w:rFonts w:ascii="Cambria Math" w:hAnsi="Cambria Math"/>
                     </w:rPr>
-                    <m:t xml:space="preserve">x × </m:t>
+                    <m:t xml:space="preserve"> </m:t>
                   </m:r>
                   <m:r>
                     <w:rPr>
                       <w:rFonts w:ascii="Cambria Math" w:hAnsi="Cambria Math"/>
                     </w:rPr>
-                    <m:t>a</m:t>
+                    <m:t>×</m:t>
+                  </m:r>
+                  <m:r>
+                    <w:rPr>
+                      <w:rFonts w:ascii="Cambria Math" w:hAnsi="Cambria Math"/>
+                    </w:rPr>
+                    <m:t xml:space="preserve"> n</m:t>
                   </m:r>
                 </m:e>
               </m:d>
@@ -1621,13 +668,7 @@
                 <w:rPr>
                   <w:rFonts w:ascii="Cambria Math" w:hAnsi="Cambria Math"/>
                 </w:rPr>
-                <m:t xml:space="preserve"> -</m:t>
-              </m:r>
-              <m:r>
-                <w:rPr>
-                  <w:rFonts w:ascii="Cambria Math" w:hAnsi="Cambria Math"/>
-                </w:rPr>
-                <m:t xml:space="preserve"> </m:t>
+                <m:t xml:space="preserve"> + </m:t>
               </m:r>
               <m:sSup>
                 <m:sSupPr>
@@ -1651,7 +692,7 @@
                     <w:rPr>
                       <w:rFonts w:ascii="Cambria Math" w:hAnsi="Cambria Math"/>
                     </w:rPr>
-                    <m:t>2</m:t>
+                    <m:t>n</m:t>
                   </m:r>
                 </m:sup>
               </m:sSup>
@@ -1659,15 +700,6 @@
           </m:d>
         </m:oMath>
       </m:oMathPara>
-    </w:p>
-    <w:p>
-      <w:pPr>
-        <w:spacing w:line="360" w:lineRule="auto"/>
-        <w:jc w:val="center"/>
-        <w:rPr>
-          <w:rFonts w:eastAsiaTheme="minorEastAsia"/>
-        </w:rPr>
-      </w:pPr>
     </w:p>
     <w:sectPr>
       <w:pgSz w:w="11906" w:h="16838" w:code="9"/>

</xml_diff>

<commit_message>
Exponential of Delta Exponent Equation || (13:48 (W.I.B [Waktu Indonesia bagian Barat]), 02/04/2026), Batam, Kepulauan Riau Indonesia || Exponential of Delta Exponent Equation #LORDBLESSUS #LORDWITHUS #LORDGUARDUS
Exponential of Delta Exponent Equation || (13:48 (W.I.B [Waktu Indonesia bagian Barat]), 02/04/2026), Batam, Kepulauan Riau Indonesia || Exponential of Delta Exponent Equation #LORDBLESSUS #LORDWITHUS #LORDGUARDUS
</commit_message>
<xml_diff>
--- a/Exponential of Delta Exponent Equation.docx
+++ b/Exponential of Delta Exponent Equation.docx
@@ -668,7 +668,13 @@
                 <w:rPr>
                   <w:rFonts w:ascii="Cambria Math" w:hAnsi="Cambria Math"/>
                 </w:rPr>
-                <m:t xml:space="preserve"> + </m:t>
+                <m:t xml:space="preserve"> -</m:t>
+              </m:r>
+              <m:r>
+                <w:rPr>
+                  <w:rFonts w:ascii="Cambria Math" w:hAnsi="Cambria Math"/>
+                </w:rPr>
+                <m:t xml:space="preserve"> </m:t>
               </m:r>
               <m:sSup>
                 <m:sSupPr>

</xml_diff>

<commit_message>
Exponential of Delta Exponent Equation || (21:47 (W.I.B [Waktu Indonesia bagian Barat]), 02/04/2026), Batam, Kepulauan Riau Indonesia || Exponential of Delta Exponent Equation #LORDBLESSUS #LORDWITHUS #LORDGUARDUS
Exponential of Delta Exponent Equation || (21:47 (W.I.B [Waktu Indonesia bagian Barat]), 02/04/2026), Batam, Kepulauan Riau Indonesia || Exponential of Delta Exponent Equation #LORDBLESSUS #LORDWITHUS #LORDGUARDUS
</commit_message>
<xml_diff>
--- a/Exponential of Delta Exponent Equation.docx
+++ b/Exponential of Delta Exponent Equation.docx
@@ -624,6 +624,8 @@
               </m:r>
               <m:d>
                 <m:dPr>
+                  <m:begChr m:val="{"/>
+                  <m:endChr m:val="}"/>
                   <m:ctrlPr>
                     <w:rPr>
                       <w:rFonts w:ascii="Cambria Math" w:hAnsi="Cambria Math"/>
@@ -686,26 +688,382 @@
                   </m:ctrlPr>
                 </m:sSupPr>
                 <m:e>
-                  <m:r>
-                    <w:rPr>
-                      <w:rFonts w:ascii="Cambria Math" w:hAnsi="Cambria Math"/>
-                    </w:rPr>
-                    <m:t>x</m:t>
-                  </m:r>
+                  <m:d>
+                    <m:dPr>
+                      <m:begChr m:val="{"/>
+                      <m:endChr m:val="}"/>
+                      <m:ctrlPr>
+                        <w:rPr>
+                          <w:rFonts w:ascii="Cambria Math" w:hAnsi="Cambria Math"/>
+                          <w:i/>
+                        </w:rPr>
+                      </m:ctrlPr>
+                    </m:dPr>
+                    <m:e>
+                      <m:r>
+                        <w:rPr>
+                          <w:rFonts w:ascii="Cambria Math" w:hAnsi="Cambria Math"/>
+                        </w:rPr>
+                        <m:t xml:space="preserve">x × </m:t>
+                      </m:r>
+                      <m:d>
+                        <m:dPr>
+                          <m:ctrlPr>
+                            <w:rPr>
+                              <w:rFonts w:ascii="Cambria Math" w:hAnsi="Cambria Math"/>
+                              <w:i/>
+                            </w:rPr>
+                          </m:ctrlPr>
+                        </m:dPr>
+                        <m:e>
+                          <m:r>
+                            <w:rPr>
+                              <w:rFonts w:ascii="Cambria Math" w:hAnsi="Cambria Math"/>
+                            </w:rPr>
+                            <m:t xml:space="preserve">a - </m:t>
+                          </m:r>
+                          <m:r>
+                            <w:rPr>
+                              <w:rFonts w:ascii="Cambria Math" w:hAnsi="Cambria Math"/>
+                            </w:rPr>
+                            <m:t>x</m:t>
+                          </m:r>
+                        </m:e>
+                      </m:d>
+                    </m:e>
+                  </m:d>
                 </m:e>
                 <m:sup>
-                  <m:r>
-                    <w:rPr>
-                      <w:rFonts w:ascii="Cambria Math" w:hAnsi="Cambria Math"/>
-                    </w:rPr>
-                    <m:t>n</m:t>
-                  </m:r>
+                  <m:d>
+                    <m:dPr>
+                      <m:ctrlPr>
+                        <w:rPr>
+                          <w:rFonts w:ascii="Cambria Math" w:hAnsi="Cambria Math"/>
+                          <w:i/>
+                        </w:rPr>
+                      </m:ctrlPr>
+                    </m:dPr>
+                    <m:e>
+                      <m:r>
+                        <w:rPr>
+                          <w:rFonts w:ascii="Cambria Math" w:hAnsi="Cambria Math"/>
+                        </w:rPr>
+                        <m:t>n - 1</m:t>
+                      </m:r>
+                    </m:e>
+                  </m:d>
                 </m:sup>
               </m:sSup>
             </m:e>
           </m:d>
         </m:oMath>
       </m:oMathPara>
+    </w:p>
+    <w:p>
+      <w:pPr>
+        <w:spacing w:line="360" w:lineRule="auto"/>
+        <w:jc w:val="center"/>
+        <w:rPr>
+          <w:rFonts w:ascii="Times New Roman" w:eastAsiaTheme="minorEastAsia" w:hAnsi="Times New Roman" w:cs="Times New Roman"/>
+          <w:sz w:val="24"/>
+          <w:szCs w:val="24"/>
+          <w:lang w:val="id-ID"/>
+        </w:rPr>
+      </w:pPr>
+    </w:p>
+    <w:p>
+      <w:pPr>
+        <w:spacing w:line="360" w:lineRule="auto"/>
+        <w:jc w:val="center"/>
+        <w:rPr>
+          <w:rFonts w:eastAsiaTheme="minorEastAsia"/>
+        </w:rPr>
+      </w:pPr>
+      <m:oMathPara>
+        <m:oMath>
+          <m:d>
+            <m:dPr>
+              <m:ctrlPr>
+                <w:rPr>
+                  <w:rFonts w:ascii="Cambria Math" w:eastAsiaTheme="minorEastAsia" w:hAnsi="Cambria Math" w:cs="Times New Roman"/>
+                  <w:i/>
+                </w:rPr>
+              </m:ctrlPr>
+            </m:dPr>
+            <m:e>
+              <m:sSup>
+                <m:sSupPr>
+                  <m:ctrlPr>
+                    <w:rPr>
+                      <w:rFonts w:ascii="Cambria Math" w:hAnsi="Cambria Math"/>
+                      <w:i/>
+                    </w:rPr>
+                  </m:ctrlPr>
+                </m:sSupPr>
+                <m:e>
+                  <m:d>
+                    <m:dPr>
+                      <m:ctrlPr>
+                        <w:rPr>
+                          <w:rFonts w:ascii="Cambria Math" w:hAnsi="Cambria Math"/>
+                          <w:i/>
+                        </w:rPr>
+                      </m:ctrlPr>
+                    </m:dPr>
+                    <m:e>
+                      <m:r>
+                        <w:rPr>
+                          <w:rFonts w:ascii="Cambria Math" w:hAnsi="Cambria Math"/>
+                        </w:rPr>
+                        <m:t>x + a</m:t>
+                      </m:r>
+                    </m:e>
+                  </m:d>
+                </m:e>
+                <m:sup>
+                  <m:r>
+                    <w:rPr>
+                      <w:rFonts w:ascii="Cambria Math" w:hAnsi="Cambria Math"/>
+                    </w:rPr>
+                    <m:t>n</m:t>
+                  </m:r>
+                </m:sup>
+              </m:sSup>
+              <m:r>
+                <w:rPr>
+                  <w:rFonts w:ascii="Cambria Math" w:hAnsi="Cambria Math"/>
+                </w:rPr>
+                <m:t xml:space="preserve"> - </m:t>
+              </m:r>
+              <m:sSup>
+                <m:sSupPr>
+                  <m:ctrlPr>
+                    <w:rPr>
+                      <w:rFonts w:ascii="Cambria Math" w:eastAsiaTheme="minorEastAsia" w:hAnsi="Cambria Math" w:cs="Times New Roman"/>
+                      <w:i/>
+                    </w:rPr>
+                  </m:ctrlPr>
+                </m:sSupPr>
+                <m:e>
+                  <m:r>
+                    <w:rPr>
+                      <w:rFonts w:ascii="Cambria Math" w:eastAsiaTheme="minorEastAsia" w:hAnsi="Cambria Math" w:cs="Times New Roman"/>
+                    </w:rPr>
+                    <m:t>x</m:t>
+                  </m:r>
+                </m:e>
+                <m:sup>
+                  <m:r>
+                    <w:rPr>
+                      <w:rFonts w:ascii="Cambria Math" w:eastAsiaTheme="minorEastAsia" w:hAnsi="Cambria Math" w:cs="Times New Roman"/>
+                    </w:rPr>
+                    <m:t>n</m:t>
+                  </m:r>
+                </m:sup>
+              </m:sSup>
+            </m:e>
+          </m:d>
+          <m:r>
+            <w:rPr>
+              <w:rFonts w:ascii="Cambria Math" w:hAnsi="Cambria Math"/>
+            </w:rPr>
+            <m:t xml:space="preserve"> = </m:t>
+          </m:r>
+          <m:d>
+            <m:dPr>
+              <m:ctrlPr>
+                <w:rPr>
+                  <w:rFonts w:ascii="Cambria Math" w:hAnsi="Cambria Math"/>
+                  <w:i/>
+                </w:rPr>
+              </m:ctrlPr>
+            </m:dPr>
+            <m:e>
+              <m:sSup>
+                <m:sSupPr>
+                  <m:ctrlPr>
+                    <w:rPr>
+                      <w:rFonts w:ascii="Cambria Math" w:hAnsi="Cambria Math"/>
+                      <w:i/>
+                    </w:rPr>
+                  </m:ctrlPr>
+                </m:sSupPr>
+                <m:e>
+                  <m:r>
+                    <w:rPr>
+                      <w:rFonts w:ascii="Cambria Math" w:hAnsi="Cambria Math"/>
+                    </w:rPr>
+                    <m:t>a</m:t>
+                  </m:r>
+                </m:e>
+                <m:sup>
+                  <m:r>
+                    <w:rPr>
+                      <w:rFonts w:ascii="Cambria Math" w:hAnsi="Cambria Math"/>
+                    </w:rPr>
+                    <m:t>n</m:t>
+                  </m:r>
+                </m:sup>
+              </m:sSup>
+              <m:r>
+                <w:rPr>
+                  <w:rFonts w:ascii="Cambria Math" w:hAnsi="Cambria Math"/>
+                </w:rPr>
+                <m:t xml:space="preserve"> + </m:t>
+              </m:r>
+              <m:d>
+                <m:dPr>
+                  <m:begChr m:val="{"/>
+                  <m:endChr m:val="}"/>
+                  <m:ctrlPr>
+                    <w:rPr>
+                      <w:rFonts w:ascii="Cambria Math" w:hAnsi="Cambria Math"/>
+                      <w:i/>
+                    </w:rPr>
+                  </m:ctrlPr>
+                </m:dPr>
+                <m:e>
+                  <m:r>
+                    <w:rPr>
+                      <w:rFonts w:ascii="Cambria Math" w:hAnsi="Cambria Math"/>
+                    </w:rPr>
+                    <m:t>a × x × n</m:t>
+                  </m:r>
+                </m:e>
+              </m:d>
+              <m:r>
+                <w:rPr>
+                  <w:rFonts w:ascii="Cambria Math" w:hAnsi="Cambria Math"/>
+                </w:rPr>
+                <m:t xml:space="preserve"> - </m:t>
+              </m:r>
+              <m:sSup>
+                <m:sSupPr>
+                  <m:ctrlPr>
+                    <w:rPr>
+                      <w:rFonts w:ascii="Cambria Math" w:eastAsiaTheme="minorEastAsia" w:hAnsi="Cambria Math" w:cs="Times New Roman"/>
+                      <w:i/>
+                    </w:rPr>
+                  </m:ctrlPr>
+                </m:sSupPr>
+                <m:e>
+                  <m:d>
+                    <m:dPr>
+                      <m:begChr m:val="{"/>
+                      <m:endChr m:val="}"/>
+                      <m:ctrlPr>
+                        <w:rPr>
+                          <w:rFonts w:ascii="Cambria Math" w:eastAsiaTheme="minorEastAsia" w:hAnsi="Cambria Math" w:cs="Times New Roman"/>
+                          <w:i/>
+                        </w:rPr>
+                      </m:ctrlPr>
+                    </m:dPr>
+                    <m:e>
+                      <m:r>
+                        <w:rPr>
+                          <w:rFonts w:ascii="Cambria Math" w:eastAsiaTheme="minorEastAsia" w:hAnsi="Cambria Math" w:cs="Times New Roman"/>
+                        </w:rPr>
+                        <m:t>x × a</m:t>
+                      </m:r>
+                    </m:e>
+                  </m:d>
+                </m:e>
+                <m:sup>
+                  <m:d>
+                    <m:dPr>
+                      <m:ctrlPr>
+                        <w:rPr>
+                          <w:rFonts w:ascii="Cambria Math" w:hAnsi="Cambria Math"/>
+                          <w:i/>
+                        </w:rPr>
+                      </m:ctrlPr>
+                    </m:dPr>
+                    <m:e>
+                      <m:r>
+                        <w:rPr>
+                          <w:rFonts w:ascii="Cambria Math" w:hAnsi="Cambria Math"/>
+                        </w:rPr>
+                        <m:t>n - 1</m:t>
+                      </m:r>
+                    </m:e>
+                  </m:d>
+                </m:sup>
+              </m:sSup>
+              <m:r>
+                <w:rPr>
+                  <w:rFonts w:ascii="Cambria Math" w:eastAsiaTheme="minorEastAsia" w:hAnsi="Cambria Math" w:cs="Times New Roman"/>
+                </w:rPr>
+                <m:t xml:space="preserve"> + </m:t>
+              </m:r>
+              <m:sSup>
+                <m:sSupPr>
+                  <m:ctrlPr>
+                    <w:rPr>
+                      <w:rFonts w:ascii="Cambria Math" w:eastAsiaTheme="minorEastAsia" w:hAnsi="Cambria Math" w:cs="Times New Roman"/>
+                      <w:i/>
+                    </w:rPr>
+                  </m:ctrlPr>
+                </m:sSupPr>
+                <m:e>
+                  <m:r>
+                    <w:rPr>
+                      <w:rFonts w:ascii="Cambria Math" w:eastAsiaTheme="minorEastAsia" w:hAnsi="Cambria Math" w:cs="Times New Roman"/>
+                    </w:rPr>
+                    <m:t>x</m:t>
+                  </m:r>
+                </m:e>
+                <m:sup>
+                  <m:d>
+                    <m:dPr>
+                      <m:ctrlPr>
+                        <w:rPr>
+                          <w:rFonts w:ascii="Cambria Math" w:eastAsiaTheme="minorEastAsia" w:hAnsi="Cambria Math" w:cs="Times New Roman"/>
+                          <w:i/>
+                        </w:rPr>
+                      </m:ctrlPr>
+                    </m:dPr>
+                    <m:e>
+                      <m:d>
+                        <m:dPr>
+                          <m:ctrlPr>
+                            <w:rPr>
+                              <w:rFonts w:ascii="Cambria Math" w:eastAsiaTheme="minorEastAsia" w:hAnsi="Cambria Math" w:cs="Times New Roman"/>
+                              <w:i/>
+                            </w:rPr>
+                          </m:ctrlPr>
+                        </m:dPr>
+                        <m:e>
+                          <m:r>
+                            <w:rPr>
+                              <w:rFonts w:ascii="Cambria Math" w:eastAsiaTheme="minorEastAsia" w:hAnsi="Cambria Math" w:cs="Times New Roman"/>
+                            </w:rPr>
+                            <m:t>2 × n</m:t>
+                          </m:r>
+                        </m:e>
+                      </m:d>
+                      <m:r>
+                        <w:rPr>
+                          <w:rFonts w:ascii="Cambria Math" w:eastAsiaTheme="minorEastAsia" w:hAnsi="Cambria Math" w:cs="Times New Roman"/>
+                        </w:rPr>
+                        <m:t xml:space="preserve"> - 1</m:t>
+                      </m:r>
+                    </m:e>
+                  </m:d>
+                </m:sup>
+              </m:sSup>
+            </m:e>
+          </m:d>
+        </m:oMath>
+      </m:oMathPara>
+    </w:p>
+    <w:p>
+      <w:pPr>
+        <w:spacing w:line="360" w:lineRule="auto"/>
+        <w:jc w:val="center"/>
+        <w:rPr>
+          <w:rFonts w:eastAsiaTheme="minorEastAsia"/>
+        </w:rPr>
+      </w:pPr>
     </w:p>
     <w:sectPr>
       <w:pgSz w:w="11906" w:h="16838" w:code="9"/>

</xml_diff>